<commit_message>
Manual S12: add the environment variables the table omitted
The reference table listed nine variables and the scripts read fourteen.
Missing were TR_VENV and TR_NO_REEXEC -- both read by trlib, and the two
you need when the venv re-exec misbehaves, which is the failure the table
is most likely to be consulted for -- and CASE_IMG, CASE_MAP and CASE_MNT,
read by all four case-* scripts.

.docx edited in place and the .pdf regenerated from it with LibreOffice, as
before; .md updated to match. Page count and layout unchanged.

Co-Authored-By: Claude Opus 5 <noreply@anthropic.com>
</commit_message>
<xml_diff>
--- a/01-operating-manual.docx
+++ b/01-operating-manual.docx
@@ -12692,6 +12692,421 @@
                 <w:szCs w:val="18"/>
               </w:rPr>
               <w:t xml:space="preserve">Ollama endpoint</w:t>
+            </w:r>
+          </w:p>
+        </w:tc>
+      </w:tr>
+      <w:tr>
+        <w:tc>
+          <w:tcPr>
+            <w:tcW w:type="dxa" w:w="2600"/>
+            <w:tcMar>
+              <w:top w:type="dxa" w:w="60"/>
+              <w:left w:type="dxa" w:w="100"/>
+              <w:bottom w:type="dxa" w:w="60"/>
+              <w:right w:type="dxa" w:w="100"/>
+            </w:tcMar>
+          </w:tcPr>
+          <w:p>
+            <w:pPr>
+              <w:spacing w:after="0" w:line="240"/>
+            </w:pPr>
+            <w:r>
+              <w:rPr>
+                <w:rFonts w:ascii="Calibri" w:cs="Calibri" w:eastAsia="Calibri" w:hAnsi="Calibri"/>
+                <w:b w:val="false"/>
+                <w:bCs w:val="false"/>
+                <w:color w:val="1A1A1A"/>
+                <w:sz w:val="18"/>
+                <w:szCs w:val="18"/>
+              </w:rPr>
+              <w:t>TR_VENV</w:t>
+            </w:r>
+          </w:p>
+        </w:tc>
+        <w:tc>
+          <w:tcPr>
+            <w:tcW w:type="dxa" w:w="2200"/>
+            <w:tcMar>
+              <w:top w:type="dxa" w:w="60"/>
+              <w:left w:type="dxa" w:w="100"/>
+              <w:bottom w:type="dxa" w:w="60"/>
+              <w:right w:type="dxa" w:w="100"/>
+            </w:tcMar>
+          </w:tcPr>
+          <w:p>
+            <w:pPr>
+              <w:spacing w:after="0" w:line="240"/>
+            </w:pPr>
+            <w:r>
+              <w:rPr>
+                <w:rFonts w:ascii="Calibri" w:cs="Calibri" w:eastAsia="Calibri" w:hAnsi="Calibri"/>
+                <w:b w:val="false"/>
+                <w:bCs w:val="false"/>
+                <w:color w:val="1A1A1A"/>
+                <w:sz w:val="18"/>
+                <w:szCs w:val="18"/>
+              </w:rPr>
+              <w:t>~/.translate-venv</w:t>
+            </w:r>
+          </w:p>
+        </w:tc>
+        <w:tc>
+          <w:tcPr>
+            <w:tcW w:type="dxa" w:w="4560"/>
+            <w:tcMar>
+              <w:top w:type="dxa" w:w="60"/>
+              <w:left w:type="dxa" w:w="100"/>
+              <w:bottom w:type="dxa" w:w="60"/>
+              <w:right w:type="dxa" w:w="100"/>
+            </w:tcMar>
+          </w:tcPr>
+          <w:p>
+            <w:pPr>
+              <w:spacing w:after="0" w:line="240"/>
+            </w:pPr>
+            <w:r>
+              <w:rPr>
+                <w:rFonts w:ascii="Calibri" w:cs="Calibri" w:eastAsia="Calibri" w:hAnsi="Calibri"/>
+                <w:b w:val="false"/>
+                <w:bCs w:val="false"/>
+                <w:color w:val="1A1A1A"/>
+                <w:sz w:val="18"/>
+                <w:szCs w:val="18"/>
+              </w:rPr>
+              <w:t>Python environment the scripts re-exec into. Set before tr-setup to put it elsewhere</w:t>
+            </w:r>
+          </w:p>
+        </w:tc>
+      </w:tr>
+      <w:tr>
+        <w:tc>
+          <w:tcPr>
+            <w:tcW w:type="dxa" w:w="2600"/>
+            <w:tcMar>
+              <w:top w:type="dxa" w:w="60"/>
+              <w:left w:type="dxa" w:w="100"/>
+              <w:bottom w:type="dxa" w:w="60"/>
+              <w:right w:type="dxa" w:w="100"/>
+            </w:tcMar>
+          </w:tcPr>
+          <w:p>
+            <w:pPr>
+              <w:spacing w:after="0" w:line="240"/>
+            </w:pPr>
+            <w:r>
+              <w:rPr>
+                <w:rFonts w:ascii="Calibri" w:cs="Calibri" w:eastAsia="Calibri" w:hAnsi="Calibri"/>
+                <w:b w:val="false"/>
+                <w:bCs w:val="false"/>
+                <w:color w:val="1A1A1A"/>
+                <w:sz w:val="18"/>
+                <w:szCs w:val="18"/>
+              </w:rPr>
+              <w:t>TR_NO_REEXEC</w:t>
+            </w:r>
+          </w:p>
+        </w:tc>
+        <w:tc>
+          <w:tcPr>
+            <w:tcW w:type="dxa" w:w="2200"/>
+            <w:tcMar>
+              <w:top w:type="dxa" w:w="60"/>
+              <w:left w:type="dxa" w:w="100"/>
+              <w:bottom w:type="dxa" w:w="60"/>
+              <w:right w:type="dxa" w:w="100"/>
+            </w:tcMar>
+          </w:tcPr>
+          <w:p>
+            <w:pPr>
+              <w:spacing w:after="0" w:line="240"/>
+            </w:pPr>
+            <w:r>
+              <w:rPr>
+                <w:rFonts w:ascii="Calibri" w:cs="Calibri" w:eastAsia="Calibri" w:hAnsi="Calibri"/>
+                <w:b w:val="false"/>
+                <w:bCs w:val="false"/>
+                <w:color w:val="1A1A1A"/>
+                <w:sz w:val="18"/>
+                <w:szCs w:val="18"/>
+              </w:rPr>
+              <w:t>(unset)</w:t>
+            </w:r>
+          </w:p>
+        </w:tc>
+        <w:tc>
+          <w:tcPr>
+            <w:tcW w:type="dxa" w:w="4560"/>
+            <w:tcMar>
+              <w:top w:type="dxa" w:w="60"/>
+              <w:left w:type="dxa" w:w="100"/>
+              <w:bottom w:type="dxa" w:w="60"/>
+              <w:right w:type="dxa" w:w="100"/>
+            </w:tcMar>
+          </w:tcPr>
+          <w:p>
+            <w:pPr>
+              <w:spacing w:after="0" w:line="240"/>
+            </w:pPr>
+            <w:r>
+              <w:rPr>
+                <w:rFonts w:ascii="Calibri" w:cs="Calibri" w:eastAsia="Calibri" w:hAnsi="Calibri"/>
+                <w:b w:val="false"/>
+                <w:bCs w:val="false"/>
+                <w:color w:val="1A1A1A"/>
+                <w:sz w:val="18"/>
+                <w:szCs w:val="18"/>
+              </w:rPr>
+              <w:t>Set to 1 to stay on the system interpreter. Diagnostics only; imports will fail</w:t>
+            </w:r>
+          </w:p>
+        </w:tc>
+      </w:tr>
+      <w:tr>
+        <w:tc>
+          <w:tcPr>
+            <w:tcW w:type="dxa" w:w="2600"/>
+            <w:tcMar>
+              <w:top w:type="dxa" w:w="60"/>
+              <w:left w:type="dxa" w:w="100"/>
+              <w:bottom w:type="dxa" w:w="60"/>
+              <w:right w:type="dxa" w:w="100"/>
+            </w:tcMar>
+          </w:tcPr>
+          <w:p>
+            <w:pPr>
+              <w:spacing w:after="0" w:line="240"/>
+            </w:pPr>
+            <w:r>
+              <w:rPr>
+                <w:rFonts w:ascii="Calibri" w:cs="Calibri" w:eastAsia="Calibri" w:hAnsi="Calibri"/>
+                <w:b w:val="false"/>
+                <w:bCs w:val="false"/>
+                <w:color w:val="1A1A1A"/>
+                <w:sz w:val="18"/>
+                <w:szCs w:val="18"/>
+              </w:rPr>
+              <w:t>CASE_IMG</w:t>
+            </w:r>
+          </w:p>
+        </w:tc>
+        <w:tc>
+          <w:tcPr>
+            <w:tcW w:type="dxa" w:w="2200"/>
+            <w:tcMar>
+              <w:top w:type="dxa" w:w="60"/>
+              <w:left w:type="dxa" w:w="100"/>
+              <w:bottom w:type="dxa" w:w="60"/>
+              <w:right w:type="dxa" w:w="100"/>
+            </w:tcMar>
+          </w:tcPr>
+          <w:p>
+            <w:pPr>
+              <w:spacing w:after="0" w:line="240"/>
+            </w:pPr>
+            <w:r>
+              <w:rPr>
+                <w:rFonts w:ascii="Calibri" w:cs="Calibri" w:eastAsia="Calibri" w:hAnsi="Calibri"/>
+                <w:b w:val="false"/>
+                <w:bCs w:val="false"/>
+                <w:color w:val="1A1A1A"/>
+                <w:sz w:val="18"/>
+                <w:szCs w:val="18"/>
+              </w:rPr>
+              <w:t>~/.case/confidential.luks</w:t>
+            </w:r>
+          </w:p>
+        </w:tc>
+        <w:tc>
+          <w:tcPr>
+            <w:tcW w:type="dxa" w:w="4560"/>
+            <w:tcMar>
+              <w:top w:type="dxa" w:w="60"/>
+              <w:left w:type="dxa" w:w="100"/>
+              <w:bottom w:type="dxa" w:w="60"/>
+              <w:right w:type="dxa" w:w="100"/>
+            </w:tcMar>
+          </w:tcPr>
+          <w:p>
+            <w:pPr>
+              <w:spacing w:after="0" w:line="240"/>
+            </w:pPr>
+            <w:r>
+              <w:rPr>
+                <w:rFonts w:ascii="Calibri" w:cs="Calibri" w:eastAsia="Calibri" w:hAnsi="Calibri"/>
+                <w:b w:val="false"/>
+                <w:bCs w:val="false"/>
+                <w:color w:val="1A1A1A"/>
+                <w:sz w:val="18"/>
+                <w:szCs w:val="18"/>
+              </w:rPr>
+              <w:t>The LUKS container file. Read by case-init, case-open, case-status</w:t>
+            </w:r>
+          </w:p>
+        </w:tc>
+      </w:tr>
+      <w:tr>
+        <w:tc>
+          <w:tcPr>
+            <w:tcW w:type="dxa" w:w="2600"/>
+            <w:tcMar>
+              <w:top w:type="dxa" w:w="60"/>
+              <w:left w:type="dxa" w:w="100"/>
+              <w:bottom w:type="dxa" w:w="60"/>
+              <w:right w:type="dxa" w:w="100"/>
+            </w:tcMar>
+          </w:tcPr>
+          <w:p>
+            <w:pPr>
+              <w:spacing w:after="0" w:line="240"/>
+            </w:pPr>
+            <w:r>
+              <w:rPr>
+                <w:rFonts w:ascii="Calibri" w:cs="Calibri" w:eastAsia="Calibri" w:hAnsi="Calibri"/>
+                <w:b w:val="false"/>
+                <w:bCs w:val="false"/>
+                <w:color w:val="1A1A1A"/>
+                <w:sz w:val="18"/>
+                <w:szCs w:val="18"/>
+              </w:rPr>
+              <w:t>CASE_MAP</w:t>
+            </w:r>
+          </w:p>
+        </w:tc>
+        <w:tc>
+          <w:tcPr>
+            <w:tcW w:type="dxa" w:w="2200"/>
+            <w:tcMar>
+              <w:top w:type="dxa" w:w="60"/>
+              <w:left w:type="dxa" w:w="100"/>
+              <w:bottom w:type="dxa" w:w="60"/>
+              <w:right w:type="dxa" w:w="100"/>
+            </w:tcMar>
+          </w:tcPr>
+          <w:p>
+            <w:pPr>
+              <w:spacing w:after="0" w:line="240"/>
+            </w:pPr>
+            <w:r>
+              <w:rPr>
+                <w:rFonts w:ascii="Calibri" w:cs="Calibri" w:eastAsia="Calibri" w:hAnsi="Calibri"/>
+                <w:b w:val="false"/>
+                <w:bCs w:val="false"/>
+                <w:color w:val="1A1A1A"/>
+                <w:sz w:val="18"/>
+                <w:szCs w:val="18"/>
+              </w:rPr>
+              <w:t>casedata</w:t>
+            </w:r>
+          </w:p>
+        </w:tc>
+        <w:tc>
+          <w:tcPr>
+            <w:tcW w:type="dxa" w:w="4560"/>
+            <w:tcMar>
+              <w:top w:type="dxa" w:w="60"/>
+              <w:left w:type="dxa" w:w="100"/>
+              <w:bottom w:type="dxa" w:w="60"/>
+              <w:right w:type="dxa" w:w="100"/>
+            </w:tcMar>
+          </w:tcPr>
+          <w:p>
+            <w:pPr>
+              <w:spacing w:after="0" w:line="240"/>
+            </w:pPr>
+            <w:r>
+              <w:rPr>
+                <w:rFonts w:ascii="Calibri" w:cs="Calibri" w:eastAsia="Calibri" w:hAnsi="Calibri"/>
+                <w:b w:val="false"/>
+                <w:bCs w:val="false"/>
+                <w:color w:val="1A1A1A"/>
+                <w:sz w:val="18"/>
+                <w:szCs w:val="18"/>
+              </w:rPr>
+              <w:t>Device-mapper name while the container is unlocked</w:t>
+            </w:r>
+          </w:p>
+        </w:tc>
+      </w:tr>
+      <w:tr>
+        <w:tc>
+          <w:tcPr>
+            <w:tcW w:type="dxa" w:w="2600"/>
+            <w:tcMar>
+              <w:top w:type="dxa" w:w="60"/>
+              <w:left w:type="dxa" w:w="100"/>
+              <w:bottom w:type="dxa" w:w="60"/>
+              <w:right w:type="dxa" w:w="100"/>
+            </w:tcMar>
+          </w:tcPr>
+          <w:p>
+            <w:pPr>
+              <w:spacing w:after="0" w:line="240"/>
+            </w:pPr>
+            <w:r>
+              <w:rPr>
+                <w:rFonts w:ascii="Calibri" w:cs="Calibri" w:eastAsia="Calibri" w:hAnsi="Calibri"/>
+                <w:b w:val="false"/>
+                <w:bCs w:val="false"/>
+                <w:color w:val="1A1A1A"/>
+                <w:sz w:val="18"/>
+                <w:szCs w:val="18"/>
+              </w:rPr>
+              <w:t>CASE_MNT</w:t>
+            </w:r>
+          </w:p>
+        </w:tc>
+        <w:tc>
+          <w:tcPr>
+            <w:tcW w:type="dxa" w:w="2200"/>
+            <w:tcMar>
+              <w:top w:type="dxa" w:w="60"/>
+              <w:left w:type="dxa" w:w="100"/>
+              <w:bottom w:type="dxa" w:w="60"/>
+              <w:right w:type="dxa" w:w="100"/>
+            </w:tcMar>
+          </w:tcPr>
+          <w:p>
+            <w:pPr>
+              <w:spacing w:after="0" w:line="240"/>
+            </w:pPr>
+            <w:r>
+              <w:rPr>
+                <w:rFonts w:ascii="Calibri" w:cs="Calibri" w:eastAsia="Calibri" w:hAnsi="Calibri"/>
+                <w:b w:val="false"/>
+                <w:bCs w:val="false"/>
+                <w:color w:val="1A1A1A"/>
+                <w:sz w:val="18"/>
+                <w:szCs w:val="18"/>
+              </w:rPr>
+              <w:t>~/translation-work/confidential-projects</w:t>
+            </w:r>
+          </w:p>
+        </w:tc>
+        <w:tc>
+          <w:tcPr>
+            <w:tcW w:type="dxa" w:w="4560"/>
+            <w:tcMar>
+              <w:top w:type="dxa" w:w="60"/>
+              <w:left w:type="dxa" w:w="100"/>
+              <w:bottom w:type="dxa" w:w="60"/>
+              <w:right w:type="dxa" w:w="100"/>
+            </w:tcMar>
+          </w:tcPr>
+          <w:p>
+            <w:pPr>
+              <w:spacing w:after="0" w:line="240"/>
+            </w:pPr>
+            <w:r>
+              <w:rPr>
+                <w:rFonts w:ascii="Calibri" w:cs="Calibri" w:eastAsia="Calibri" w:hAnsi="Calibri"/>
+                <w:b w:val="false"/>
+                <w:bCs w:val="false"/>
+                <w:color w:val="1A1A1A"/>
+                <w:sz w:val="18"/>
+                <w:szCs w:val="18"/>
+              </w:rPr>
+              <w:t>Where the container mounts. Also what the claude guard checks</w:t>
             </w:r>
           </w:p>
         </w:tc>

</xml_diff>

<commit_message>
Manual: correct the S3.4 path and add the gating open item
S3.4 recommended "an encrypted container holding only ~/translate" -- the
layout from before the container existed, and the same residue that had
tr-pdf writing OCR text outside the encryption. Names the real path, and
what creates it.

S14 listed six open items; the README listed seven, attributed them to S14,
and called the extra one -- settling the professional questions with the
certifying translator -- the item that gates everything else. It was absent
here. Added, since a gating item belongs in the manual rather than only in
the index that points at it.

.docx edited in place, .pdf regenerated from it, .md updated to match. Page
count unchanged.

Co-Authored-By: Claude Opus 5 <noreply@anthropic.com>
</commit_message>
<xml_diff>
--- a/01-operating-manual.docx
+++ b/01-operating-manual.docx
@@ -4740,7 +4740,7 @@
           <w:sz w:val="21"/>
           <w:szCs w:val="21"/>
         </w:rPr>
-        <w:t xml:space="preserve">If that returns nothing, the installation is unencrypted. Retrofitting is disruptive; an encrypted container holding only ~/translate is the pragmatic alternative.</w:t>
+        <w:t>If that returns nothing, the installation is unencrypted. Retrofitting is disruptive; an encrypted container holding only ~/translation-work/confidential-projects — which is what case-init creates — is the pragmatic alternative.</w:t>
       </w:r>
     </w:p>
     <w:p>
@@ -14551,6 +14551,25 @@
         <w:t xml:space="preserve">Verify German quality against base Gemma before extending to that pair (S12).</w:t>
       </w:r>
     </w:p>
+    <w:p>
+      <w:pPr>
+        <w:pStyle w:val="ListParagraph"/>
+        <w:numPr>
+          <w:ilvl w:val="0"/>
+          <w:numId w:val="2"/>
+        </w:numPr>
+        <w:spacing w:after="70" w:line="264"/>
+      </w:pPr>
+      <w:r>
+        <w:rPr>
+          <w:rFonts w:ascii="Calibri" w:cs="Calibri" w:eastAsia="Calibri" w:hAnsi="Calibri"/>
+          <w:color w:val="1A1A1A"/>
+          <w:sz w:val="21"/>
+          <w:szCs w:val="21"/>
+        </w:rPr>
+        <w:t>Settle the professional questions with the certifying translator. This item gates everything else.</w:t>
+      </w:r>
+    </w:p>
     <w:sectPr>
       <w:footerReference w:type="default" r:id="rId7"/>
       <w:pgSz w:w="12240" w:h="15840" w:orient="portrait"/>

</xml_diff>

<commit_message>
Manual: correct the date forms in S4.3 and the decisions register
English takes March 5, 2024; Slovene takes 5. marec 2024, with the ordinal
period, the lowercase month and the spaces. The manual asserted "5 March
2024" for English, which is not the form, and said nothing about the
Slovene direction at all.

S4.3 now gives both directions and names the two wrong forms explicitly,
since both were in the kit until the translator corrected them and a reader
who saw the earlier version should be able to tell that it changed. It also
notes why the all-numeric form is avoided even though it is correct: 5.3.2024
leaves the reader wondering whether it means 5 March or 3 May.

Still 17 pages.

Co-Authored-By: Claude Opus 5 <noreply@anthropic.com>
</commit_message>
<xml_diff>
--- a/01-operating-manual.docx
+++ b/01-operating-manual.docx
@@ -5676,7 +5676,7 @@
           <w:sz w:val="21"/>
           <w:szCs w:val="21"/>
         </w:rPr>
-        <w:t>Dates, amounts and times are NOT in that class. They are converted to English convention - 5. 3. 2024 becomes 5 March 2024, 12.450,00 becomes 12,450.00, and a 24-hour time becomes 2:30 p.m. - because that is what a translation into English is. The value never changes; only its spelling does.</w:t>
+        <w:t>Dates, amounts and times are NOT in that class. They are converted, because that is what a translation is. Into English, 5. 3. 2024 becomes March 5, 2024; 12.450,00 becomes 12,450.00; a 24-hour time becomes 2:30 p.m. Into Slovene it runs the other way: 5. marec 2024 - the day carries a period because it is an ordinal, so bare “5” would read as the cardinal number rather than the fifth day; the month name is lowercase, which Slovene requires; and the three parts are spaced. Amounts take 12.450,00 and times stay on the 24-hour clock. The value never changes; only its spelling does. Two forms are wrong in either language and worth naming, because both were in this kit before the translator corrected them: “5 March 2024” and “5. Marec 2024”. The all-numeric 5.3.2024 is technically correct Slovene but invites the reader to wonder whether it means 5 March or 3 May, which is a poor property for evidence.</w:t>
       </w:r>
     </w:p>
     <w:p>
@@ -15059,7 +15059,7 @@
                 <w:sz w:val="18"/>
                 <w:szCs w:val="18"/>
               </w:rPr>
-              <w:t>The translator's rule: Slovene writes 5. 3. 2024 and a decimal comma, English 5 March 2024 and a decimal point. Whole-segment values are converted in code, without a model call</w:t>
+              <w:t>The translator's rule. English takes March 5, 2024 and a decimal point; Slovene takes 5. marec 2024 - ordinal period, lowercase month, spaced - and a decimal comma. Whole-segment values are converted in code, without a model call</w:t>
             </w:r>
           </w:p>
         </w:tc>

</xml_diff>

<commit_message>
Manual: section 12's table is now generated
The environment table is written from lib/registry.py in the toolkit
repository rather than maintained by hand, in both the .docx primary and
the markdown. Content is unchanged by this commit; the table is simply no
longer a third place where the same facts can drift.

Editing it directly will be overwritten. Add the variable to the registry
and run tools/gen-docs.py --apply.
</commit_message>
<xml_diff>
--- a/01-operating-manual.docx
+++ b/01-operating-manual.docx
@@ -12519,7 +12519,7 @@
                 <w:sz w:val="18"/>
                 <w:szCs w:val="18"/>
               </w:rPr>
-              <w:t xml:space="preserve">TR_PROJECTS</w:t>
+              <w:t>TR_PROJECTS</w:t>
             </w:r>
           </w:p>
         </w:tc>
@@ -12546,7 +12546,7 @@
                 <w:sz w:val="18"/>
                 <w:szCs w:val="18"/>
               </w:rPr>
-              <w:t xml:space="preserve">~/translation-work/confidential-projects</w:t>
+              <w:t>~/translation-work/confidential-projects</w:t>
             </w:r>
           </w:p>
         </w:tc>
@@ -12573,7 +12573,7 @@
                 <w:sz w:val="18"/>
                 <w:szCs w:val="18"/>
               </w:rPr>
-              <w:t xml:space="preserve">Container root holding all projects</w:t>
+              <w:t>Container root holding all projects</w:t>
             </w:r>
           </w:p>
         </w:tc>
@@ -12582,84 +12582,81 @@
         <w:tc>
           <w:tcPr>
             <w:tcW w:type="dxa" w:w="2600"/>
-            <w:shd w:fill="FAF7F3" w:val="clear"/>
-            <w:tcMar>
-              <w:top w:type="dxa" w:w="60"/>
-              <w:left w:type="dxa" w:w="100"/>
-              <w:bottom w:type="dxa" w:w="60"/>
-              <w:right w:type="dxa" w:w="100"/>
-            </w:tcMar>
-          </w:tcPr>
-          <w:p>
-            <w:pPr>
-              <w:spacing w:after="0" w:line="240"/>
-            </w:pPr>
-            <w:r>
-              <w:rPr>
-                <w:rFonts w:ascii="Calibri" w:cs="Calibri" w:eastAsia="Calibri" w:hAnsi="Calibri"/>
-                <w:b w:val="false"/>
-                <w:bCs w:val="false"/>
-                <w:color w:val="1A1A1A"/>
-                <w:sz w:val="18"/>
-                <w:szCs w:val="18"/>
-              </w:rPr>
-              <w:t xml:space="preserve">TR_ROOT</w:t>
+            <w:tcMar>
+              <w:top w:type="dxa" w:w="60"/>
+              <w:left w:type="dxa" w:w="100"/>
+              <w:bottom w:type="dxa" w:w="60"/>
+              <w:right w:type="dxa" w:w="100"/>
+            </w:tcMar>
+          </w:tcPr>
+          <w:p>
+            <w:pPr>
+              <w:spacing w:after="0" w:line="240"/>
+            </w:pPr>
+            <w:r>
+              <w:rPr>
+                <w:rFonts w:ascii="Calibri" w:cs="Calibri" w:eastAsia="Calibri" w:hAnsi="Calibri"/>
+                <w:b w:val="false"/>
+                <w:bCs w:val="false"/>
+                <w:color w:val="1A1A1A"/>
+                <w:sz w:val="18"/>
+                <w:szCs w:val="18"/>
+              </w:rPr>
+              <w:t>TR_ROOT</w:t>
             </w:r>
           </w:p>
         </w:tc>
         <w:tc>
           <w:tcPr>
             <w:tcW w:type="dxa" w:w="2200"/>
-            <w:shd w:fill="FAF7F3" w:val="clear"/>
-            <w:tcMar>
-              <w:top w:type="dxa" w:w="60"/>
-              <w:left w:type="dxa" w:w="100"/>
-              <w:bottom w:type="dxa" w:w="60"/>
-              <w:right w:type="dxa" w:w="100"/>
-            </w:tcMar>
-          </w:tcPr>
-          <w:p>
-            <w:pPr>
-              <w:spacing w:after="0" w:line="240"/>
-            </w:pPr>
-            <w:r>
-              <w:rPr>
-                <w:rFonts w:ascii="Calibri" w:cs="Calibri" w:eastAsia="Calibri" w:hAnsi="Calibri"/>
-                <w:b w:val="false"/>
-                <w:bCs w:val="false"/>
-                <w:color w:val="1A1A1A"/>
-                <w:sz w:val="18"/>
-                <w:szCs w:val="18"/>
-              </w:rPr>
-              <w:t xml:space="preserve">(active project)</w:t>
+            <w:tcMar>
+              <w:top w:type="dxa" w:w="60"/>
+              <w:left w:type="dxa" w:w="100"/>
+              <w:bottom w:type="dxa" w:w="60"/>
+              <w:right w:type="dxa" w:w="100"/>
+            </w:tcMar>
+          </w:tcPr>
+          <w:p>
+            <w:pPr>
+              <w:spacing w:after="0" w:line="240"/>
+            </w:pPr>
+            <w:r>
+              <w:rPr>
+                <w:rFonts w:ascii="Calibri" w:cs="Calibri" w:eastAsia="Calibri" w:hAnsi="Calibri"/>
+                <w:b w:val="false"/>
+                <w:bCs w:val="false"/>
+                <w:color w:val="1A1A1A"/>
+                <w:sz w:val="18"/>
+                <w:szCs w:val="18"/>
+              </w:rPr>
+              <w:t>(active project)</w:t>
             </w:r>
           </w:p>
         </w:tc>
         <w:tc>
           <w:tcPr>
             <w:tcW w:type="dxa" w:w="4560"/>
-            <w:shd w:fill="FAF7F3" w:val="clear"/>
-            <w:tcMar>
-              <w:top w:type="dxa" w:w="60"/>
-              <w:left w:type="dxa" w:w="100"/>
-              <w:bottom w:type="dxa" w:w="60"/>
-              <w:right w:type="dxa" w:w="100"/>
-            </w:tcMar>
-          </w:tcPr>
-          <w:p>
-            <w:pPr>
-              <w:spacing w:after="0" w:line="240"/>
-            </w:pPr>
-            <w:r>
-              <w:rPr>
-                <w:rFonts w:ascii="Calibri" w:cs="Calibri" w:eastAsia="Calibri" w:hAnsi="Calibri"/>
-                <w:b w:val="false"/>
-                <w:bCs w:val="false"/>
-                <w:color w:val="1A1A1A"/>
-                <w:sz w:val="18"/>
-                <w:szCs w:val="18"/>
-              </w:rPr>
-              <w:t xml:space="preserve">Override to target one project for a single command</w:t>
+            <w:tcMar>
+              <w:top w:type="dxa" w:w="60"/>
+              <w:left w:type="dxa" w:w="100"/>
+              <w:bottom w:type="dxa" w:w="60"/>
+              <w:right w:type="dxa" w:w="100"/>
+            </w:tcMar>
+          </w:tcPr>
+          <w:p>
+            <w:pPr>
+              <w:spacing w:after="0" w:line="240"/>
+            </w:pPr>
+            <w:r>
+              <w:rPr>
+                <w:rFonts w:ascii="Calibri" w:cs="Calibri" w:eastAsia="Calibri" w:hAnsi="Calibri"/>
+                <w:b w:val="false"/>
+                <w:bCs w:val="false"/>
+                <w:color w:val="1A1A1A"/>
+                <w:sz w:val="18"/>
+                <w:szCs w:val="18"/>
+              </w:rPr>
+              <w:t>Override to target one project for a single command</w:t>
             </w:r>
           </w:p>
         </w:tc>
@@ -12688,7 +12685,7 @@
                 <w:sz w:val="18"/>
                 <w:szCs w:val="18"/>
               </w:rPr>
-              <w:t xml:space="preserve">TR_MODEL</w:t>
+              <w:t>TR_MODEL</w:t>
             </w:r>
           </w:p>
         </w:tc>
@@ -12715,7 +12712,7 @@
                 <w:sz w:val="18"/>
                 <w:szCs w:val="18"/>
               </w:rPr>
-              <w:t xml:space="preserve">gams3:q8</w:t>
+              <w:t>gams3:q8</w:t>
             </w:r>
           </w:p>
         </w:tc>
@@ -12742,7 +12739,7 @@
                 <w:sz w:val="18"/>
                 <w:szCs w:val="18"/>
               </w:rPr>
-              <w:t xml:space="preserve">Model alias used by every script</w:t>
+              <w:t>Model alias used by every script</w:t>
             </w:r>
           </w:p>
         </w:tc>
@@ -12751,84 +12748,81 @@
         <w:tc>
           <w:tcPr>
             <w:tcW w:type="dxa" w:w="2600"/>
-            <w:shd w:fill="FAF7F3" w:val="clear"/>
-            <w:tcMar>
-              <w:top w:type="dxa" w:w="60"/>
-              <w:left w:type="dxa" w:w="100"/>
-              <w:bottom w:type="dxa" w:w="60"/>
-              <w:right w:type="dxa" w:w="100"/>
-            </w:tcMar>
-          </w:tcPr>
-          <w:p>
-            <w:pPr>
-              <w:spacing w:after="0" w:line="240"/>
-            </w:pPr>
-            <w:r>
-              <w:rPr>
-                <w:rFonts w:ascii="Calibri" w:cs="Calibri" w:eastAsia="Calibri" w:hAnsi="Calibri"/>
-                <w:b w:val="false"/>
-                <w:bCs w:val="false"/>
-                <w:color w:val="1A1A1A"/>
-                <w:sz w:val="18"/>
-                <w:szCs w:val="18"/>
-              </w:rPr>
-              <w:t xml:space="preserve">TR_SRC / TR_TGT</w:t>
+            <w:tcMar>
+              <w:top w:type="dxa" w:w="60"/>
+              <w:left w:type="dxa" w:w="100"/>
+              <w:bottom w:type="dxa" w:w="60"/>
+              <w:right w:type="dxa" w:w="100"/>
+            </w:tcMar>
+          </w:tcPr>
+          <w:p>
+            <w:pPr>
+              <w:spacing w:after="0" w:line="240"/>
+            </w:pPr>
+            <w:r>
+              <w:rPr>
+                <w:rFonts w:ascii="Calibri" w:cs="Calibri" w:eastAsia="Calibri" w:hAnsi="Calibri"/>
+                <w:b w:val="false"/>
+                <w:bCs w:val="false"/>
+                <w:color w:val="1A1A1A"/>
+                <w:sz w:val="18"/>
+                <w:szCs w:val="18"/>
+              </w:rPr>
+              <w:t>TR_SRC / TR_TGT</w:t>
             </w:r>
           </w:p>
         </w:tc>
         <w:tc>
           <w:tcPr>
             <w:tcW w:type="dxa" w:w="2200"/>
-            <w:shd w:fill="FAF7F3" w:val="clear"/>
-            <w:tcMar>
-              <w:top w:type="dxa" w:w="60"/>
-              <w:left w:type="dxa" w:w="100"/>
-              <w:bottom w:type="dxa" w:w="60"/>
-              <w:right w:type="dxa" w:w="100"/>
-            </w:tcMar>
-          </w:tcPr>
-          <w:p>
-            <w:pPr>
-              <w:spacing w:after="0" w:line="240"/>
-            </w:pPr>
-            <w:r>
-              <w:rPr>
-                <w:rFonts w:ascii="Calibri" w:cs="Calibri" w:eastAsia="Calibri" w:hAnsi="Calibri"/>
-                <w:b w:val="false"/>
-                <w:bCs w:val="false"/>
-                <w:color w:val="1A1A1A"/>
-                <w:sz w:val="18"/>
-                <w:szCs w:val="18"/>
-              </w:rPr>
-              <w:t xml:space="preserve">sl / en</w:t>
+            <w:tcMar>
+              <w:top w:type="dxa" w:w="60"/>
+              <w:left w:type="dxa" w:w="100"/>
+              <w:bottom w:type="dxa" w:w="60"/>
+              <w:right w:type="dxa" w:w="100"/>
+            </w:tcMar>
+          </w:tcPr>
+          <w:p>
+            <w:pPr>
+              <w:spacing w:after="0" w:line="240"/>
+            </w:pPr>
+            <w:r>
+              <w:rPr>
+                <w:rFonts w:ascii="Calibri" w:cs="Calibri" w:eastAsia="Calibri" w:hAnsi="Calibri"/>
+                <w:b w:val="false"/>
+                <w:bCs w:val="false"/>
+                <w:color w:val="1A1A1A"/>
+                <w:sz w:val="18"/>
+                <w:szCs w:val="18"/>
+              </w:rPr>
+              <w:t>sl / en</w:t>
             </w:r>
           </w:p>
         </w:tc>
         <w:tc>
           <w:tcPr>
             <w:tcW w:type="dxa" w:w="4560"/>
-            <w:shd w:fill="FAF7F3" w:val="clear"/>
-            <w:tcMar>
-              <w:top w:type="dxa" w:w="60"/>
-              <w:left w:type="dxa" w:w="100"/>
-              <w:bottom w:type="dxa" w:w="60"/>
-              <w:right w:type="dxa" w:w="100"/>
-            </w:tcMar>
-          </w:tcPr>
-          <w:p>
-            <w:pPr>
-              <w:spacing w:after="0" w:line="240"/>
-            </w:pPr>
-            <w:r>
-              <w:rPr>
-                <w:rFonts w:ascii="Calibri" w:cs="Calibri" w:eastAsia="Calibri" w:hAnsi="Calibri"/>
-                <w:b w:val="false"/>
-                <w:bCs w:val="false"/>
-                <w:color w:val="1A1A1A"/>
-                <w:sz w:val="18"/>
-                <w:szCs w:val="18"/>
-              </w:rPr>
-              <w:t xml:space="preserve">Per-project, in project.conf. Use de for German</w:t>
+            <w:tcMar>
+              <w:top w:type="dxa" w:w="60"/>
+              <w:left w:type="dxa" w:w="100"/>
+              <w:bottom w:type="dxa" w:w="60"/>
+              <w:right w:type="dxa" w:w="100"/>
+            </w:tcMar>
+          </w:tcPr>
+          <w:p>
+            <w:pPr>
+              <w:spacing w:after="0" w:line="240"/>
+            </w:pPr>
+            <w:r>
+              <w:rPr>
+                <w:rFonts w:ascii="Calibri" w:cs="Calibri" w:eastAsia="Calibri" w:hAnsi="Calibri"/>
+                <w:b w:val="false"/>
+                <w:bCs w:val="false"/>
+                <w:color w:val="1A1A1A"/>
+                <w:sz w:val="18"/>
+                <w:szCs w:val="18"/>
+              </w:rPr>
+              <w:t>Per-project, in project.conf. Use de for German</w:t>
             </w:r>
           </w:p>
         </w:tc>
@@ -12857,7 +12851,7 @@
                 <w:sz w:val="18"/>
                 <w:szCs w:val="18"/>
               </w:rPr>
-              <w:t xml:space="preserve">TR_SUFFIX</w:t>
+              <w:t>TR_SUFFIX</w:t>
             </w:r>
           </w:p>
         </w:tc>
@@ -12884,7 +12878,7 @@
                 <w:sz w:val="18"/>
                 <w:szCs w:val="18"/>
               </w:rPr>
-              <w:t xml:space="preserve">(empty)</w:t>
+              <w:t>(empty)</w:t>
             </w:r>
           </w:p>
         </w:tc>
@@ -12911,7 +12905,7 @@
                 <w:sz w:val="18"/>
                 <w:szCs w:val="18"/>
               </w:rPr>
-              <w:t xml:space="preserve">Per-project, in project.conf. Set if the client requires it</w:t>
+              <w:t>Per-project, in project.conf. Set if the client requires it</w:t>
             </w:r>
           </w:p>
         </w:tc>
@@ -12920,84 +12914,81 @@
         <w:tc>
           <w:tcPr>
             <w:tcW w:type="dxa" w:w="2600"/>
-            <w:shd w:fill="FAF7F3" w:val="clear"/>
-            <w:tcMar>
-              <w:top w:type="dxa" w:w="60"/>
-              <w:left w:type="dxa" w:w="100"/>
-              <w:bottom w:type="dxa" w:w="60"/>
-              <w:right w:type="dxa" w:w="100"/>
-            </w:tcMar>
-          </w:tcPr>
-          <w:p>
-            <w:pPr>
-              <w:spacing w:after="0" w:line="240"/>
-            </w:pPr>
-            <w:r>
-              <w:rPr>
-                <w:rFonts w:ascii="Calibri" w:cs="Calibri" w:eastAsia="Calibri" w:hAnsi="Calibri"/>
-                <w:b w:val="false"/>
-                <w:bCs w:val="false"/>
-                <w:color w:val="1A1A1A"/>
-                <w:sz w:val="18"/>
-                <w:szCs w:val="18"/>
-              </w:rPr>
-              <w:t xml:space="preserve">TR_NUM_CTX</w:t>
+            <w:tcMar>
+              <w:top w:type="dxa" w:w="60"/>
+              <w:left w:type="dxa" w:w="100"/>
+              <w:bottom w:type="dxa" w:w="60"/>
+              <w:right w:type="dxa" w:w="100"/>
+            </w:tcMar>
+          </w:tcPr>
+          <w:p>
+            <w:pPr>
+              <w:spacing w:after="0" w:line="240"/>
+            </w:pPr>
+            <w:r>
+              <w:rPr>
+                <w:rFonts w:ascii="Calibri" w:cs="Calibri" w:eastAsia="Calibri" w:hAnsi="Calibri"/>
+                <w:b w:val="false"/>
+                <w:bCs w:val="false"/>
+                <w:color w:val="1A1A1A"/>
+                <w:sz w:val="18"/>
+                <w:szCs w:val="18"/>
+              </w:rPr>
+              <w:t>TR_NUM_CTX</w:t>
             </w:r>
           </w:p>
         </w:tc>
         <w:tc>
           <w:tcPr>
             <w:tcW w:type="dxa" w:w="2200"/>
-            <w:shd w:fill="FAF7F3" w:val="clear"/>
-            <w:tcMar>
-              <w:top w:type="dxa" w:w="60"/>
-              <w:left w:type="dxa" w:w="100"/>
-              <w:bottom w:type="dxa" w:w="60"/>
-              <w:right w:type="dxa" w:w="100"/>
-            </w:tcMar>
-          </w:tcPr>
-          <w:p>
-            <w:pPr>
-              <w:spacing w:after="0" w:line="240"/>
-            </w:pPr>
-            <w:r>
-              <w:rPr>
-                <w:rFonts w:ascii="Calibri" w:cs="Calibri" w:eastAsia="Calibri" w:hAnsi="Calibri"/>
-                <w:b w:val="false"/>
-                <w:bCs w:val="false"/>
-                <w:color w:val="1A1A1A"/>
-                <w:sz w:val="18"/>
-                <w:szCs w:val="18"/>
-              </w:rPr>
-              <w:t xml:space="preserve">8192</w:t>
+            <w:tcMar>
+              <w:top w:type="dxa" w:w="60"/>
+              <w:left w:type="dxa" w:w="100"/>
+              <w:bottom w:type="dxa" w:w="60"/>
+              <w:right w:type="dxa" w:w="100"/>
+            </w:tcMar>
+          </w:tcPr>
+          <w:p>
+            <w:pPr>
+              <w:spacing w:after="0" w:line="240"/>
+            </w:pPr>
+            <w:r>
+              <w:rPr>
+                <w:rFonts w:ascii="Calibri" w:cs="Calibri" w:eastAsia="Calibri" w:hAnsi="Calibri"/>
+                <w:b w:val="false"/>
+                <w:bCs w:val="false"/>
+                <w:color w:val="1A1A1A"/>
+                <w:sz w:val="18"/>
+                <w:szCs w:val="18"/>
+              </w:rPr>
+              <w:t>8192</w:t>
             </w:r>
           </w:p>
         </w:tc>
         <w:tc>
           <w:tcPr>
             <w:tcW w:type="dxa" w:w="4560"/>
-            <w:shd w:fill="FAF7F3" w:val="clear"/>
-            <w:tcMar>
-              <w:top w:type="dxa" w:w="60"/>
-              <w:left w:type="dxa" w:w="100"/>
-              <w:bottom w:type="dxa" w:w="60"/>
-              <w:right w:type="dxa" w:w="100"/>
-            </w:tcMar>
-          </w:tcPr>
-          <w:p>
-            <w:pPr>
-              <w:spacing w:after="0" w:line="240"/>
-            </w:pPr>
-            <w:r>
-              <w:rPr>
-                <w:rFonts w:ascii="Calibri" w:cs="Calibri" w:eastAsia="Calibri" w:hAnsi="Calibri"/>
-                <w:b w:val="false"/>
-                <w:bCs w:val="false"/>
-                <w:color w:val="1A1A1A"/>
-                <w:sz w:val="18"/>
-                <w:szCs w:val="18"/>
-              </w:rPr>
-              <w:t xml:space="preserve">Context window. Lower if memory is tight</w:t>
+            <w:tcMar>
+              <w:top w:type="dxa" w:w="60"/>
+              <w:left w:type="dxa" w:w="100"/>
+              <w:bottom w:type="dxa" w:w="60"/>
+              <w:right w:type="dxa" w:w="100"/>
+            </w:tcMar>
+          </w:tcPr>
+          <w:p>
+            <w:pPr>
+              <w:spacing w:after="0" w:line="240"/>
+            </w:pPr>
+            <w:r>
+              <w:rPr>
+                <w:rFonts w:ascii="Calibri" w:cs="Calibri" w:eastAsia="Calibri" w:hAnsi="Calibri"/>
+                <w:b w:val="false"/>
+                <w:bCs w:val="false"/>
+                <w:color w:val="1A1A1A"/>
+                <w:sz w:val="18"/>
+                <w:szCs w:val="18"/>
+              </w:rPr>
+              <w:t>Context window. Lower if memory is tight</w:t>
             </w:r>
           </w:p>
         </w:tc>
@@ -13026,7 +13017,7 @@
                 <w:sz w:val="18"/>
                 <w:szCs w:val="18"/>
               </w:rPr>
-              <w:t xml:space="preserve">TR_PROMPT_VERSION</w:t>
+              <w:t>TR_PROMPT_VERSION</w:t>
             </w:r>
           </w:p>
         </w:tc>
@@ -13080,7 +13071,7 @@
                 <w:sz w:val="18"/>
                 <w:szCs w:val="18"/>
               </w:rPr>
-              <w:t xml:space="preserve">Part of the cache key. Bump to force retranslation</w:t>
+              <w:t>Part of the cache key. Bump to force retranslation</w:t>
             </w:r>
           </w:p>
         </w:tc>
@@ -13089,84 +13080,81 @@
         <w:tc>
           <w:tcPr>
             <w:tcW w:type="dxa" w:w="2600"/>
-            <w:shd w:fill="FAF7F3" w:val="clear"/>
-            <w:tcMar>
-              <w:top w:type="dxa" w:w="60"/>
-              <w:left w:type="dxa" w:w="100"/>
-              <w:bottom w:type="dxa" w:w="60"/>
-              <w:right w:type="dxa" w:w="100"/>
-            </w:tcMar>
-          </w:tcPr>
-          <w:p>
-            <w:pPr>
-              <w:spacing w:after="0" w:line="240"/>
-            </w:pPr>
-            <w:r>
-              <w:rPr>
-                <w:rFonts w:ascii="Calibri" w:cs="Calibri" w:eastAsia="Calibri" w:hAnsi="Calibri"/>
-                <w:b w:val="false"/>
-                <w:bCs w:val="false"/>
-                <w:color w:val="1A1A1A"/>
-                <w:sz w:val="18"/>
-                <w:szCs w:val="18"/>
-              </w:rPr>
-              <w:t xml:space="preserve">TR_OCR_LANGS</w:t>
+            <w:tcMar>
+              <w:top w:type="dxa" w:w="60"/>
+              <w:left w:type="dxa" w:w="100"/>
+              <w:bottom w:type="dxa" w:w="60"/>
+              <w:right w:type="dxa" w:w="100"/>
+            </w:tcMar>
+          </w:tcPr>
+          <w:p>
+            <w:pPr>
+              <w:spacing w:after="0" w:line="240"/>
+            </w:pPr>
+            <w:r>
+              <w:rPr>
+                <w:rFonts w:ascii="Calibri" w:cs="Calibri" w:eastAsia="Calibri" w:hAnsi="Calibri"/>
+                <w:b w:val="false"/>
+                <w:bCs w:val="false"/>
+                <w:color w:val="1A1A1A"/>
+                <w:sz w:val="18"/>
+                <w:szCs w:val="18"/>
+              </w:rPr>
+              <w:t>TR_OCR_LANGS</w:t>
             </w:r>
           </w:p>
         </w:tc>
         <w:tc>
           <w:tcPr>
             <w:tcW w:type="dxa" w:w="2200"/>
-            <w:shd w:fill="FAF7F3" w:val="clear"/>
-            <w:tcMar>
-              <w:top w:type="dxa" w:w="60"/>
-              <w:left w:type="dxa" w:w="100"/>
-              <w:bottom w:type="dxa" w:w="60"/>
-              <w:right w:type="dxa" w:w="100"/>
-            </w:tcMar>
-          </w:tcPr>
-          <w:p>
-            <w:pPr>
-              <w:spacing w:after="0" w:line="240"/>
-            </w:pPr>
-            <w:r>
-              <w:rPr>
-                <w:rFonts w:ascii="Calibri" w:cs="Calibri" w:eastAsia="Calibri" w:hAnsi="Calibri"/>
-                <w:b w:val="false"/>
-                <w:bCs w:val="false"/>
-                <w:color w:val="1A1A1A"/>
-                <w:sz w:val="18"/>
-                <w:szCs w:val="18"/>
-              </w:rPr>
-              <w:t xml:space="preserve">slv+eng</w:t>
+            <w:tcMar>
+              <w:top w:type="dxa" w:w="60"/>
+              <w:left w:type="dxa" w:w="100"/>
+              <w:bottom w:type="dxa" w:w="60"/>
+              <w:right w:type="dxa" w:w="100"/>
+            </w:tcMar>
+          </w:tcPr>
+          <w:p>
+            <w:pPr>
+              <w:spacing w:after="0" w:line="240"/>
+            </w:pPr>
+            <w:r>
+              <w:rPr>
+                <w:rFonts w:ascii="Calibri" w:cs="Calibri" w:eastAsia="Calibri" w:hAnsi="Calibri"/>
+                <w:b w:val="false"/>
+                <w:bCs w:val="false"/>
+                <w:color w:val="1A1A1A"/>
+                <w:sz w:val="18"/>
+                <w:szCs w:val="18"/>
+              </w:rPr>
+              <w:t>slv+eng</w:t>
             </w:r>
           </w:p>
         </w:tc>
         <w:tc>
           <w:tcPr>
             <w:tcW w:type="dxa" w:w="4560"/>
-            <w:shd w:fill="FAF7F3" w:val="clear"/>
-            <w:tcMar>
-              <w:top w:type="dxa" w:w="60"/>
-              <w:left w:type="dxa" w:w="100"/>
-              <w:bottom w:type="dxa" w:w="60"/>
-              <w:right w:type="dxa" w:w="100"/>
-            </w:tcMar>
-          </w:tcPr>
-          <w:p>
-            <w:pPr>
-              <w:spacing w:after="0" w:line="240"/>
-            </w:pPr>
-            <w:r>
-              <w:rPr>
-                <w:rFonts w:ascii="Calibri" w:cs="Calibri" w:eastAsia="Calibri" w:hAnsi="Calibri"/>
-                <w:b w:val="false"/>
-                <w:bCs w:val="false"/>
-                <w:color w:val="1A1A1A"/>
-                <w:sz w:val="18"/>
-                <w:szCs w:val="18"/>
-              </w:rPr>
-              <w:t xml:space="preserve">Tesseract languages. Add deu for German</w:t>
+            <w:tcMar>
+              <w:top w:type="dxa" w:w="60"/>
+              <w:left w:type="dxa" w:w="100"/>
+              <w:bottom w:type="dxa" w:w="60"/>
+              <w:right w:type="dxa" w:w="100"/>
+            </w:tcMar>
+          </w:tcPr>
+          <w:p>
+            <w:pPr>
+              <w:spacing w:after="0" w:line="240"/>
+            </w:pPr>
+            <w:r>
+              <w:rPr>
+                <w:rFonts w:ascii="Calibri" w:cs="Calibri" w:eastAsia="Calibri" w:hAnsi="Calibri"/>
+                <w:b w:val="false"/>
+                <w:bCs w:val="false"/>
+                <w:color w:val="1A1A1A"/>
+                <w:sz w:val="18"/>
+                <w:szCs w:val="18"/>
+              </w:rPr>
+              <w:t>Tesseract languages. Add deu for German</w:t>
             </w:r>
           </w:p>
         </w:tc>
@@ -13195,7 +13183,7 @@
                 <w:sz w:val="18"/>
                 <w:szCs w:val="18"/>
               </w:rPr>
-              <w:t xml:space="preserve">TR_OLLAMA</w:t>
+              <w:t>TR_OLLAMA</w:t>
             </w:r>
           </w:p>
         </w:tc>
@@ -13222,7 +13210,7 @@
                 <w:sz w:val="18"/>
                 <w:szCs w:val="18"/>
               </w:rPr>
-              <w:t xml:space="preserve">http://127.0.0.1:11434</w:t>
+              <w:t>http://127.0.0.1:11434</w:t>
             </w:r>
           </w:p>
         </w:tc>
@@ -13249,7 +13237,7 @@
                 <w:sz w:val="18"/>
                 <w:szCs w:val="18"/>
               </w:rPr>
-              <w:t xml:space="preserve">Ollama endpoint</w:t>
+              <w:t>Ollama endpoint</w:t>
             </w:r>
           </w:p>
         </w:tc>
@@ -13278,7 +13266,7 @@
                 <w:sz w:val="18"/>
                 <w:szCs w:val="18"/>
               </w:rPr>
-              <w:t>TR_VENV</w:t>
+              <w:t>TR_DICTS</w:t>
             </w:r>
           </w:p>
         </w:tc>
@@ -13305,7 +13293,7 @@
                 <w:sz w:val="18"/>
                 <w:szCs w:val="18"/>
               </w:rPr>
-              <w:t>~/.translate-venv</w:t>
+              <w:t>/usr/share/hunspell</w:t>
             </w:r>
           </w:p>
         </w:tc>
@@ -13332,7 +13320,7 @@
                 <w:sz w:val="18"/>
                 <w:szCs w:val="18"/>
               </w:rPr>
-              <w:t>Python environment the scripts re-exec into. Set before tr-setup to put it elsewhere</w:t>
+              <w:t>Where tr-inventory looks for the hunspell word lists it detects language with</w:t>
             </w:r>
           </w:p>
         </w:tc>
@@ -13361,7 +13349,7 @@
                 <w:sz w:val="18"/>
                 <w:szCs w:val="18"/>
               </w:rPr>
-              <w:t>TR_NO_REEXEC</w:t>
+              <w:t>TR_OCR_SAMPLE_LANGS</w:t>
             </w:r>
           </w:p>
         </w:tc>
@@ -13388,7 +13376,7 @@
                 <w:sz w:val="18"/>
                 <w:szCs w:val="18"/>
               </w:rPr>
-              <w:t>(unset)</w:t>
+              <w:t>slv+hrv+eng</w:t>
             </w:r>
           </w:p>
         </w:tc>
@@ -13415,7 +13403,7 @@
                 <w:sz w:val="18"/>
                 <w:szCs w:val="18"/>
               </w:rPr>
-              <w:t>Set to 1 to stay on the system interpreter. Diagnostics only; imports will fail</w:t>
+              <w:t>Tesseract languages for the detection sampling pass on scanned PDFs</w:t>
             </w:r>
           </w:p>
         </w:tc>
@@ -13444,7 +13432,7 @@
                 <w:sz w:val="18"/>
                 <w:szCs w:val="18"/>
               </w:rPr>
-              <w:t>CASE_IMG</w:t>
+              <w:t>TR_VENV</w:t>
             </w:r>
           </w:p>
         </w:tc>
@@ -13471,7 +13459,7 @@
                 <w:sz w:val="18"/>
                 <w:szCs w:val="18"/>
               </w:rPr>
-              <w:t>~/.case/confidential.luks</w:t>
+              <w:t>~/.translate-venv</w:t>
             </w:r>
           </w:p>
         </w:tc>
@@ -13498,7 +13486,7 @@
                 <w:sz w:val="18"/>
                 <w:szCs w:val="18"/>
               </w:rPr>
-              <w:t>The LUKS container file. Read by case-init, case-open, case-status</w:t>
+              <w:t>Python environment the scripts re-exec into. Set before tr-setup to put it elsewhere</w:t>
             </w:r>
           </w:p>
         </w:tc>
@@ -13527,7 +13515,7 @@
                 <w:sz w:val="18"/>
                 <w:szCs w:val="18"/>
               </w:rPr>
-              <w:t>CASE_MAP</w:t>
+              <w:t>TR_NO_REEXEC</w:t>
             </w:r>
           </w:p>
         </w:tc>
@@ -13554,7 +13542,7 @@
                 <w:sz w:val="18"/>
                 <w:szCs w:val="18"/>
               </w:rPr>
-              <w:t>casedata</w:t>
+              <w:t>(unset)</w:t>
             </w:r>
           </w:p>
         </w:tc>
@@ -13581,7 +13569,7 @@
                 <w:sz w:val="18"/>
                 <w:szCs w:val="18"/>
               </w:rPr>
-              <w:t>Device-mapper name while the container is unlocked</w:t>
+              <w:t>Set to 1 to stay on the system interpreter. Diagnostics only; imports will fail</w:t>
             </w:r>
           </w:p>
         </w:tc>
@@ -13610,7 +13598,7 @@
                 <w:sz w:val="18"/>
                 <w:szCs w:val="18"/>
               </w:rPr>
-              <w:t>CASE_MNT</w:t>
+              <w:t>CASE_IMG</w:t>
             </w:r>
           </w:p>
         </w:tc>
@@ -13637,7 +13625,7 @@
                 <w:sz w:val="18"/>
                 <w:szCs w:val="18"/>
               </w:rPr>
-              <w:t>~/translation-work/confidential-projects</w:t>
+              <w:t>~/.case/confidential.luks</w:t>
             </w:r>
           </w:p>
         </w:tc>
@@ -13664,7 +13652,7 @@
                 <w:sz w:val="18"/>
                 <w:szCs w:val="18"/>
               </w:rPr>
-              <w:t>Where the container mounts. Also what the claude guard checks</w:t>
+              <w:t>The LUKS container file. Read by case-init, case-open, case-status</w:t>
             </w:r>
           </w:p>
         </w:tc>
@@ -13693,7 +13681,7 @@
                 <w:sz w:val="18"/>
                 <w:szCs w:val="18"/>
               </w:rPr>
-              <w:t>TR_DICTS</w:t>
+              <w:t>CASE_MAP</w:t>
             </w:r>
           </w:p>
         </w:tc>
@@ -13720,7 +13708,7 @@
                 <w:sz w:val="18"/>
                 <w:szCs w:val="18"/>
               </w:rPr>
-              <w:t>/usr/share/hunspell</w:t>
+              <w:t>casedata</w:t>
             </w:r>
           </w:p>
         </w:tc>
@@ -13747,7 +13735,7 @@
                 <w:sz w:val="18"/>
                 <w:szCs w:val="18"/>
               </w:rPr>
-              <w:t>Where tr-inventory looks for the hunspell word lists it detects language with</w:t>
+              <w:t>Device-mapper name while the container is unlocked</w:t>
             </w:r>
           </w:p>
         </w:tc>
@@ -13776,7 +13764,7 @@
                 <w:sz w:val="18"/>
                 <w:szCs w:val="18"/>
               </w:rPr>
-              <w:t>TR_OCR_SAMPLE_LANGS</w:t>
+              <w:t>TR_VISION_MODEL</w:t>
             </w:r>
           </w:p>
         </w:tc>
@@ -13803,7 +13791,7 @@
                 <w:sz w:val="18"/>
                 <w:szCs w:val="18"/>
               </w:rPr>
-              <w:t>slv+hrv+eng</w:t>
+              <w:t>deepseek-ocr:3b</w:t>
             </w:r>
           </w:p>
         </w:tc>
@@ -13830,7 +13818,7 @@
                 <w:sz w:val="18"/>
                 <w:szCs w:val="18"/>
               </w:rPr>
-              <w:t>Tesseract languages for the detection sampling pass on scanned PDFs</w:t>
+              <w:t>Second OCR engine used by ocr-check.py. qwen3.6 is the fallback</w:t>
             </w:r>
           </w:p>
         </w:tc>
@@ -13859,7 +13847,7 @@
                 <w:sz w:val="18"/>
                 <w:szCs w:val="18"/>
               </w:rPr>
-              <w:t>TR_VISION_MODEL</w:t>
+              <w:t>TR_VISION_PROMPT</w:t>
             </w:r>
           </w:p>
         </w:tc>
@@ -13886,7 +13874,7 @@
                 <w:sz w:val="18"/>
                 <w:szCs w:val="18"/>
               </w:rPr>
-              <w:t>deepseek-ocr:3b</w:t>
+              <w:t>Extract the text in the image.</w:t>
             </w:r>
           </w:p>
         </w:tc>
@@ -13913,7 +13901,7 @@
                 <w:sz w:val="18"/>
                 <w:szCs w:val="18"/>
               </w:rPr>
-              <w:t>Second OCR engine used by ocr-check.py. qwen3.6 is the fallback</w:t>
+              <w:t>Prompt for that model. It transcribes; it does not follow instructions</w:t>
             </w:r>
           </w:p>
         </w:tc>
@@ -13942,7 +13930,7 @@
                 <w:sz w:val="18"/>
                 <w:szCs w:val="18"/>
               </w:rPr>
-              <w:t>TR_VISION_PROMPT</w:t>
+              <w:t>TR_OCR_MIN_CONF</w:t>
             </w:r>
           </w:p>
         </w:tc>
@@ -13969,7 +13957,7 @@
                 <w:sz w:val="18"/>
                 <w:szCs w:val="18"/>
               </w:rPr>
-              <w:t>Extract the text in the image.</w:t>
+              <w:t>40</w:t>
             </w:r>
           </w:p>
         </w:tc>
@@ -13996,7 +13984,7 @@
                 <w:sz w:val="18"/>
                 <w:szCs w:val="18"/>
               </w:rPr>
-              <w:t>Prompt for that model. It transcribes; it does not follow instructions</w:t>
+              <w:t>Tesseract confidence floor in tr-ocrtext. Below it, a word is marked unreadable</w:t>
             </w:r>
           </w:p>
         </w:tc>
@@ -14025,7 +14013,7 @@
                 <w:sz w:val="18"/>
                 <w:szCs w:val="18"/>
               </w:rPr>
-              <w:t>TR_OCR_MIN_CONF</w:t>
+              <w:t>TR_ILLEGIBLE_MARK</w:t>
             </w:r>
           </w:p>
         </w:tc>
@@ -14052,7 +14040,7 @@
                 <w:sz w:val="18"/>
                 <w:szCs w:val="18"/>
               </w:rPr>
-              <w:t>40</w:t>
+              <w:t>OCR_ILLEGIBLE</w:t>
             </w:r>
           </w:p>
         </w:tc>
@@ -14079,7 +14067,7 @@
                 <w:sz w:val="18"/>
                 <w:szCs w:val="18"/>
               </w:rPr>
-              <w:t>Tesseract confidence floor in tr-ocrtext. Below it, a word is marked unreadable</w:t>
+              <w:t>What tr-ocrtext writes in place of a word it could not read</w:t>
             </w:r>
           </w:p>
         </w:tc>
@@ -14108,7 +14096,7 @@
                 <w:sz w:val="18"/>
                 <w:szCs w:val="18"/>
               </w:rPr>
-              <w:t>TR_ILLEGIBLE_MARK</w:t>
+              <w:t>CLAUDE_DESKTOP_BIN</w:t>
             </w:r>
           </w:p>
         </w:tc>
@@ -14135,7 +14123,7 @@
                 <w:sz w:val="18"/>
                 <w:szCs w:val="18"/>
               </w:rPr>
-              <w:t>OCR_ILLEGIBLE</w:t>
+              <w:t>/usr/bin/claude-desktop</w:t>
             </w:r>
           </w:p>
         </w:tc>
@@ -14162,7 +14150,7 @@
                 <w:sz w:val="18"/>
                 <w:szCs w:val="18"/>
               </w:rPr>
-              <w:t>What tr-ocrtext writes in place of a word it could not read</w:t>
+              <w:t>The real binary case-guard-desktop launches once it has checked the mount</w:t>
             </w:r>
           </w:p>
         </w:tc>
@@ -14191,7 +14179,7 @@
                 <w:sz w:val="18"/>
                 <w:szCs w:val="18"/>
               </w:rPr>
-              <w:t>CLAUDE_DESKTOP_BIN</w:t>
+              <w:t>CASE_MNT</w:t>
             </w:r>
           </w:p>
         </w:tc>
@@ -14218,7 +14206,7 @@
                 <w:sz w:val="18"/>
                 <w:szCs w:val="18"/>
               </w:rPr>
-              <w:t>/usr/bin/claude-desktop</w:t>
+              <w:t>~/translation-work/confidential-projects</w:t>
             </w:r>
           </w:p>
         </w:tc>
@@ -14245,7 +14233,7 @@
                 <w:sz w:val="18"/>
                 <w:szCs w:val="18"/>
               </w:rPr>
-              <w:t>The real binary case-guard-desktop launches once it has checked the mount</w:t>
+              <w:t>Where the container mounts. Also what the claude guard checks</w:t>
             </w:r>
           </w:p>
         </w:tc>

</xml_diff>

<commit_message>
Manual: make the force-retranslation example version-independent
It read TR_PROMPT_VERSION=v5, which is now the default, so following it
would do nothing. It had already been stale once at v2. A worked example
carrying a version number goes stale every time the version moves, so it
now uses an obviously arbitrary value and says any unused one will do.

Section 12's table follows the registry bump to v5.
</commit_message>
<xml_diff>
--- a/01-operating-manual.docx
+++ b/01-operating-manual.docx
@@ -9033,7 +9033,7 @@
           <w:color w:val="35322E"/>
           <w:sz w:val="17"/>
         </w:rPr>
-        <w:t>v5</w:t>
+        <w:t>redo-2026-08</w:t>
       </w:r>
       <w:r>
         <w:rPr>
@@ -9057,7 +9057,7 @@
           <w:color w:val="35322E"/>
           <w:sz w:val="17"/>
         </w:rPr>
-        <w:t xml:space="preserve">                  </w:t>
+        <w:t xml:space="preserve">          </w:t>
       </w:r>
       <w:r>
         <w:rPr>
@@ -9065,7 +9065,7 @@
           <w:color w:val="8C8578"/>
           <w:sz w:val="17"/>
         </w:rPr>
-        <w:t># ignore memory, retranslate</w:t>
+        <w:t># any unused value; ignore memory</w:t>
       </w:r>
     </w:p>
     <w:p>
@@ -13044,7 +13044,7 @@
                 <w:sz w:val="18"/>
                 <w:szCs w:val="18"/>
               </w:rPr>
-              <w:t>v4</w:t>
+              <w:t>v5</w:t>
             </w:r>
           </w:p>
         </w:tc>

</xml_diff>

<commit_message>
Manual: give section 5.3 a measurable definition of unusable OCR
The section explained what OCR gets wrong and what it costs to check, but
never said at what point a document is too damaged to build on. Adds the
three criteria, their thresholds, the eight-page basis they rest on, and
the measured rates for the Phase 1 files.

Records why the number-disagreement criterion is not a percentage: it does
not scale with the error rate, and one wrong digit in an amount is exactly
the failure this pipeline exists to catch.
</commit_message>
<xml_diff>
--- a/01-operating-manual.docx
+++ b/01-operating-manual.docx
@@ -7181,6 +7181,41 @@
           <w:sz w:val="21"/>
         </w:rPr>
         <w:t>It costs about 3 minutes a page against seconds for Tesseract, so it is affordable on the pages that carry the risk and not across a whole corpus. That is what --gate decides: the vision pass runs only where the share of Tesseract words below the confidence floor reaches the threshold. The default of 3% comes from those eight pages — the page with fourteen disagreements sat at 5%, the clean ones at 0–2%. Two points is thin evidence; raise it if the second engine keeps confirming the first.</w:t>
+      </w:r>
+    </w:p>
+    <w:p>
+      <w:pPr>
+        <w:spacing w:after="120" w:line="264"/>
+      </w:pPr>
+      <w:r>
+        <w:rPr>
+          <w:rFonts w:ascii="Calibri" w:hAnsi="Calibri"/>
+          <w:color w:val="1A1A1A"/>
+          <w:sz w:val="21"/>
+        </w:rPr>
+        <w:t>The third criterion is deliberately not a rate. A page can be 99% clean and still carry one wrong digit in an amount, and nothing downstream can catch it, so a disagreement is not a reason to stop the project - it is a page that gets read against the original. The first two thresholds come from eight pages of two real documents and are starting points with a stated basis, not laws. The Phase 1 files measured 1% and 3%.</w:t>
+      </w:r>
+    </w:p>
+    <w:p>
+      <w:pPr>
+        <w:spacing w:after="120" w:line="264"/>
+      </w:pPr>
+      <w:r>
+        <w:rPr>
+          <w:rFonts w:ascii="Calibri" w:hAnsi="Calibri"/>
+          <w:b/>
+          <w:color w:val="1A1A1A"/>
+          <w:sz w:val="21"/>
+        </w:rPr>
+        <w:t>What counts as too poor to translate.</w:t>
+      </w:r>
+      <w:r>
+        <w:rPr>
+          <w:rFonts w:ascii="Calibri" w:hAnsi="Calibri"/>
+          <w:color w:val="1A1A1A"/>
+          <w:sz w:val="21"/>
+        </w:rPr>
+        <w:t xml:space="preserve"> Not a judgement call, because the measurements already exist. tr-ocrtext reports the share of tokens Tesseract scored below its confidence floor; ocr-check.py reports the share of doubtful words and the number disagreements between the two engines. Unreadable tokens: under 5% proceed, 5-20% inspect, 20% or more stop. Doubtful words: under 3% proceed, 3-10% run the cross-check, over 10% stop. Number disagreements: any at all, and a person reads that page.</w:t>
       </w:r>
     </w:p>
     <w:p>

</xml_diff>

<commit_message>
Manual and runbook: text layers without OCR_ILLEGIBLE marks
Text layers from an earlier tr-inventory --with-ocr carry no confidence
marks. Explains how they are recognised and read again, what tr-ocrstat
now reports and exits with, and that a project translated from them
retranslates its PDFs after re-running the inventory and tr-run. Runbook
regenerated from the kit.
</commit_message>
<xml_diff>
--- a/01-operating-manual.docx
+++ b/01-operating-manual.docx
@@ -7206,6 +7206,7 @@
           <w:color w:val="1A1A1A"/>
           <w:sz w:val="21"/>
         </w:rPr>
+        <w:t>tr-ocrstat answers this for a whole corpus rather than one file: it reports the unreadable-token rate per PDF, worst first, against the thresholds below, and exits non-zero if anything is in the stop band or any text layer cannot be measured. Use it before tr-run; use ocr-check.py on the individual pages whose numbers carry weight.</w:t>
       </w:r>
       <w:r>
         <w:rPr>
@@ -7213,7 +7214,26 @@
           <w:color w:val="1A1A1A"/>
           <w:sz w:val="21"/>
         </w:rPr>
-        <w:t>tr-ocrstat answers this for a whole corpus rather than one file: it reports the unreadable-token rate per PDF, worst first, against the thresholds below, and exits non-zero if anything is in the stop band. Use it before tr-run; use ocr-check.py on the individual pages whose numbers carry weight.</w:t>
+      </w:r>
+    </w:p>
+    <w:p>
+      <w:pPr>
+        <w:spacing w:after="120" w:line="264"/>
+      </w:pPr>
+      <w:r>
+        <w:rPr>
+          <w:rFonts w:ascii="Calibri" w:hAnsi="Calibri"/>
+          <w:color w:val="1A1A1A"/>
+          <w:sz w:val="21"/>
+        </w:rPr>
+        <w:t>A text layer written by an earlier tr-inventory --count --with-ocr cannot be measured. That version made it with plain pdftotext, so nothing in it is marked OCR_ILLEGIBLE, and tr-pdf reused it for translation. Such layers are recognisable — pdftotext leaves a form feed after every page, which neither tr-ocrtext nor the born-digital path writes — so tr-ocrstat names them rather than reporting 0%, and tr-pdf reads the file again, keeping the old layer as &lt;name&gt;.txt.unmarked. tr-inventory --with-ocr now has tr-pdf make every text layer.</w:t>
+      </w:r>
+      <w:r>
+        <w:rPr>
+          <w:rFonts w:ascii="Calibri" w:hAnsi="Calibri"/>
+          <w:color w:val="1A1A1A"/>
+          <w:sz w:val="21"/>
+        </w:rPr>
       </w:r>
     </w:p>
     <w:p>

</xml_diff>

<commit_message>
Manual 1.4 and runbook: English→German
How to set up an English→German project, which model each pair uses and
why, EuroLLM's measured speed and the caution about bare labels, prompt
versions derived from the prompt text, and the decisions register and
open items to match. Runbook regenerated from the kit.
</commit_message>
<xml_diff>
--- a/01-operating-manual.docx
+++ b/01-operating-manual.docx
@@ -32,7 +32,7 @@
           <w:sz w:val="18"/>
           <w:szCs w:val="18"/>
         </w:rPr>
-        <w:t>Version 1.3  ·  2026-08-02  ·  EN↔SL (DE later)  ·  hpelitebook8g1i16, Ubuntu 26.04</w:t>
+        <w:t>Version 1.4  ·  2026-09-10  ·  EN↔SL, EN↔DE  ·  hpelitebook8g1i16, Ubuntu 26.04</w:t>
       </w:r>
     </w:p>
     <w:p>
@@ -46,7 +46,7 @@
           <w:sz w:val="21"/>
           <w:szCs w:val="21"/>
         </w:rPr>
-        <w:t>This document consolidates and replaces the Hardware Assessment, Workflow Architecture, and Addenda 1 and 2. Version 1.3 revises it for the multi-project confidential layout, the encrypted container, and the Claude Code project location. Everything currently believed correct is here.</w:t>
+        <w:t>This document consolidates and replaces the Hardware Assessment, Workflow Architecture, and Addenda 1 and 2. Version 1.3 revises it for the multi-project confidential layout, the encrypted container, and the Claude Code project location; version 1.4 adds English↔German. Everything currently believed correct is here.</w:t>
       </w:r>
     </w:p>
     <w:p>
@@ -4574,7 +4574,21 @@
           <w:sz w:val="21"/>
           <w:szCs w:val="21"/>
         </w:rPr>
-        <w:t xml:space="preserve">The alias matters. Every script refers to gams3:q8, so switching models later is one tr-model invocation rather than an edit in eight places. It also pins num_ctx and temperature so behavior does not drift with an Ollama upgrade.</w:t>
+        <w:t>The alias matters. Scripts refer to models by alias, chosen by language pair in one table in lib/trlib.py — gams3:q8 for Slovene↔English, eurollm9b-2512:q8 for English↔German — so switching a model later is one tr-model invocation and one line in that table, rather than an edit in eight places. It also pins num_ctx and temperature so behavior does not drift with an Ollama upgrade.</w:t>
+      </w:r>
+    </w:p>
+    <w:p>
+      <w:pPr>
+        <w:spacing w:after="120" w:line="264"/>
+      </w:pPr>
+      <w:r>
+        <w:rPr>
+          <w:rFonts w:ascii="Calibri" w:cs="Calibri" w:eastAsia="Calibri" w:hAnsi="Calibri"/>
+          <w:color w:val="1A1A1A"/>
+          <w:sz w:val="21"/>
+          <w:szCs w:val="21"/>
+        </w:rPr>
+        <w:t>English↔German needs its own model, because German is absent from GaMS3's training. Register it only on a machine that will take such a matter: tr-model hf.co/mradermacher/EuroLLM-9B-Instruct-2512-GGUF:Q8_0 eurollm9b-2512:q8 (about 10 GB, once).</w:t>
       </w:r>
     </w:p>
     <w:p>
@@ -8983,7 +8997,7 @@
           <w:sz w:val="21"/>
           <w:szCs w:val="21"/>
         </w:rPr>
-        <w:t>A file is re-translated if its source is newer than its output, or if the existing output was produced by a different model or a superseded prompt. tr-run records which model and prompt version wrote each deliverable in work/deliverables.tsv and compares them on the next run, printing a redo line that names both. That condition was missing until it mattered: TR_PROMPT_VERSION is part of the memory's key, but tr-run skipped the whole file on mtime alone, before the memory was consulted, so a bump changed nothing. A prompt correction followed by a re-run reported three files skipped in three seconds and left the defective drafts in place. To force a redo, delete the output. To force a redo ignoring the memory, change TR_PROMPT_VERSION, which is part of the cache key:</w:t>
+        <w:t>A file is re-translated if its source is newer than its output, or if the existing output was produced by a different model or a superseded prompt. tr-run records which model and prompt version wrote each deliverable in work/deliverables.tsv and compares them on the next run, printing a redo line that names both. The prompt version is not typed by anyone: it is derived from the prompt text each language pair is actually sent, so editing prompts/translate.txt gives the pairs whose text changed a new version and leaves the others alone. The Slovene↔English text in use since v6 keeps that name. That condition was missing until it mattered: the prompt version is part of the memory's key, but tr-run skipped the whole file on mtime alone, before the memory was consulted, so a bump changed nothing. A prompt correction followed by a re-run reported three files skipped in three seconds and left the defective drafts in place. To force a redo, delete the output. To force a redo ignoring the memory, change TR_PROMPT_VERSION, which is part of the cache key:</w:t>
       </w:r>
     </w:p>
     <w:p>
@@ -12787,7 +12801,7 @@
                 <w:sz w:val="18"/>
                 <w:szCs w:val="18"/>
               </w:rPr>
-              <w:t>gams3:q8</w:t>
+              <w:t>(by language pair)</w:t>
             </w:r>
           </w:p>
         </w:tc>
@@ -12814,7 +12828,7 @@
                 <w:sz w:val="18"/>
                 <w:szCs w:val="18"/>
               </w:rPr>
-              <w:t>Model alias used by every script</w:t>
+              <w:t>Overrides the model chosen for the pair: gams3:q8 for sl↔en, eurollm9b-2512:q8 for en↔de, none for sl↔de. Set it in a project's project.conf, not in ~/.bashrc</w:t>
             </w:r>
           </w:p>
         </w:tc>
@@ -12897,7 +12911,7 @@
                 <w:sz w:val="18"/>
                 <w:szCs w:val="18"/>
               </w:rPr>
-              <w:t>Per-project, in project.conf. Use de for German</w:t>
+              <w:t>Per-project, in project.conf. Any two of sl, en, de</w:t>
             </w:r>
           </w:p>
         </w:tc>
@@ -13119,7 +13133,7 @@
                 <w:sz w:val="18"/>
                 <w:szCs w:val="18"/>
               </w:rPr>
-              <w:t>v6</w:t>
+              <w:t>(from the prompt text)</w:t>
             </w:r>
           </w:p>
         </w:tc>
@@ -13146,7 +13160,7 @@
                 <w:sz w:val="18"/>
                 <w:szCs w:val="18"/>
               </w:rPr>
-              <w:t>Part of the cache key. Bump to force retranslation</w:t>
+              <w:t>Override only. Derived per pair from the prompt text actually sent, so editing the prompt changes it; sl↔en is v6</w:t>
             </w:r>
           </w:p>
         </w:tc>
@@ -13229,7 +13243,7 @@
                 <w:sz w:val="18"/>
                 <w:szCs w:val="18"/>
               </w:rPr>
-              <w:t>Tesseract languages. Add deu for German</w:t>
+              <w:t>Tesseract languages of the source documents: eng for an English drop, deu for German</w:t>
             </w:r>
           </w:p>
         </w:tc>
@@ -14325,7 +14339,7 @@
           <w:sz w:val="21"/>
           <w:szCs w:val="21"/>
         </w:rPr>
-        <w:t xml:space="preserve">For a German matter, set the pair once in that project’s project.conf rather than on the command line, so every later run inherits it:</w:t>
+        <w:t>For an English→German matter, set the pair once in that project’s project.conf rather than on the command line, so every later run inherits it:</w:t>
       </w:r>
     </w:p>
     <w:p>
@@ -14383,7 +14397,7 @@
           <w:sz w:val="17"/>
           <w:szCs w:val="17"/>
         </w:rPr>
-        <w:t xml:space="preserve">berlin-2026</w:t>
+        <w:t>example-en-de</w:t>
       </w:r>
     </w:p>
     <w:p>
@@ -14422,7 +14436,7 @@
           <w:sz w:val="17"/>
           <w:szCs w:val="17"/>
         </w:rPr>
-        <w:t xml:space="preserve">~/translation-work/confidential-projects/berlin-2026/project.conf</w:t>
+        <w:t>~/translation-work/confidential-projects/example-en-de/project.conf</w:t>
       </w:r>
     </w:p>
     <w:p>
@@ -14478,7 +14492,7 @@
           <w:sz w:val="17"/>
           <w:szCs w:val="17"/>
         </w:rPr>
-        <w:t xml:space="preserve">de</w:t>
+        <w:t>en</w:t>
       </w:r>
     </w:p>
     <w:p>
@@ -14515,7 +14529,7 @@
           <w:sz w:val="17"/>
           <w:szCs w:val="17"/>
         </w:rPr>
-        <w:t xml:space="preserve">en</w:t>
+        <w:t>de</w:t>
       </w:r>
     </w:p>
     <w:p>
@@ -14553,7 +14567,7 @@
           <w:sz w:val="17"/>
           <w:szCs w:val="17"/>
         </w:rPr>
-        <w:t xml:space="preserve">deu+eng</w:t>
+        <w:t>eng</w:t>
       </w:r>
     </w:p>
     <w:p>
@@ -14567,7 +14581,21 @@
           <w:sz w:val="21"/>
           <w:szCs w:val="21"/>
         </w:rPr>
-        <w:t xml:space="preserve">German is high-resource and well served by base Gemma; GaMS3 continual pre-training on Slovene may have eroded it. Compare against gemma3:12b on a German sample before relying on GaMS3 for that pair.</w:t>
+        <w:t>Nothing else is set: the model follows the pair. GaMS3 translates Slovene↔English; EuroLLM-9B-Instruct-2512 (Q8_0) translates English↔German, because German is absent from every stage of GaMS3's training. tr-run names the model in its banner and refuses to start when it is not installed. Slovene↔German has no model chosen and refuses to translate.</w:t>
+      </w:r>
+    </w:p>
+    <w:p>
+      <w:pPr>
+        <w:spacing w:after="120" w:line="264"/>
+      </w:pPr>
+      <w:r>
+        <w:rPr>
+          <w:rFonts w:ascii="Calibri" w:cs="Calibri" w:eastAsia="Calibri" w:hAnsi="Calibri"/>
+          <w:color w:val="1A1A1A"/>
+          <w:sz w:val="21"/>
+          <w:szCs w:val="21"/>
+        </w:rPr>
+        <w:t>Measured on this machine with invented English legal text: about 10 seconds a segment over 42 requests, none failed, against 48 for GaMS3. Unlike GaMS3, most of that is generation, at 3 tokens a second, rather than reading the prompt, so batching short segments saves less. Two cautions from the same runs. A bare label is where the model invents: "Case number" once came back as a complete, fictitious German court reference. tr-lint reports that as a number not in the source, which is why its NUM findings come first. And no German draft has yet been reviewed by a translator.</w:t>
       </w:r>
     </w:p>
     <w:p>
@@ -14744,7 +14772,7 @@
                 <w:sz w:val="18"/>
                 <w:szCs w:val="18"/>
               </w:rPr>
-              <w:t xml:space="preserve">GaMS3-12B-Instruct</w:t>
+              <w:t>GaMS3-12B-Instruct for sl↔en; EuroLLM-9B-Instruct-2512 for en↔de</w:t>
             </w:r>
           </w:p>
         </w:tc>
@@ -14771,7 +14799,7 @@
                 <w:sz w:val="18"/>
                 <w:szCs w:val="18"/>
               </w:rPr>
-              <w:t xml:space="preserve">Slovene-specific; outperforms base Gemma 3 12B on EN→SL and rivals GPT-4o on the Slovene arena</w:t>
+              <w:t>GaMS3 is Slovene-specific; outperforms base Gemma 3 12B on EN→SL and rivals GPT-4o on the Slovene arena. German is absent from its training, so English↔German goes to EuroLLM, which covers every EU official language and has translation in its instruction tuning. The model is chosen by pair in trlib, so a German project cannot fall back to GaMS3 unnoticed</w:t>
             </w:r>
           </w:p>
         </w:tc>
@@ -16751,7 +16779,7 @@
                 <w:sz w:val="18"/>
                 <w:szCs w:val="18"/>
               </w:rPr>
-              <w:t>sl, en, de - all six directions</w:t>
+              <w:t>sl↔en and en↔de; sl↔de not yet</w:t>
             </w:r>
           </w:p>
         </w:tc>
@@ -16778,7 +16806,90 @@
                 <w:sz w:val="18"/>
                 <w:szCs w:val="18"/>
               </w:rPr>
-              <w:t>German is not needed yet but will be. Every one of the three can be source or target</w:t>
+              <w:t>Every one of the three can be source or target. Slovene↔German has no model chosen and refuses to translate: the model researched for it is not installed, and pivoting through English doubles the error</w:t>
+            </w:r>
+          </w:p>
+        </w:tc>
+      </w:tr>
+      <w:tr>
+        <w:tc>
+          <w:tcPr>
+            <w:tcW w:type="dxa" w:w="2500"/>
+            <w:tcMar>
+              <w:top w:type="dxa" w:w="60"/>
+              <w:left w:type="dxa" w:w="100"/>
+              <w:bottom w:type="dxa" w:w="60"/>
+              <w:right w:type="dxa" w:w="100"/>
+            </w:tcMar>
+          </w:tcPr>
+          <w:p>
+            <w:pPr>
+              <w:spacing w:after="0" w:line="240"/>
+            </w:pPr>
+            <w:r>
+              <w:rPr>
+                <w:rFonts w:ascii="Calibri" w:cs="Calibri" w:eastAsia="Calibri" w:hAnsi="Calibri"/>
+                <w:b w:val="false"/>
+                <w:bCs w:val="false"/>
+                <w:color w:val="1A1A1A"/>
+                <w:sz w:val="18"/>
+                <w:szCs w:val="18"/>
+              </w:rPr>
+              <w:t>Prompt version</w:t>
+            </w:r>
+          </w:p>
+        </w:tc>
+        <w:tc>
+          <w:tcPr>
+            <w:tcW w:type="dxa" w:w="2400"/>
+            <w:tcMar>
+              <w:top w:type="dxa" w:w="60"/>
+              <w:left w:type="dxa" w:w="100"/>
+              <w:bottom w:type="dxa" w:w="60"/>
+              <w:right w:type="dxa" w:w="100"/>
+            </w:tcMar>
+          </w:tcPr>
+          <w:p>
+            <w:pPr>
+              <w:spacing w:after="0" w:line="240"/>
+            </w:pPr>
+            <w:r>
+              <w:rPr>
+                <w:rFonts w:ascii="Calibri" w:cs="Calibri" w:eastAsia="Calibri" w:hAnsi="Calibri"/>
+                <w:b w:val="false"/>
+                <w:bCs w:val="false"/>
+                <w:color w:val="1A1A1A"/>
+                <w:sz w:val="18"/>
+                <w:szCs w:val="18"/>
+              </w:rPr>
+              <w:t>Derived from the prompt text</w:t>
+            </w:r>
+          </w:p>
+        </w:tc>
+        <w:tc>
+          <w:tcPr>
+            <w:tcW w:type="dxa" w:w="4460"/>
+            <w:tcMar>
+              <w:top w:type="dxa" w:w="60"/>
+              <w:left w:type="dxa" w:w="100"/>
+              <w:bottom w:type="dxa" w:w="60"/>
+              <w:right w:type="dxa" w:w="100"/>
+            </w:tcMar>
+          </w:tcPr>
+          <w:p>
+            <w:pPr>
+              <w:spacing w:after="0" w:line="240"/>
+            </w:pPr>
+            <w:r>
+              <w:rPr>
+                <w:rFonts w:ascii="Calibri" w:cs="Calibri" w:eastAsia="Calibri" w:hAnsi="Calibri"/>
+                <w:b w:val="false"/>
+                <w:bCs w:val="false"/>
+                <w:color w:val="1A1A1A"/>
+                <w:sz w:val="18"/>
+                <w:szCs w:val="18"/>
+              </w:rPr>
+              <w:t>A hand-bumped string invalidated every pair at once and could be forgotten. A hash of the text each pair is actually sent changes exactly when that text does. The two v6 texts keep the name v6, so existing memory stays valid</w:t>
             </w:r>
           </w:p>
         </w:tc>
@@ -16929,7 +17040,7 @@
           <w:sz w:val="21"/>
           <w:szCs w:val="21"/>
         </w:rPr>
-        <w:t xml:space="preserve">Verify German quality against base Gemma before extending to that pair (S12).</w:t>
+        <w:t>Have a translator review English→German drafts. EuroLLM is measured for speed and ran without a failed request, but no German output has been reviewed yet (S12).</w:t>
       </w:r>
     </w:p>
     <w:p>
@@ -17024,7 +17135,7 @@
           <w:sz w:val="21"/>
           <w:szCs w:val="21"/>
         </w:rPr>
-        <w:t>Extend the locale rules to German before that pair is used: it keeps the 24-hour clock and writes 5. Maerz 2024. Six directions are in scope across Slovene, English and German.</w:t>
+        <w:t>Locale conversion covers English→German only among the German pairs. Slovene↔German and German→English dates and amounts are left to the model, and Slovene↔German still needs a model chosen.</w:t>
       </w:r>
     </w:p>
     <w:sectPr>

</xml_diff>

<commit_message>
Manual and runbook: reference translations
Section 4.4 rewritten from a plan into how tr-ref works: where the files
go, which formats pair, what is kept and what is never reused, and what the
test documents showed. Decisions register and open items to match; runbook
regenerated from the kit.
</commit_message>
<xml_diff>
--- a/01-operating-manual.docx
+++ b/01-operating-manual.docx
@@ -6174,7 +6174,7 @@
           <w:sz w:val="24"/>
           <w:szCs w:val="24"/>
         </w:rPr>
-        <w:t>4.4 Seed the memory with the translator’s prior work</w:t>
+        <w:t>4.4 Reuse the translator’s prior work</w:t>
       </w:r>
     </w:p>
     <w:p>
@@ -6188,7 +6188,49 @@
           <w:sz w:val="21"/>
           <w:szCs w:val="21"/>
         </w:rPr>
-        <w:t xml:space="preserve">The metric is edits this particular translator makes. If any prior EN↔SL legal translations exist, aligning them into the memory means drafts arrive already using their established renderings and register. A draft that matches their habits produces fewer corrections than an objectively similar draft that does not. This is probably the single highest-value input available and costs one conversation plus an alignment pass.</w:t>
+        <w:t>The metric is edits this particular translator makes. A draft that matches their established renderings and register produces fewer corrections than an objectively similar draft that does not, so earlier translations are probably the single highest-value input available.</w:t>
+      </w:r>
+    </w:p>
+    <w:p>
+      <w:pPr>
+        <w:spacing w:after="120" w:line="264"/>
+      </w:pPr>
+      <w:r>
+        <w:rPr>
+          <w:rFonts w:ascii="Calibri" w:cs="Calibri" w:eastAsia="Calibri" w:hAnsi="Calibri"/>
+          <w:color w:val="1A1A1A"/>
+          <w:sz w:val="21"/>
+          <w:szCs w:val="21"/>
+        </w:rPr>
+        <w:t>They go in the project’s reference/ folder, one language a side, paired by path: reference/en/leases/lease-2023.docx beside reference/de/leases/lease-2023.pdf. Each side may be Word, PDF with a text layer, scanned PDF or plain text, whatever the other side is. tr-ref lines each pair up sentence by sentence without a model — by length, with the numbers both sides share as anchors — and keeps only one-to-one pairs whose numbers agree; a sentence with no number is kept only where its neighbours lined up one-to-one too. tr-run then gives an identical source sentence the translator’s rendering instead of a draft, and tr-terms --reference proposes the glossary from those renderings.</w:t>
+      </w:r>
+    </w:p>
+    <w:p>
+      <w:pPr>
+        <w:spacing w:after="120" w:line="264"/>
+      </w:pPr>
+      <w:r>
+        <w:rPr>
+          <w:rFonts w:ascii="Calibri" w:cs="Calibri" w:eastAsia="Calibri" w:hAnsi="Calibri"/>
+          <w:color w:val="1A1A1A"/>
+          <w:sz w:val="21"/>
+          <w:szCs w:val="21"/>
+        </w:rPr>
+        <w:t>Everything kept is listed in work/reference/pairs.tsv, to be read before the first run, because every line there can reach a deliverable word for word. Two kinds are never reused: a sentence the references translate differently (tr-ref --conflicts), and a translation read by OCR, whose misreadings would pass straight into the output — those count for terminology only. References stay in their project: memory never crosses matters, and a reference is a client’s document.</w:t>
+      </w:r>
+    </w:p>
+    <w:p>
+      <w:pPr>
+        <w:spacing w:after="120" w:line="264"/>
+      </w:pPr>
+      <w:r>
+        <w:rPr>
+          <w:rFonts w:ascii="Calibri" w:cs="Calibri" w:eastAsia="Calibri" w:hAnsi="Calibri"/>
+          <w:color w:val="1A1A1A"/>
+          <w:sz w:val="21"/>
+          <w:szCs w:val="21"/>
+        </w:rPr>
+        <w:t>On invented test documents a Word pair kept 12 of 14 sentence pairs and a Word-to-PDF pair 4 of 6; the rest were rejected rather than guessed. A reused sentence is not checked by tr-lint: it is the translator’s own work, and it never enters the translation memory. Harvesting terminology from references needs volume — on seventeen pairs tr-terms --reference proposes mostly noise.</w:t>
       </w:r>
     </w:p>
     <w:p>
@@ -16894,6 +16936,89 @@
           </w:p>
         </w:tc>
       </w:tr>
+      <w:tr>
+        <w:tc>
+          <w:tcPr>
+            <w:tcW w:type="dxa" w:w="2500"/>
+            <w:tcMar>
+              <w:top w:type="dxa" w:w="60"/>
+              <w:left w:type="dxa" w:w="100"/>
+              <w:bottom w:type="dxa" w:w="60"/>
+              <w:right w:type="dxa" w:w="100"/>
+            </w:tcMar>
+          </w:tcPr>
+          <w:p>
+            <w:pPr>
+              <w:spacing w:after="0" w:line="240"/>
+            </w:pPr>
+            <w:r>
+              <w:rPr>
+                <w:rFonts w:ascii="Calibri" w:cs="Calibri" w:eastAsia="Calibri" w:hAnsi="Calibri"/>
+                <w:b w:val="false"/>
+                <w:bCs w:val="false"/>
+                <w:color w:val="1A1A1A"/>
+                <w:sz w:val="18"/>
+                <w:szCs w:val="18"/>
+              </w:rPr>
+              <w:t>Reference translations</w:t>
+            </w:r>
+          </w:p>
+        </w:tc>
+        <w:tc>
+          <w:tcPr>
+            <w:tcW w:type="dxa" w:w="2400"/>
+            <w:tcMar>
+              <w:top w:type="dxa" w:w="60"/>
+              <w:left w:type="dxa" w:w="100"/>
+              <w:bottom w:type="dxa" w:w="60"/>
+              <w:right w:type="dxa" w:w="100"/>
+            </w:tcMar>
+          </w:tcPr>
+          <w:p>
+            <w:pPr>
+              <w:spacing w:after="0" w:line="240"/>
+            </w:pPr>
+            <w:r>
+              <w:rPr>
+                <w:rFonts w:ascii="Calibri" w:cs="Calibri" w:eastAsia="Calibri" w:hAnsi="Calibri"/>
+                <w:b w:val="false"/>
+                <w:bCs w:val="false"/>
+                <w:color w:val="1A1A1A"/>
+                <w:sz w:val="18"/>
+                <w:szCs w:val="18"/>
+              </w:rPr>
+              <w:t>Reused when identical and agreed</w:t>
+            </w:r>
+          </w:p>
+        </w:tc>
+        <w:tc>
+          <w:tcPr>
+            <w:tcW w:type="dxa" w:w="4460"/>
+            <w:tcMar>
+              <w:top w:type="dxa" w:w="60"/>
+              <w:left w:type="dxa" w:w="100"/>
+              <w:bottom w:type="dxa" w:w="60"/>
+              <w:right w:type="dxa" w:w="100"/>
+            </w:tcMar>
+          </w:tcPr>
+          <w:p>
+            <w:pPr>
+              <w:spacing w:after="0" w:line="240"/>
+            </w:pPr>
+            <w:r>
+              <w:rPr>
+                <w:rFonts w:ascii="Calibri" w:cs="Calibri" w:eastAsia="Calibri" w:hAnsi="Calibri"/>
+                <w:b w:val="false"/>
+                <w:bCs w:val="false"/>
+                <w:color w:val="1A1A1A"/>
+                <w:sz w:val="18"/>
+                <w:szCs w:val="18"/>
+              </w:rPr>
+              <w:t>An identical source sentence takes the translator's own rendering with no model call. Only one-to-one pairs whose numbers agree are kept; disagreeing references and OCR-read translations are never reused verbatim. They stay in their project, because memory never crosses matters</w:t>
+            </w:r>
+          </w:p>
+        </w:tc>
+      </w:tr>
     </w:tbl>
     <w:p>
       <w:pPr>
@@ -17021,7 +17146,7 @@
           <w:sz w:val="21"/>
           <w:szCs w:val="21"/>
         </w:rPr>
-        <w:t>Seed the memory from the translator’s prior work if any exists (S4.4).</w:t>
+        <w:t>Measure reference reuse on a real matter: how many source sentences are reused, and how often pairs.tsv needs correcting (S4.4).</w:t>
       </w:r>
     </w:p>
     <w:p>

</xml_diff>

<commit_message>
Manual: replies that invent text or numbers
The lint table gains LONG, and the English→German section says what
tr-run now does with a reply far longer than its source or carrying a
number the source lacks, and what the retry achieved on eight labels.
</commit_message>
<xml_diff>
--- a/01-operating-manual.docx
+++ b/01-operating-manual.docx
@@ -9425,6 +9425,64 @@
         <w:tc>
           <w:tcPr>
             <w:tcW w:type="dxa" w:w="1200"/>
+            <w:shd w:fill="FAF7F3" w:val="clear"/>
+            <w:tcMar>
+              <w:top w:type="dxa" w:w="60"/>
+              <w:left w:type="dxa" w:w="100"/>
+              <w:bottom w:type="dxa" w:w="60"/>
+              <w:right w:type="dxa" w:w="100"/>
+            </w:tcMar>
+          </w:tcPr>
+          <w:p>
+            <w:pPr>
+              <w:spacing w:after="0" w:line="240"/>
+            </w:pPr>
+            <w:r>
+              <w:rPr>
+                <w:rFonts w:ascii="Consolas" w:cs="Consolas" w:eastAsia="Consolas" w:hAnsi="Consolas"/>
+                <w:b w:val="false"/>
+                <w:bCs w:val="false"/>
+                <w:color w:val="1A1A1A"/>
+                <w:sz w:val="17"/>
+                <w:szCs w:val="17"/>
+              </w:rPr>
+              <w:t>LONG</w:t>
+            </w:r>
+          </w:p>
+        </w:tc>
+        <w:tc>
+          <w:tcPr>
+            <w:tcW w:type="dxa" w:w="8160"/>
+            <w:shd w:fill="FAF7F3" w:val="clear"/>
+            <w:tcMar>
+              <w:top w:type="dxa" w:w="60"/>
+              <w:left w:type="dxa" w:w="100"/>
+              <w:bottom w:type="dxa" w:w="60"/>
+              <w:right w:type="dxa" w:w="100"/>
+            </w:tcMar>
+          </w:tcPr>
+          <w:p>
+            <w:pPr>
+              <w:spacing w:after="0" w:line="240"/>
+            </w:pPr>
+            <w:r>
+              <w:rPr>
+                <w:rFonts w:ascii="Calibri" w:cs="Calibri" w:eastAsia="Calibri" w:hAnsi="Calibri"/>
+                <w:b w:val="false"/>
+                <w:bCs w:val="false"/>
+                <w:color w:val="1A1A1A"/>
+                <w:sz w:val="18"/>
+                <w:szCs w:val="18"/>
+              </w:rPr>
+              <w:t>The target is far longer than the source, or runs to several lines where the source is one: text the model added. On a bare heading that can be a whole invented paragraph. tr-run refuses such replies; this finds any already in a memory</w:t>
+            </w:r>
+          </w:p>
+        </w:tc>
+      </w:tr>
+      <w:tr>
+        <w:tc>
+          <w:tcPr>
+            <w:tcW w:type="dxa" w:w="1200"/>
             <w:tcMar>
               <w:top w:type="dxa" w:w="60"/>
               <w:left w:type="dxa" w:w="100"/>
@@ -14637,7 +14695,7 @@
           <w:sz w:val="21"/>
           <w:szCs w:val="21"/>
         </w:rPr>
-        <w:t>Measured on this machine with invented English legal text: about 10 seconds a segment over 42 requests, none failed, against 48 for GaMS3. Unlike GaMS3, most of that is generation, at 3 tokens a second, rather than reading the prompt, so batching short segments saves less. Two cautions from the same runs. A bare label is where the model invents: "Case number" once came back as a complete, fictitious German court reference. tr-lint reports that as a number not in the source, which is why its NUM findings come first. And no German draft has yet been reviewed by a translator.</w:t>
+        <w:t>Measured on this machine with invented English legal text: about 10 seconds a segment over 42 requests, none failed, against 48 for GaMS3. Unlike GaMS3, most of that is generation, at 3 tokens a second, rather than reading the prompt, so batching short segments saves less. Two cautions from the same runs. A bare label or heading is where the model invents: "Case number" came back as a fictitious German court reference, and the heading STATEMENT as a whole invented declaration. tr-run gives such a reply one firmer retry — a reply far longer than its source, or one carrying a number the source does not have. A reply still far too long after it is written as [TRANSLATION FAILED]; one still carrying an extra number is kept and reported by tr-lint as NUM, because "dva tedna" rendered as "2 weeks" adds a digit without adding anything false. Over eight number-prone labels, three replies invented something and none did after the retry. And no German draft has yet been reviewed by a translator.</w:t>
       </w:r>
     </w:p>
     <w:p>

</xml_diff>

<commit_message>
Manual and runbook: German target variants
Section 4.4 describes reference files marked with a variant -- _German-CH,
_German-AT, and _German or _German-DE for Germany -- and that a German
translation is reused only in a project of its variant. The English→German
setup in section 12 says that de-DE means de, and that de-AT and de-CH are
recognised but not yet drafted into. The decisions register records German
variants, and the open items in the manual and README add Swiss German
drafting. Environment table and runbook regenerated from the kit.
</commit_message>
<xml_diff>
--- a/01-operating-manual.docx
+++ b/01-operating-manual.docx
@@ -6203,6 +6203,20 @@
           <w:szCs w:val="21"/>
         </w:rPr>
         <w:t>They go anywhere in the project’s reference/ folder, both files of a pair in the same folder and named alike apart from a language suffix: lease-2023_English.docx beside lease-2023_German.pdf. The suffix names a language, not a role, so the same pair serves English→German and German→English work. Each side may be Word, PDF with a text layer, scanned PDF or plain text, whatever the other side is; a file without a suffix is listed and skipped rather than guessed. tr-ref lines each pair up sentence by sentence without a model — by length, with the numbers both sides share as anchors — and keeps only one-to-one pairs whose numbers agree; a sentence with no number is kept only where its neighbours lined up one-to-one too. tr-run then gives an identical source sentence the translator’s rendering instead of a draft, and tr-terms --reference proposes the glossary from those renderings.</w:t>
+      </w:r>
+    </w:p>
+    <w:p>
+      <w:pPr>
+        <w:spacing w:after="120" w:line="264"/>
+      </w:pPr>
+      <w:r>
+        <w:rPr>
+          <w:rFonts w:ascii="Calibri" w:cs="Calibri" w:eastAsia="Calibri" w:hAnsi="Calibri"/>
+          <w:color w:val="1A1A1A"/>
+          <w:sz w:val="21"/>
+          <w:szCs w:val="21"/>
+        </w:rPr>
+        <w:t>German takes a variant after a hyphen: lease-2023_German-CH.pdf is Swiss German, _German-AT Austrian, and _German or _German-DE Germany. One English original beside a Germany and a Swiss translation makes two pairs. A German translation is reused only in a project whose TR_TGT is its variant; one in another variant is lined up and listed in pairs.tsv as not reused, and tr-terms --reference leaves it out, since a Germany translation would propose Straße to a Swiss glossary. A German→English project reuses a pair whatever German its source is written in.</w:t>
       </w:r>
     </w:p>
     <w:p>
@@ -13011,7 +13025,7 @@
                 <w:sz w:val="18"/>
                 <w:szCs w:val="18"/>
               </w:rPr>
-              <w:t>Per-project, in project.conf. Any two of sl, en, de</w:t>
+              <w:t>Per-project, in project.conf. Any two of sl, en, de. TR_TGT may name a German variant: de-DE (the same as de), de-AT or de-CH. tr-ref and tr-terms read the last two; drafting into them is refused until their conventions are built</w:t>
             </w:r>
           </w:p>
         </w:tc>
@@ -14682,6 +14696,20 @@
           <w:szCs w:val="21"/>
         </w:rPr>
         <w:t>Nothing else is set: the model follows the pair. GaMS3 translates Slovene↔English; EuroLLM-9B-Instruct-2512 (Q8_0) translates English↔German, because German is absent from every stage of GaMS3's training. tr-run names the model in its banner and refuses to start when it is not installed. Slovene↔German has no model chosen and refuses to translate.</w:t>
+      </w:r>
+    </w:p>
+    <w:p>
+      <w:pPr>
+        <w:spacing w:after="120" w:line="264"/>
+      </w:pPr>
+      <w:r>
+        <w:rPr>
+          <w:rFonts w:ascii="Calibri" w:cs="Calibri" w:eastAsia="Calibri" w:hAnsi="Calibri"/>
+          <w:color w:val="1A1A1A"/>
+          <w:sz w:val="21"/>
+          <w:szCs w:val="21"/>
+        </w:rPr>
+        <w:t>TR_TGT=de is German as written in Germany, and de-DE means the same, so a project may use either without touching its translation memory. de-AT and de-CH are recognised: tr-ref files reference translations in them and tr-terms --reference reads them. tr-run and the workers refuse to draft into them, because the prompt and the conversion of dates, amounts and times follow Germany, and a Swiss draft made by those rules would read as finished. TR_SRC takes no variant; a Swiss German source is de.</w:t>
       </w:r>
     </w:p>
     <w:p>
@@ -17077,6 +17105,89 @@
           </w:p>
         </w:tc>
       </w:tr>
+      <w:tr>
+        <w:tc>
+          <w:tcPr>
+            <w:tcW w:type="dxa" w:w="2500"/>
+            <w:tcMar>
+              <w:top w:type="dxa" w:w="60"/>
+              <w:left w:type="dxa" w:w="100"/>
+              <w:bottom w:type="dxa" w:w="60"/>
+              <w:right w:type="dxa" w:w="100"/>
+            </w:tcMar>
+          </w:tcPr>
+          <w:p>
+            <w:pPr>
+              <w:spacing w:after="0" w:line="240"/>
+            </w:pPr>
+            <w:r>
+              <w:rPr>
+                <w:rFonts w:ascii="Calibri" w:cs="Calibri" w:eastAsia="Calibri" w:hAnsi="Calibri"/>
+                <w:b w:val="false"/>
+                <w:bCs w:val="false"/>
+                <w:color w:val="1A1A1A"/>
+                <w:sz w:val="18"/>
+                <w:szCs w:val="18"/>
+              </w:rPr>
+              <w:t>German variants</w:t>
+            </w:r>
+          </w:p>
+        </w:tc>
+        <w:tc>
+          <w:tcPr>
+            <w:tcW w:type="dxa" w:w="2400"/>
+            <w:tcMar>
+              <w:top w:type="dxa" w:w="60"/>
+              <w:left w:type="dxa" w:w="100"/>
+              <w:bottom w:type="dxa" w:w="60"/>
+              <w:right w:type="dxa" w:w="100"/>
+            </w:tcMar>
+          </w:tcPr>
+          <w:p>
+            <w:pPr>
+              <w:spacing w:after="0" w:line="240"/>
+            </w:pPr>
+            <w:r>
+              <w:rPr>
+                <w:rFonts w:ascii="Calibri" w:cs="Calibri" w:eastAsia="Calibri" w:hAnsi="Calibri"/>
+                <w:b w:val="false"/>
+                <w:bCs w:val="false"/>
+                <w:color w:val="1A1A1A"/>
+                <w:sz w:val="18"/>
+                <w:szCs w:val="18"/>
+              </w:rPr>
+              <w:t>A target setting; plain de is Germany</w:t>
+            </w:r>
+          </w:p>
+        </w:tc>
+        <w:tc>
+          <w:tcPr>
+            <w:tcW w:type="dxa" w:w="4460"/>
+            <w:tcMar>
+              <w:top w:type="dxa" w:w="60"/>
+              <w:left w:type="dxa" w:w="100"/>
+              <w:bottom w:type="dxa" w:w="60"/>
+              <w:right w:type="dxa" w:w="100"/>
+            </w:tcMar>
+          </w:tcPr>
+          <w:p>
+            <w:pPr>
+              <w:spacing w:after="0" w:line="240"/>
+            </w:pPr>
+            <w:r>
+              <w:rPr>
+                <w:rFonts w:ascii="Calibri" w:cs="Calibri" w:eastAsia="Calibri" w:hAnsi="Calibri"/>
+                <w:b w:val="false"/>
+                <w:bCs w:val="false"/>
+                <w:color w:val="1A1A1A"/>
+                <w:sz w:val="18"/>
+                <w:szCs w:val="18"/>
+              </w:rPr>
+              <w:t>TR_TGT names de-DE, de-AT or de-CH, and de-DE is read as de, so a Germany project keeps its memory however the target is spelled. Swiss and Austrian drafts are refused until their conventions are built, rather than written by Germany's. A reference translation is reused only in its own variant, because renderings in two variants differ as a matter of course</w:t>
+            </w:r>
+          </w:p>
+        </w:tc>
+      </w:tr>
     </w:tbl>
     <w:p>
       <w:pPr>
@@ -17319,6 +17430,25 @@
           <w:szCs w:val="21"/>
         </w:rPr>
         <w:t>Locale conversion covers English→German only among the German pairs. Slovene↔German and German→English dates and amounts are left to the model, and Slovene↔German still needs a model chosen.</w:t>
+      </w:r>
+    </w:p>
+    <w:p>
+      <w:pPr>
+        <w:pStyle w:val="ListParagraph"/>
+        <w:numPr>
+          <w:ilvl w:val="0"/>
+          <w:numId w:val="2"/>
+        </w:numPr>
+        <w:spacing w:after="70" w:line="264"/>
+      </w:pPr>
+      <w:r>
+        <w:rPr>
+          <w:rFonts w:ascii="Calibri" w:cs="Calibri" w:eastAsia="Calibri" w:hAnsi="Calibri"/>
+          <w:color w:val="1A1A1A"/>
+          <w:sz w:val="21"/>
+          <w:szCs w:val="21"/>
+        </w:rPr>
+        <w:t>Build Swiss German drafting (S12). de-CH is recognised but refused: Swiss amounts, times and ß differ from Germany's in ways a deliverable shows, and the prompt, the date and amount conversion and the number checks all follow Germany. de-AT has no conventions settled yet.</w:t>
       </w:r>
     </w:p>
     <w:sectPr>

</xml_diff>

<commit_message>
Manual and runbook: REF_OPTIONS for disagreeing references
Section 4.4 describes what the draft carries where reference translations
disagree: REF_OPTIONS with the two leading renderings, ordered by document
count, then by the file's own saved date, with a pinned glossary term
first; OCR-read translations, and another variant's where the project's own
has none, offered tagged. pairs.tsv marks lines yes, option or no. The
decisions register's reference-translations row says the same. Runbook
regenerated from the kit.
</commit_message>
<xml_diff>
--- a/01-operating-manual.docx
+++ b/01-operating-manual.docx
@@ -6216,7 +6216,7 @@
           <w:sz w:val="21"/>
           <w:szCs w:val="21"/>
         </w:rPr>
-        <w:t>German takes a variant after a hyphen: lease-2023_German-CH.pdf is Swiss German, _German-AT Austrian, and _German or _German-DE Germany. One English original beside a Germany and a Swiss translation makes two pairs. A German translation is reused only in a project whose TR_TGT is its variant; one in another variant is lined up and listed in pairs.tsv as not reused, and tr-terms --reference leaves it out, since a Germany translation would propose Straße to a Swiss glossary. A German→English project reuses a pair whatever German its source is written in.</w:t>
+        <w:t>German takes a variant after a hyphen: lease-2023_German-CH.pdf is Swiss German, _German-AT Austrian, and _German or _German-DE Germany. One English original beside a Germany and a Swiss translation makes two pairs. A German translation is reused only in a project whose TR_TGT is its variant. One in another variant is never reused: where the project's own variant has no reference for a sentence it is offered as REF_OPTIONS, tagged with its variant, and tr-terms --reference leaves it out, since a Germany translation would propose Straße to a Swiss glossary. A German→English project reuses a pair whatever German its source is written in.</w:t>
       </w:r>
     </w:p>
     <w:p>
@@ -6230,7 +6230,7 @@
           <w:sz w:val="21"/>
           <w:szCs w:val="21"/>
         </w:rPr>
-        <w:t>Everything kept is listed in work/reference/pairs.tsv, to be read before the first run, because every line there can reach a deliverable word for word. Two kinds are never reused: a sentence the references translate differently (tr-ref --conflicts), and a translation read by OCR, whose misreadings would pass straight into the output — those count for terminology only. References stay in their project: memory never crosses matters, and a reference is a client’s document.</w:t>
+        <w:t>Everything kept is listed in work/reference/pairs.tsv, to be read before the first run, because every line there marked yes or option can reach a deliverable word for word. Where the references render a sentence more than one way, the draft carries the choice instead of a model draft: REF_OPTIONS «first» | «second», for the translator to keep one and delete the rest. The rendering found in the most documents comes first, counted once per document; a tie goes to the newest by the date the file itself records as last saved, because a copied file's date on disk is the day it was copied; and a pinned glossary term found in only one rendering puts that one first. The draft carries two; tr-ref --conflicts lists every rendering with its count and the date that ordered it. A translation read by OCR is offered the same way, tagged (OCR), and never reused on its own, since its misreadings would pass straight into the output. References stay in their project: memory never crosses matters, and a reference is a client’s document.</w:t>
       </w:r>
     </w:p>
     <w:p>
@@ -17073,7 +17073,7 @@
                 <w:sz w:val="18"/>
                 <w:szCs w:val="18"/>
               </w:rPr>
-              <w:t>Reused when identical and agreed</w:t>
+              <w:t>Reused when identical and agreed; otherwise offered</w:t>
             </w:r>
           </w:p>
         </w:tc>
@@ -17100,7 +17100,7 @@
                 <w:sz w:val="18"/>
                 <w:szCs w:val="18"/>
               </w:rPr>
-              <w:t>An identical source sentence takes the translator's own rendering with no model call. Only one-to-one pairs whose numbers agree are kept; disagreeing references and OCR-read translations are never reused verbatim. They stay in their project, because memory never crosses matters</w:t>
+              <w:t>An identical source sentence takes the translator's own rendering with no model call. Only one-to-one pairs whose numbers agree are kept. Where references disagree, the draft carries REF_OPTIONS with the two leading renderings — most documents first, then the newest by the file's own saved date, a pinned glossary term ahead of both — because choosing between human renderings is the translator's decision. OCR-read translations, and another variant's where the project's own has none, are offered tagged and never reused on their own. They stay in their project, because memory never crosses matters</w:t>
             </w:r>
           </w:p>
         </w:tc>

</xml_diff>

<commit_message>
Manual and runbook: Swiss German drafting
TR_TGT=de-CH now drafts Swiss German, so the English→German setup in
section 12 describes the Swiss Federal Chancellery rules the kit applies:
a decimal comma, non-breaking thousands from five digits, a decimal point
and the code first only beside a currency, Fr. 20.– for whole francs,
14.30 times, and ss for ß except in words the source has. de-AT stays
refused. Section 4.4 gives the REF_OPTIONS delimiter as [[…]] and says a
Germany rendering offered to a Swiss project is spelled ss. The German
variants decision row and the open items, in the manual and README,
follow: Austrian conventions, the source of the ß→ss rule and a
translator's review of Swiss drafts remain open. Environment table and
runbook regenerated from the kit.
</commit_message>
<xml_diff>
--- a/01-operating-manual.docx
+++ b/01-operating-manual.docx
@@ -6216,7 +6216,7 @@
           <w:sz w:val="21"/>
           <w:szCs w:val="21"/>
         </w:rPr>
-        <w:t>German takes a variant after a hyphen: lease-2023_German-CH.pdf is Swiss German, _German-AT Austrian, and _German or _German-DE Germany. One English original beside a Germany and a Swiss translation makes two pairs. A German translation is reused only in a project whose TR_TGT is its variant. One in another variant is never reused: where the project's own variant has no reference for a sentence it is offered as REF_OPTIONS, tagged with its variant, and tr-terms --reference leaves it out, since a Germany translation would propose Straße to a Swiss glossary. A German→English project reuses a pair whatever German its source is written in.</w:t>
+        <w:t>German takes a variant after a hyphen: lease-2023_German-CH.pdf is Swiss German, _German-AT Austrian, and _German or _German-DE Germany. One English original beside a Germany and a Swiss translation makes two pairs. A German translation is reused only in a project whose TR_TGT is its variant. One in another variant is never reused: where the project's own variant has no reference for a sentence it is offered as REF_OPTIONS, tagged with its variant — and a Germany rendering offered to a Swiss project is spelled ss for ß first — and tr-terms --reference leaves it out, since a Germany translation would propose Straße to a Swiss glossary. A German→English project reuses a pair whatever German its source is written in.</w:t>
       </w:r>
     </w:p>
     <w:p>
@@ -6230,7 +6230,7 @@
           <w:sz w:val="21"/>
           <w:szCs w:val="21"/>
         </w:rPr>
-        <w:t>Everything kept is listed in work/reference/pairs.tsv, to be read before the first run, because every line there marked yes or option can reach a deliverable word for word. Where the references render a sentence more than one way, the draft carries the choice instead of a model draft: REF_OPTIONS «first» | «second», for the translator to keep one and delete the rest. The rendering found in the most documents comes first, counted once per document; a tie goes to the newest by the date the file itself records as last saved, because a copied file's date on disk is the day it was copied; and a pinned glossary term found in only one rendering puts that one first. The draft carries two; tr-ref --conflicts lists every rendering with its count and the date that ordered it. A translation read by OCR is offered the same way, tagged (OCR), and never reused on its own, since its misreadings would pass straight into the output. References stay in their project: memory never crosses matters, and a reference is a client’s document.</w:t>
+        <w:t>Everything kept is listed in work/reference/pairs.tsv, to be read before the first run, because every line there marked yes or option can reach a deliverable word for word. Where the references render a sentence more than one way, the draft carries the choice instead of a model draft: REF_OPTIONS [[first]] | [[second]], for the translator to keep one and delete the rest — double square brackets, because Swiss German writes its quotation marks «…». The rendering found in the most documents comes first, counted once per document; a tie goes to the newest by the date the file itself records as last saved, because a copied file's date on disk is the day it was copied; and a pinned glossary term found in only one rendering puts that one first. The draft carries two; tr-ref --conflicts lists every rendering with its count and the date that ordered it. A translation read by OCR is offered the same way, tagged (OCR), and never reused on its own, since its misreadings would pass straight into the output. References stay in their project: memory never crosses matters, and a reference is a client’s document.</w:t>
       </w:r>
     </w:p>
     <w:p>
@@ -13025,7 +13025,7 @@
                 <w:sz w:val="18"/>
                 <w:szCs w:val="18"/>
               </w:rPr>
-              <w:t>Per-project, in project.conf. Any two of sl, en, de. TR_TGT may name a German variant: de-DE (the same as de), de-AT or de-CH. tr-ref and tr-terms read the last two; drafting into them is refused until their conventions are built</w:t>
+              <w:t>Per-project, in project.conf. Any two of sl, en, de. TR_TGT may name a German variant: de-DE (the same as de); de-CH, drafted by the Swiss Federal Chancellery's rules; or de-AT, which tr-ref and tr-terms read but drafting refuses until its conventions are settled</w:t>
             </w:r>
           </w:p>
         </w:tc>
@@ -14709,7 +14709,7 @@
           <w:sz w:val="21"/>
           <w:szCs w:val="21"/>
         </w:rPr>
-        <w:t>TR_TGT=de is German as written in Germany, and de-DE means the same, so a project may use either without touching its translation memory. de-AT and de-CH are recognised: tr-ref files reference translations in them and tr-terms --reference reads them. tr-run and the workers refuse to draft into them, because the prompt and the conversion of dates, amounts and times follow Germany, and a Swiss draft made by those rules would read as finished. TR_SRC takes no variant; a Swiss German source is de.</w:t>
+        <w:t>TR_TGT=de is German as written in Germany, and de-DE means the same, so a project may use either without touching its translation memory. TR_TGT=de-CH drafts Swiss German by the Swiss Federal Chancellery's Schreibweisungen: a decimal comma, with thousands from five digits separated by a non-breaking space (12 450,00; 1250 stays whole); a decimal point only beside a currency, the code first (CHF 1250.50, EUR 12 450.00), and whole francs as Fr. 20.–; times as 14.30 and 9.05; dates as in Germany; and ss for ß, except in a word the source has too, such as a name or an address. The prompt carries these rules, and the kit applies them itself to values standing alone, to amounts the model left in English form, and to spelling. A number counts as money only beside a currency, because a converter cannot see the column it stands in. de-AT is recognised — tr-ref files references in it and tr-terms --reference reads them — but drafting into it is refused until its conventions are settled. TR_SRC takes no variant; a Swiss German source is de.</w:t>
       </w:r>
     </w:p>
     <w:p>
@@ -17183,7 +17183,7 @@
                 <w:sz w:val="18"/>
                 <w:szCs w:val="18"/>
               </w:rPr>
-              <w:t>TR_TGT names de-DE, de-AT or de-CH, and de-DE is read as de, so a Germany project keeps its memory however the target is spelled. Swiss and Austrian drafts are refused until their conventions are built, rather than written by Germany's. A reference translation is reused only in its own variant, because renderings in two variants differ as a matter of course</w:t>
+              <w:t>TR_TGT names de-DE, de-AT or de-CH, and de-DE is read as de, so a Germany project keeps its memory however the target is spelled. Swiss drafts follow the Swiss Federal Chancellery: a number counts as money, with a decimal point, only beside a currency, because a converter cannot see the column it stands in; and ß becomes ss except in a word the source has too, so names and addresses stay as written. Austrian drafts are refused until their conventions are settled, rather than written by Germany's. A reference translation is reused only in its own variant, because renderings in two variants differ as a matter of course</w:t>
             </w:r>
           </w:p>
         </w:tc>
@@ -17429,7 +17429,7 @@
           <w:sz w:val="21"/>
           <w:szCs w:val="21"/>
         </w:rPr>
-        <w:t>Locale conversion covers English→German only among the German pairs. Slovene↔German and German→English dates and amounts are left to the model, and Slovene↔German still needs a model chosen.</w:t>
+        <w:t>Locale conversion covers English→German and English→Swiss German only among the German pairs. Slovene↔German and German→English dates and amounts are left to the model, and Slovene↔German still needs a model chosen.</w:t>
       </w:r>
     </w:p>
     <w:p>
@@ -17448,7 +17448,7 @@
           <w:sz w:val="21"/>
           <w:szCs w:val="21"/>
         </w:rPr>
-        <w:t>Build Swiss German drafting (S12). de-CH is recognised but refused: Swiss amounts, times and ß differ from Germany's in ways a deliverable shows, and the prompt, the date and amount conversion and the number checks all follow Germany. de-AT has no conventions settled yet.</w:t>
+        <w:t>Settle Austrian German conventions before de-AT can be drafted (S12); it is refused until then. Confirm the Swiss ß→ss rule against the Swiss Federal Chancellery's own spelling guidance, which could not be reached; the rule rests on secondary sources. No Swiss German draft has yet been reviewed by a translator.</w:t>
       </w:r>
     </w:p>
     <w:sectPr>

</xml_diff>

<commit_message>
Manual and runbook: audit fixes to references, numbers and names
Section 2 says what happens when two files in one folder would deliver
under one name. Section 4.4 says numbers confirm a reference's alignment
and a sentence nothing confirms is offered as REF_OPTIONS (unconfirmed);
adds the (hyphenation) tag, and that a replaced reference is read again
and an unreadable one makes tr-ref exit 1; and gives the omission,
insertion and swap sweep in place of the kept-pairs count. Section 8 lists
tr-lint's DEC check. The decision rows for dates and for reference
translations follow. Runbook regenerated from the kit; PDF exported again.
</commit_message>
<xml_diff>
--- a/01-operating-manual.docx
+++ b/01-operating-manual.docx
@@ -651,7 +651,7 @@
           <w:sz w:val="21"/>
           <w:szCs w:val="21"/>
         </w:rPr>
-        <w:t xml:space="preserve">Confidential work lives in one encrypted container holding many projects. Each project is self-contained: its own sources, translations, working files, logs, and translation memory. Filenames are preserved exactly from source to output, so finding gaps is a plain set difference between two directories.</w:t>
+        <w:t xml:space="preserve">Confidential work lives in one encrypted container holding many projects. Each project is self-contained: its own sources, translations, working files, logs, and translation memory. Filenames are preserved exactly from source to output, so finding gaps is a plain set difference between two directories. Where two files in one folder would deliver under one name — x.docx beside a scanned x.pdf — the one whose format changes keeps its extension, so x.pdf delivers as x.pdf.docx; two names that differ only in case are refused.</w:t>
       </w:r>
     </w:p>
     <w:p>
@@ -6202,7 +6202,7 @@
           <w:sz w:val="21"/>
           <w:szCs w:val="21"/>
         </w:rPr>
-        <w:t>They go anywhere in the project’s reference/ folder, both files of a pair in the same folder and named alike apart from a language suffix: lease-2023_English.docx beside lease-2023_German.pdf. The suffix names a language, not a role, so the same pair serves English→German and German→English work. Each side may be Word, PDF with a text layer, scanned PDF or plain text, whatever the other side is; a file without a suffix is listed and skipped rather than guessed. tr-ref lines each pair up sentence by sentence without a model — by length, with the numbers both sides share as anchors — and keeps only one-to-one pairs whose numbers agree; a sentence with no number is kept only where its neighbours lined up one-to-one too. tr-run then gives an identical source sentence the translator’s rendering instead of a draft, and tr-terms --reference proposes the glossary from those renderings.</w:t>
+        <w:t>They go anywhere in the project’s reference/ folder, both files of a pair in the same folder and named alike apart from a language suffix: lease-2023_English.docx beside lease-2023_German.pdf. The suffix names a language, not a role, so the same pair serves English→German and German→English work. Each side may be Word, PDF with a text layer, scanned PDF or plain text, whatever the other side is; a file without a suffix is listed and skipped rather than guessed. tr-ref lines each pair up sentence by sentence without a model — by length, with the numbers both sides share as anchors — and keeps only one-to-one pairs whose numbers agree. Numbers also confirm the alignment: a pair is reused only when it carries numbers its neighbours do not, or sits between two pairs that do. A sentence nothing confirms is offered instead, as REF_OPTIONS [[…]] (unconfirmed), because where a translation omits, adds or swaps a sentence, the pairs around the change still look aligned. tr-run then gives an identical source sentence the translator’s rendering instead of a draft, and tr-terms --reference proposes the glossary from those renderings.</w:t>
       </w:r>
     </w:p>
     <w:p>
@@ -6230,7 +6230,7 @@
           <w:sz w:val="21"/>
           <w:szCs w:val="21"/>
         </w:rPr>
-        <w:t>Everything kept is listed in work/reference/pairs.tsv, to be read before the first run, because every line there marked yes or option can reach a deliverable word for word. Where the references render a sentence more than one way, the draft carries the choice instead of a model draft: REF_OPTIONS [[first]] | [[second]], for the translator to keep one and delete the rest — double square brackets, because Swiss German writes its quotation marks «…». The rendering found in the most documents comes first, counted once per document; a tie goes to the newest by the date the file itself records as last saved, because a copied file's date on disk is the day it was copied; and a pinned glossary term found in only one rendering puts that one first. The draft carries two; tr-ref --conflicts lists every rendering with its count and the date that ordered it. A translation read by OCR is offered the same way, tagged (OCR), and never reused on its own, since its misreadings would pass straight into the output. References stay in their project: memory never crosses matters, and a reference is a client’s document.</w:t>
+        <w:t>Everything kept is listed in work/reference/pairs.tsv, to be read before the first run, because every line there marked yes or option can reach a deliverable word for word. Where the references render a sentence more than one way, the draft carries the choice instead of a model draft: REF_OPTIONS [[first]] | [[second]], for the translator to keep one and delete the rest — double square brackets, because Swiss German writes its quotation marks «…». The rendering found in the most documents comes first, counted once per document; a tie goes to the newest by the date the file itself records as last saved, because a copied file's date on disk is the day it was copied; and a pinned glossary term found in only one rendering puts that one first. The draft carries two; tr-ref --conflicts lists every rendering with its count and the date that ordered it. A translation read by OCR is offered the same way, tagged (OCR), and never reused on its own, since its misreadings would pass straight into the output; so is one rejoined at a line-end hyphen that may have been the word’s own, tagged (hyphenation). A reference file replaced with a new version is read again, and one that cannot be read is listed, loses its sentences, and makes tr-ref exit 1. References stay in their project: memory never crosses matters, and a reference is a client’s document.</w:t>
       </w:r>
     </w:p>
     <w:p>
@@ -6244,7 +6244,7 @@
           <w:sz w:val="21"/>
           <w:szCs w:val="21"/>
         </w:rPr>
-        <w:t>On invented test documents a Word pair kept 12 of 14 sentence pairs and a Word-to-PDF pair 4 of 6; the rest were rejected rather than guessed. A reused sentence is not checked by tr-lint: it is the translator’s own work, and it never enters the translation memory. Harvesting terminology from references needs volume — on seventeen pairs tr-terms --reference proposes mostly noise.</w:t>
+        <w:t>On invented documents with each sentence in turn omitted, added or swapped — 436 alignments — no wrong sentence was reused. About one offered sentence in ten was wrong where a translation departed from its original, and none where it did not; tests/test_references.py repeats the sweep. A reused sentence is not checked by tr-lint: it is the translator’s own work, and it never enters the translation memory. Harvesting terminology from references needs volume — on seventeen pairs tr-terms --reference proposes mostly noise.</w:t>
       </w:r>
     </w:p>
     <w:p>
@@ -9553,6 +9553,62 @@
         <w:tc>
           <w:tcPr>
             <w:tcW w:type="dxa" w:w="1200"/>
+            <w:tcMar>
+              <w:top w:type="dxa" w:w="60"/>
+              <w:left w:type="dxa" w:w="100"/>
+              <w:bottom w:type="dxa" w:w="60"/>
+              <w:right w:type="dxa" w:w="100"/>
+            </w:tcMar>
+          </w:tcPr>
+          <w:p>
+            <w:pPr>
+              <w:spacing w:after="0" w:line="240"/>
+            </w:pPr>
+            <w:r>
+              <w:rPr>
+                <w:rFonts w:ascii="Consolas" w:cs="Consolas" w:eastAsia="Consolas" w:hAnsi="Consolas"/>
+                <w:b w:val="false"/>
+                <w:bCs w:val="false"/>
+                <w:color w:val="1A1A1A"/>
+                <w:sz w:val="17"/>
+                <w:szCs w:val="17"/>
+              </w:rPr>
+              <w:t xml:space="preserve">DEC</w:t>
+            </w:r>
+          </w:p>
+        </w:tc>
+        <w:tc>
+          <w:tcPr>
+            <w:tcW w:type="dxa" w:w="8160"/>
+            <w:tcMar>
+              <w:top w:type="dxa" w:w="60"/>
+              <w:left w:type="dxa" w:w="100"/>
+              <w:bottom w:type="dxa" w:w="60"/>
+              <w:right w:type="dxa" w:w="100"/>
+            </w:tcMar>
+          </w:tcPr>
+          <w:p>
+            <w:pPr>
+              <w:spacing w:after="0" w:line="240"/>
+            </w:pPr>
+            <w:r>
+              <w:rPr>
+                <w:rFonts w:ascii="Calibri" w:cs="Calibri" w:eastAsia="Calibri" w:hAnsi="Calibri"/>
+                <w:b w:val="false"/>
+                <w:bCs w:val="false"/>
+                <w:color w:val="1A1A1A"/>
+                <w:sz w:val="18"/>
+                <w:szCs w:val="18"/>
+              </w:rPr>
+              <w:t xml:space="preserve">An English number that could be a section, a clause or a time — 5.10, 3.2, 14.30 — was written as a decimal. Check that it is an amount</w:t>
+            </w:r>
+          </w:p>
+        </w:tc>
+      </w:tr>
+      <w:tr>
+        <w:tc>
+          <w:tcPr>
+            <w:tcW w:type="dxa" w:w="1200"/>
             <w:shd w:fill="FAF7F3" w:val="clear"/>
             <w:tcMar>
               <w:top w:type="dxa" w:w="60"/>
@@ -15855,7 +15911,7 @@
                 <w:sz w:val="18"/>
                 <w:szCs w:val="18"/>
               </w:rPr>
-              <w:t>The translator's rule. English takes March 5, 2024 and a decimal point; Slovene takes 5. marec 2024 - ordinal period, lowercase month, spaced - and a decimal comma. Whole-segment values are converted in code, without a model call</w:t>
+              <w:t>The translator's rule. English takes March 5, 2024 and a decimal point; Slovene takes 5. marec 2024 - ordinal period, lowercase month, spaced - and a decimal comma. Whole-segment values are converted in code, without a model call. From English, a number that may be a reference or a time — Section 5.10, at 14.30 — is left as it stands</w:t>
             </w:r>
           </w:p>
         </w:tc>
@@ -17100,7 +17156,7 @@
                 <w:sz w:val="18"/>
                 <w:szCs w:val="18"/>
               </w:rPr>
-              <w:t>An identical source sentence takes the translator's own rendering with no model call. Only one-to-one pairs whose numbers agree are kept. Where references disagree, the draft carries REF_OPTIONS with the two leading renderings — most documents first, then the newest by the file's own saved date, a pinned glossary term ahead of both — because choosing between human renderings is the translator's decision. OCR-read translations, and another variant's where the project's own has none, are offered tagged and never reused on their own. They stay in their project, because memory never crosses matters</w:t>
+              <w:t>An identical source sentence takes the translator's own rendering with no model call. Only one-to-one pairs whose numbers agree are kept, and only those that numbers confirm are reused; a sentence nothing confirms is offered tagged (unconfirmed). Where references disagree, the draft carries REF_OPTIONS with the two leading renderings — most documents first, then the newest by the file's own saved date, a pinned glossary term ahead of both — because choosing between human renderings is the translator's decision. OCR-read translations, and another variant's where the project's own has none, are offered tagged and never reused on their own. They stay in their project, because memory never crosses matters</w:t>
             </w:r>
           </w:p>
         </w:tc>

</xml_diff>

<commit_message>
Manual and runbook: work already done picks up later changes
Section 5 says tr-run drafts a deliverable again when anything that made it
has changed, lists what work/deliverables.tsv records, and says memory rows
are finished again when read and a deliverable changed after drafting is
kept. The OCR section says tr-ocrstat exits non-zero on a layer it cannot
measure and tr-inventory --count --with-ocr reads such files again.
Runbook regenerated from the kit; PDF exported again.
</commit_message>
<xml_diff>
--- a/01-operating-manual.docx
+++ b/01-operating-manual.docx
@@ -7296,7 +7296,7 @@
           <w:color w:val="1A1A1A"/>
           <w:sz w:val="21"/>
         </w:rPr>
-        <w:t>A text layer written by an earlier tr-inventory --count --with-ocr cannot be measured. That version made it with plain pdftotext, so nothing in it is marked OCR_ILLEGIBLE, and tr-pdf reused it for translation. Such layers are recognisable — pdftotext leaves a form feed after every page, which neither tr-ocrtext nor the born-digital path writes — so tr-ocrstat names them rather than reporting 0%, and tr-pdf reads the file again, keeping the old layer as &lt;name&gt;.txt.unmarked. tr-inventory --with-ocr now has tr-pdf make every text layer.</w:t>
+        <w:t>A text layer written by an earlier tr-inventory --count --with-ocr cannot be measured. That version made it with plain pdftotext, so nothing in it is marked OCR_ILLEGIBLE, and tr-pdf reused it for translation. Such layers are recognisable — pdftotext leaves a form feed after every page, which neither tr-ocrtext nor the born-digital path writes — so tr-ocrstat names them rather than reporting 0% and exits non-zero, and tr-inventory --count --with-ocr has tr-pdf read each such file again, however unchanged, keeping the old layer as &lt;name&gt;.txt.unmarked. tr-run then drafts again every deliverable made from a layer that changed.</w:t>
       </w:r>
       <w:r>
         <w:rPr>
@@ -9039,7 +9039,7 @@
           <w:sz w:val="21"/>
           <w:szCs w:val="21"/>
         </w:rPr>
-        <w:t xml:space="preserve">tr-run is resumable at two levels. It skips files already present in translated/, and within a file every segment already in the memory is reused rather than regenerated. Interrupting it costs at most one segment. Re-running after editing the glossary is cheap for the same reason.</w:t>
+        <w:t xml:space="preserve">tr-run is resumable at two levels. It skips a file whose deliverable is current, and within a file every segment already in the memory is reused rather than regenerated. Interrupting it costs at most one segment. Re-running after editing the glossary is cheap for the same reason: only the segments containing a changed term go back to the model.</w:t>
       </w:r>
     </w:p>
     <w:p>
@@ -9053,7 +9053,7 @@
           <w:sz w:val="21"/>
           <w:szCs w:val="21"/>
         </w:rPr>
-        <w:t>A file is re-translated if its source is newer than its output, or if the existing output was produced by a different model or a superseded prompt. tr-run records which model and prompt version wrote each deliverable in work/deliverables.tsv and compares them on the next run, printing a redo line that names both. The prompt version is not typed by anyone: it is derived from the prompt text each language pair is actually sent, so editing prompts/translate.txt gives the pairs whose text changed a new version and leaves the others alone. The Slovene↔English text in use since v6 keeps that name. That condition was missing until it mattered: the prompt version is part of the memory's key, but tr-run skipped the whole file on mtime alone, before the memory was consulted, so a bump changed nothing. A prompt correction followed by a re-run reported three files skipped in three seconds and left the defective drafts in place. To force a redo, delete the output. To force a redo ignoring the memory, change TR_PROMPT_VERSION, which is part of the cache key:</w:t>
+        <w:t>A deliverable is drafted again when anything that made it has changed since tr-run wrote it. work/deliverables.tsv records, for each, hashes of the source file and of a PDF's text layer, the glossary and non-translatable patterns, what tr-ref kept, the model, the prompt version and the kit's drafting code; tr-run compares them on the next run and prints a redo line naming what changed, and tr-status reports the same. Memory rows are finished again as they are read, so a fix to how drafts are finished reaches rows written before it. A deliverable changed after tr-run wrote it, as a translator's corrections in place would change it, is never overwritten: tr-run lists it as kept, and drafts it again once it is moved aside. The prompt version is not typed by anyone: it is derived from the prompt text each language pair is actually sent, so editing prompts/translate.txt gives the pairs whose text changed a new version and leaves the others alone. The Slovene↔English text in use since v6 keeps that name. That condition was missing until it mattered: the prompt version is part of the memory's key, but tr-run skipped the whole file on mtime alone, before the memory was consulted, so a bump changed nothing. A prompt correction followed by a re-run reported three files skipped in three seconds and left the defective drafts in place. To force a redo, move the output aside or delete it. To force a redo ignoring the memory, change TR_PROMPT_VERSION, which is part of the cache key:</w:t>
       </w:r>
     </w:p>
     <w:p>

</xml_diff>

<commit_message>
Manual: keep case text out of /tmp
The Phase 1 bilingual draft is written to work/ inside the project instead
of /tmp. The disk-encryption decision row says ocrmypdf's and Ghostscript's
working files now go to <project>/work/tmp as well, through a TMPDIR each
tr-pdf run makes there and removes. PDF exported again.
</commit_message>
<xml_diff>
--- a/01-operating-manual.docx
+++ b/01-operating-manual.docx
@@ -8313,7 +8313,7 @@
           <w:sz w:val="17"/>
           <w:szCs w:val="17"/>
         </w:rPr>
-        <w:t xml:space="preserve">/tmp/sample-bilingual.docx</w:t>
+        <w:t xml:space="preserve">work/sample-bilingual.docx</w:t>
       </w:r>
       <w:r>
         <w:rPr>
@@ -16160,7 +16160,7 @@
                 <w:sz w:val="18"/>
                 <w:szCs w:val="18"/>
               </w:rPr>
-              <w:t>The root filesystem is plain ext4 and stays that way. Retrofitting means re-encrypting in place or reinstalling, and the container is what actually protects the case material at rest. Accepted residual risk, named so it is not rediscovered as a surprise: swap, temporary files, and anything copied out for review are in the clear, as is everything while the container is open. One part of that has since been closed rather than accepted: OCR renders every page of a scan to a PNG, and on an all-scanned corpus that put the whole evidence bundle through /tmp - tmpfs, so RAM-backed and swappable to the plain 8 GB swapfile, and left behind entirely when a run is killed before its cleanup. Those renders now go to &lt;project&gt;/work/tmp inside the container (trlib.case_tmpdir). Encrypted swap is the cheapest of the remaining mitigations if the rest is revisited</w:t>
+              <w:t>The root filesystem is plain ext4 and stays that way. Retrofitting means re-encrypting in place or reinstalling, and the container is what actually protects the case material at rest. Accepted residual risk, named so it is not rediscovered as a surprise: swap, temporary files, and anything copied out for review are in the clear, as is everything while the container is open. One part of that has since been closed rather than accepted: OCR renders every page of a scan to a PNG, and on an all-scanned corpus that put the whole evidence bundle through /tmp - tmpfs, so RAM-backed and swappable to the plain 8 GB swapfile, and left behind entirely when a run is killed before its cleanup. Those renders, and everything ocrmypdf and Ghostscript write while they work, now go to &lt;project&gt;/work/tmp inside the container: the kit's own through trlib.case_tmpdir, and the rest through a TMPDIR each tr-pdf run makes there and removes when it ends. Encrypted swap is the cheapest of the remaining mitigations if the rest is revisited</w:t>
             </w:r>
           </w:p>
         </w:tc>

</xml_diff>

<commit_message>
Manual and runbook: a failed segment fails its file
The lint table's FAIL row says tr-lint finds [TRANSLATION FAILED] in the
deliverables, and that tr-run has counted the file as failed and drafts it
again. Section 12's retry paragraph follows. Runbook regenerated from the
kit, with the text-layer and failure changes; PDF exported again.
</commit_message>
<xml_diff>
--- a/01-operating-manual.docx
+++ b/01-operating-manual.docx
@@ -9372,7 +9372,7 @@
                 <w:sz w:val="18"/>
                 <w:szCs w:val="18"/>
               </w:rPr>
-              <w:t xml:space="preserve">The segment errored out and contains no translation. Fix and re-run first</w:t>
+              <w:t xml:space="preserve">A deliverable holds [TRANSLATION FAILED]: a segment the model could not translate. tr-run has counted its file as failed and drafts it again on the next run</w:t>
             </w:r>
           </w:p>
         </w:tc>
@@ -14779,7 +14779,7 @@
           <w:sz w:val="21"/>
           <w:szCs w:val="21"/>
         </w:rPr>
-        <w:t>Measured on this machine with invented English legal text: about 10 seconds a segment over 42 requests, none failed, against 48 for GaMS3. Unlike GaMS3, most of that is generation, at 3 tokens a second, rather than reading the prompt, so batching short segments saves less. Two cautions from the same runs. A bare label or heading is where the model invents: "Case number" came back as a fictitious German court reference, and the heading STATEMENT as a whole invented declaration. tr-run gives such a reply one firmer retry — a reply far longer than its source, or one carrying a number the source does not have. A reply still far too long after it is written as [TRANSLATION FAILED]; one still carrying an extra number is kept and reported by tr-lint as NUM, because "dva tedna" rendered as "2 weeks" adds a digit without adding anything false. Over eight number-prone labels, three replies invented something and none did after the retry. And no German draft has yet been reviewed by a translator.</w:t>
+        <w:t>Measured on this machine with invented English legal text: about 10 seconds a segment over 42 requests, none failed, against 48 for GaMS3. Unlike GaMS3, most of that is generation, at 3 tokens a second, rather than reading the prompt, so batching short segments saves less. Two cautions from the same runs. A bare label or heading is where the model invents: "Case number" came back as a fictitious German court reference, and the heading STATEMENT as a whole invented declaration. tr-run gives such a reply one firmer retry — a reply far longer than its source, or one carrying a number the source does not have. A reply still far too long after it is written as [TRANSLATION FAILED], and its file counts as failed: tr-run exits 1, records nothing for it and drafts it again on the next run, and tr-lint lists it; one still carrying an extra number is kept and reported by tr-lint as NUM, because "dva tedna" rendered as "2 weeks" adds a digit without adding anything false. Over eight number-prone labels, three replies invented something and none did after the retry. And no German draft has yet been reviewed by a translator.</w:t>
       </w:r>
     </w:p>
     <w:p>

</xml_diff>

<commit_message>
Manual and runbook: no German source yet
Section 4.4 no longer says a reference pair serves German->English work,
and section 12 says TR_SRC is sl or en. The language-pairs decision row
says a German source is refused until language detection knows German, and
the open item says what a German source still needs. Environment table and
runbook regenerated from the kit; PDF exported again.
</commit_message>
<xml_diff>
--- a/01-operating-manual.docx
+++ b/01-operating-manual.docx
@@ -6202,7 +6202,7 @@
           <w:sz w:val="21"/>
           <w:szCs w:val="21"/>
         </w:rPr>
-        <w:t>They go anywhere in the project’s reference/ folder, both files of a pair in the same folder and named alike apart from a language suffix: lease-2023_English.docx beside lease-2023_German.pdf. The suffix names a language, not a role, so the same pair serves English→German and German→English work. Each side may be Word, PDF with a text layer, scanned PDF or plain text, whatever the other side is; a file without a suffix is listed and skipped rather than guessed. tr-ref lines each pair up sentence by sentence without a model — by length, with the numbers both sides share as anchors — and keeps only one-to-one pairs whose numbers agree. Numbers also confirm the alignment: a pair is reused only when it carries numbers its neighbours do not, or sits between two pairs that do. A sentence nothing confirms is offered instead, as REF_OPTIONS [[…]] (unconfirmed), because where a translation omits, adds or swaps a sentence, the pairs around the change still look aligned. tr-run then gives an identical source sentence the translator’s rendering instead of a draft, and tr-terms --reference proposes the glossary from those renderings.</w:t>
+        <w:t>They go anywhere in the project’s reference/ folder, both files of a pair in the same folder and named alike apart from a language suffix: lease-2023_English.docx beside lease-2023_German.pdf. The suffix names a language, not a role, so the same pair would serve German→English work too, once a German source is supported. Each side may be Word, PDF with a text layer, scanned PDF or plain text, whatever the other side is; a file without a suffix is listed and skipped rather than guessed. tr-ref lines each pair up sentence by sentence without a model — by length, with the numbers both sides share as anchors — and keeps only one-to-one pairs whose numbers agree. Numbers also confirm the alignment: a pair is reused only when it carries numbers its neighbours do not, or sits between two pairs that do. A sentence nothing confirms is offered instead, as REF_OPTIONS [[…]] (unconfirmed), because where a translation omits, adds or swaps a sentence, the pairs around the change still look aligned. tr-run then gives an identical source sentence the translator’s rendering instead of a draft, and tr-terms --reference proposes the glossary from those renderings.</w:t>
       </w:r>
     </w:p>
     <w:p>
@@ -6216,7 +6216,7 @@
           <w:sz w:val="21"/>
           <w:szCs w:val="21"/>
         </w:rPr>
-        <w:t>German takes a variant after a hyphen: lease-2023_German-CH.pdf is Swiss German, _German-AT Austrian, and _German or _German-DE Germany. One English original beside a Germany and a Swiss translation makes two pairs. A German translation is reused only in a project whose TR_TGT is its variant. One in another variant is never reused: where the project's own variant has no reference for a sentence it is offered as REF_OPTIONS, tagged with its variant — and a Germany rendering offered to a Swiss project is spelled ss for ß first — and tr-terms --reference leaves it out, since a Germany translation would propose Straße to a Swiss glossary. A German→English project reuses a pair whatever German its source is written in.</w:t>
+        <w:t>German takes a variant after a hyphen: lease-2023_German-CH.pdf is Swiss German, _German-AT Austrian, and _German or _German-DE Germany. One English original beside a Germany and a Swiss translation makes two pairs. A German translation is reused only in a project whose TR_TGT is its variant. One in another variant is never reused: where the project's own variant has no reference for a sentence it is offered as REF_OPTIONS, tagged with its variant — and a Germany rendering offered to a Swiss project is spelled ss for ß first — and tr-terms --reference leaves it out, since a Germany translation would propose Straße to a Swiss glossary. A German source is refused for now, because triage cannot detect German.</w:t>
       </w:r>
     </w:p>
     <w:p>
@@ -13081,7 +13081,7 @@
                 <w:sz w:val="18"/>
                 <w:szCs w:val="18"/>
               </w:rPr>
-              <w:t>Per-project, in project.conf. Any two of sl, en, de. TR_TGT may name a German variant: de-DE (the same as de); de-CH, drafted by the Swiss Federal Chancellery's rules; or de-AT, which tr-ref and tr-terms read but drafting refuses until its conventions are settled</w:t>
+              <w:t>Per-project, in project.conf. TR_SRC is sl or en: a German source is refused until language detection knows German. TR_TGT is sl, en or de, and may name a German variant: de-DE (the same as de); de-CH, drafted by the Swiss Federal Chancellery's rules; or de-AT, which tr-ref and tr-terms read but drafting refuses until its conventions are settled</w:t>
             </w:r>
           </w:p>
         </w:tc>
@@ -14765,7 +14765,7 @@
           <w:sz w:val="21"/>
           <w:szCs w:val="21"/>
         </w:rPr>
-        <w:t>TR_TGT=de is German as written in Germany, and de-DE means the same, so a project may use either without touching its translation memory. TR_TGT=de-CH drafts Swiss German by the Swiss Federal Chancellery's Schreibweisungen: a decimal comma, with thousands from five digits separated by a non-breaking space (12 450,00; 1250 stays whole); a decimal point only beside a currency, the code first (CHF 1250.50, EUR 12 450.00), and whole francs as Fr. 20.⁠–; times as 14.30 and 9.05; dates as in Germany; and ss for ß, except in a word the source has too, such as a name or an address. The prompt carries these rules, and the kit applies them itself to values standing alone, to amounts the model left in English form, and to spelling. A number counts as money only beside a currency, because a converter cannot see the column it stands in. de-AT is recognised — tr-ref files references in it and tr-terms --reference reads them — but drafting into it is refused until its conventions are settled. TR_SRC takes no variant; a Swiss German source is de.</w:t>
+        <w:t>TR_TGT=de is German as written in Germany, and de-DE means the same, so a project may use either without touching its translation memory. TR_TGT=de-CH drafts Swiss German by the Swiss Federal Chancellery's Schreibweisungen: a decimal comma, with thousands from five digits separated by a non-breaking space (12 450,00; 1250 stays whole); a decimal point only beside a currency, the code first (CHF 1250.50, EUR 12 450.00), and whole francs as Fr. 20.⁠–; times as 14.30 and 9.05; dates as in Germany; and ss for ß, except in a word the source has too, such as a name or an address. The prompt carries these rules, and the kit applies them itself to values standing alone, to amounts the model left in English form, and to spelling. A number counts as money only beside a currency, because a converter cannot see the column it stands in. de-AT is recognised — tr-ref files references in it and tr-terms --reference reads them — but drafting into it is refused until its conventions are settled. TR_SRC is sl or en: a German source is refused for now, because language detection has no German and German→English has no rules of its own.</w:t>
       </w:r>
     </w:p>
     <w:p>
@@ -16963,7 +16963,7 @@
                 <w:sz w:val="18"/>
                 <w:szCs w:val="18"/>
               </w:rPr>
-              <w:t>sl↔en and en↔de; sl↔de not yet</w:t>
+              <w:t>sl↔en and English into German; a German source and sl↔de not yet</w:t>
             </w:r>
           </w:p>
         </w:tc>
@@ -16990,7 +16990,7 @@
                 <w:sz w:val="18"/>
                 <w:szCs w:val="18"/>
               </w:rPr>
-              <w:t>Every one of the three can be source or target. Slovene↔German has no model chosen and refuses to translate: the model researched for it is not installed, and pivoting through English doubles the error</w:t>
+              <w:t>Slovene and English can be source or target, and German a target: a German source is refused until language detection knows German and German→English has rules of its own. Slovene↔German has no model chosen and refuses to translate: the model researched for it is not installed, and pivoting through English doubles the error</w:t>
             </w:r>
           </w:p>
         </w:tc>
@@ -17485,7 +17485,7 @@
           <w:sz w:val="21"/>
           <w:szCs w:val="21"/>
         </w:rPr>
-        <w:t>Locale conversion covers English→German and English→Swiss German only among the German pairs. Slovene↔German and German→English dates and amounts are left to the model, and Slovene↔German still needs a model chosen.</w:t>
+        <w:t>Locale conversion covers English→German and English→Swiss German only among the German pairs. Slovene↔German still needs a model chosen. A German source needs a German class in language detection, calibrated again, and prompt rules and conversions for German→English; until then TR_SRC=de is refused.</w:t>
       </w:r>
     </w:p>
     <w:p>

</xml_diff>

<commit_message>
Manual: numbers compared as values, more values converted in code
Section 4.3 says a value with a currency, a sign, brackets or a percent, a
range such as 12:00–13:00, and a date or time spelled with letters are
converted in code too. Section 8's NUM row says numbers are compared as
values, each side read in its own notation. Section 12 says the same of
the invention retry, so a correct conversion earns no retry and a batch
retries only the line that added something; and that for Swiss German the
kit fixes amounts and times left in Germany's form, writes whole francs one
way, and counts a number beside the other end of a range with a currency
as money. PDF exported again.
</commit_message>
<xml_diff>
--- a/01-operating-manual.docx
+++ b/01-operating-manual.docx
@@ -5784,7 +5784,7 @@
           <w:sz w:val="21"/>
           <w:szCs w:val="21"/>
         </w:rPr>
-        <w:t>The distinction has a practical edge. Inside a sentence the model does the conversion. A segment that is only a date or an amount never reaches the model at all, because the patterns above exclude it from translation - so a Datum column in a spreadsheet stayed in Slovene while the same date in prose came out in English, and the deliverable contradicted itself column by column. Those whole-segment values are now converted in code: exact, consistent, and without the 48 seconds a model call would cost.</w:t>
+        <w:t>The distinction has a practical edge. Inside a sentence the model does the conversion. A segment that is only a date or an amount never reaches the model at all, because the patterns above exclude it from translation - so a Datum column in a spreadsheet stayed in Slovene while the same date in prose came out in English, and the deliverable contradicted itself column by column. Those whole-segment values are now converted in code: exact, consistent, and without the 48 seconds a model call would cost. The same holds for a value with a currency on either side, a sign, accounting brackets or a percent — $1,000, -1,250.00, (1,250.00), 12.5% — for a range such as 12:00–13:00, and for a date or a time spelled with letters, such as March 5, 2024 or 2:30 p.m., which used to go to the model.</w:t>
       </w:r>
     </w:p>
     <w:p>
@@ -9430,7 +9430,7 @@
                 <w:sz w:val="18"/>
                 <w:szCs w:val="18"/>
               </w:rPr>
-              <w:t xml:space="preserve">A number in the source is absent from the target, or a number appears that was not in the source. Highest consequence class in legal evidence</w:t>
+              <w:t xml:space="preserve">A number in the source is absent from the target, or a number appears that was not in the source, compared as values with each side read in its own notation. Highest consequence class in legal evidence</w:t>
             </w:r>
           </w:p>
         </w:tc>
@@ -14765,7 +14765,7 @@
           <w:sz w:val="21"/>
           <w:szCs w:val="21"/>
         </w:rPr>
-        <w:t>TR_TGT=de is German as written in Germany, and de-DE means the same, so a project may use either without touching its translation memory. TR_TGT=de-CH drafts Swiss German by the Swiss Federal Chancellery's Schreibweisungen: a decimal comma, with thousands from five digits separated by a non-breaking space (12 450,00; 1250 stays whole); a decimal point only beside a currency, the code first (CHF 1250.50, EUR 12 450.00), and whole francs as Fr. 20.⁠–; times as 14.30 and 9.05; dates as in Germany; and ss for ß, except in a word the source has too, such as a name or an address. The prompt carries these rules, and the kit applies them itself to values standing alone, to amounts the model left in English form, and to spelling. A number counts as money only beside a currency, because a converter cannot see the column it stands in. de-AT is recognised — tr-ref files references in it and tr-terms --reference reads them — but drafting into it is refused until its conventions are settled. TR_SRC is sl or en: a German source is refused for now, because language detection has no German and German→English has no rules of its own.</w:t>
+        <w:t>TR_TGT=de is German as written in Germany, and de-DE means the same, so a project may use either without touching its translation memory. TR_TGT=de-CH drafts Swiss German by the Swiss Federal Chancellery's Schreibweisungen: a decimal comma, with thousands from five digits separated by a non-breaking space (12 450,00; 1250 stays whole); a decimal point only beside a currency, the code first (CHF 1250.50, EUR 12 450.00), and whole francs as Fr. 20.⁠–; times as 14.30 and 9.05; dates as in Germany; and ss for ß, except in a word the source has too, such as a name or an address. The prompt carries these rules, and the kit applies them itself to values standing alone, to amounts and times the model left in English form or in Germany's, to whole francs however they are written, and to spelling. A number counts as money only beside a currency, or beside the other end of a range that has one, because a converter cannot see the column it stands in. de-AT is recognised — tr-ref files references in it and tr-terms --reference reads them — but drafting into it is refused until its conventions are settled. TR_SRC is sl or en: a German source is refused for now, because language detection has no German and German→English has no rules of its own.</w:t>
       </w:r>
     </w:p>
     <w:p>
@@ -14779,7 +14779,7 @@
           <w:sz w:val="21"/>
           <w:szCs w:val="21"/>
         </w:rPr>
-        <w:t>Measured on this machine with invented English legal text: about 10 seconds a segment over 42 requests, none failed, against 48 for GaMS3. Unlike GaMS3, most of that is generation, at 3 tokens a second, rather than reading the prompt, so batching short segments saves less. Two cautions from the same runs. A bare label or heading is where the model invents: "Case number" came back as a fictitious German court reference, and the heading STATEMENT as a whole invented declaration. tr-run gives such a reply one firmer retry — a reply far longer than its source, or one carrying a number the source does not have. A reply still far too long after it is written as [TRANSLATION FAILED], and its file counts as failed: tr-run exits 1, records nothing for it and drafts it again on the next run, and tr-lint lists it; one still carrying an extra number is kept and reported by tr-lint as NUM, because "dva tedna" rendered as "2 weeks" adds a digit without adding anything false. Over eight number-prone labels, three replies invented something and none did after the retry. And no German draft has yet been reviewed by a translator.</w:t>
+        <w:t>Measured on this machine with invented English legal text: about 10 seconds a segment over 42 requests, none failed, against 48 for GaMS3. Unlike GaMS3, most of that is generation, at 3 tokens a second, rather than reading the prompt, so batching short segments saves less. Two cautions from the same runs. A bare label or heading is where the model invents: "Case number" came back as a fictitious German court reference, and the heading STATEMENT as a whole invented declaration. tr-run gives such a reply one firmer retry — a reply far longer than its source, or one carrying a number the source does not have. Numbers are compared as values, each side read in its own notation, so a date or an amount the model converted correctly earns no retry, and in a batch only the line that added something is retried. A reply still far too long after it is written as [TRANSLATION FAILED], and its file counts as failed: tr-run exits 1, records nothing for it and drafts it again on the next run, and tr-lint lists it; one still carrying an extra number is kept and reported by tr-lint as NUM, because "dva tedna" rendered as "2 weeks" adds a digit without adding anything false. Over eight number-prone labels, three replies invented something and none did after the retry. And no German draft has yet been reviewed by a translator.</w:t>
       </w:r>
     </w:p>
     <w:p>

</xml_diff>

<commit_message>
Handover testing section, manual copies reconciled, batch settings
The handover document's section 4.1 points at tests/run and
tests/mock_ollama.py. The mock it printed answered no /api/tags, so tr-run
now refuses to start against it.

The manual's .md takes the .docx wording where the two had drifted: the
dates paragraph, the paragraph on when a deliverable is drafted again, and
the OCR thresholds, now prose in both, with "The third criterion" moved in
the .docx to follow the criteria it refers to. The .docx takes the .md's
open items, which were updated on 2026-08-04 and the .docx never was:
Phase 1 has run, and the container-cycle and header-backup items are gone.
Both say the English->German prompt version changed once, at kit commit
aeaa8e3, so memory written before it is not reused.

The environment tables list the batch settings, the runbook is
regenerated from the kit, and the README names the manual as version 1.4.
Both PDFs exported again.
</commit_message>
<xml_diff>
--- a/01-operating-manual.docx
+++ b/01-operating-manual.docx
@@ -7263,19 +7263,6 @@
           <w:color w:val="1A1A1A"/>
           <w:sz w:val="21"/>
         </w:rPr>
-        <w:t>The third criterion is deliberately not a rate. A page can be 99% clean and still carry one wrong digit in an amount, and nothing downstream can catch it, so a disagreement is not a reason to stop the project - it is a page that gets read against the original. The first two thresholds come from eight pages of two real documents and are starting points with a stated basis, not laws. The Phase 1 files measured 1% and 3%.</w:t>
-      </w:r>
-    </w:p>
-    <w:p>
-      <w:pPr>
-        <w:spacing w:after="120" w:line="264"/>
-      </w:pPr>
-      <w:r>
-        <w:rPr>
-          <w:rFonts w:ascii="Calibri" w:hAnsi="Calibri"/>
-          <w:color w:val="1A1A1A"/>
-          <w:sz w:val="21"/>
-        </w:rPr>
         <w:t>tr-ocrstat answers this for a whole corpus rather than one file: it reports the unreadable-token rate per PDF, worst first, against the thresholds below, and exits non-zero if anything is in the stop band or any text layer cannot be measured. Use it before tr-run; use ocr-check.py on the individual pages whose numbers carry weight.</w:t>
       </w:r>
       <w:r>
@@ -7326,6 +7313,19 @@
           <w:sz w:val="21"/>
         </w:rPr>
         <w:t xml:space="preserve"> Not a judgement call, because the measurements already exist. tr-ocrtext reports the share of tokens Tesseract scored below its confidence floor; ocr-check.py reports the share of doubtful words and the number disagreements between the two engines. Unreadable tokens: under 5% proceed, 5-20% inspect, 20% or more stop. Doubtful words: under 3% proceed, 3-10% run the cross-check, over 10% stop. Number disagreements: any at all, and a person reads that page.</w:t>
+      </w:r>
+    </w:p>
+    <w:p>
+      <w:pPr>
+        <w:spacing w:after="120" w:line="264"/>
+      </w:pPr>
+      <w:r>
+        <w:rPr>
+          <w:rFonts w:ascii="Calibri" w:hAnsi="Calibri"/>
+          <w:color w:val="1A1A1A"/>
+          <w:sz w:val="21"/>
+        </w:rPr>
+        <w:t>The third criterion is deliberately not a rate. A page can be 99% clean and still carry one wrong digit in an amount, and nothing downstream can catch it, so a disagreement is not a reason to stop the project - it is a page that gets read against the original. The first two thresholds come from eight pages of two real documents and are starting points with a stated basis, not laws. The Phase 1 files measured 1% and 3%.</w:t>
       </w:r>
     </w:p>
     <w:p>
@@ -9053,7 +9053,7 @@
           <w:sz w:val="21"/>
           <w:szCs w:val="21"/>
         </w:rPr>
-        <w:t>A deliverable is drafted again when anything that made it has changed since tr-run wrote it. work/deliverables.tsv records, for each, hashes of the source file and of a PDF's text layer, the glossary and non-translatable patterns, what tr-ref kept, the model, the prompt version and the kit's drafting code; tr-run compares them on the next run and prints a redo line naming what changed, and tr-status reports the same. Memory rows are finished again as they are read, so a fix to how drafts are finished reaches rows written before it. A deliverable changed after tr-run wrote it, as a translator's corrections in place would change it, is never overwritten: tr-run lists it as kept, and drafts it again once it is moved aside. The prompt version is not typed by anyone: it is derived from the prompt text each language pair is actually sent, so editing prompts/translate.txt gives the pairs whose text changed a new version and leaves the others alone. The Slovene↔English text in use since v6 keeps that name. That condition was missing until it mattered: the prompt version is part of the memory's key, but tr-run skipped the whole file on mtime alone, before the memory was consulted, so a bump changed nothing. A prompt correction followed by a re-run reported three files skipped in three seconds and left the defective drafts in place. To force a redo, move the output aside or delete it. To force a redo ignoring the memory, change TR_PROMPT_VERSION, which is part of the cache key:</w:t>
+        <w:t>A deliverable is drafted again when anything that made it has changed since tr-run wrote it. work/deliverables.tsv records, for each, hashes of the source file and of a PDF's text layer, the glossary and non-translatable patterns, what tr-ref kept, the model, the prompt version and the kit's drafting code; tr-run compares them on the next run and prints a redo line naming what changed, and tr-status reports the same. Memory rows are finished again as they are read, so a fix to how drafts are finished reaches rows written before it. A deliverable changed after tr-run wrote it, as a translator's corrections in place would change it, is never overwritten: tr-run lists it as kept, and drafts it again once it is moved aside. The prompt version is not typed by anyone: it is derived from the prompt text each language pair is actually sent, so editing prompts/translate.txt gives the pairs whose text changed a new version and leaves the others alone. The Slovene↔English text in use since v6 keeps that name. The English→German version changed once, on 2026-09-10 at kit commit aeaa8e3, from p-b5121a0c86bf to p-86640e2a7d20, so memory written under the first is not reused. That condition was missing until it mattered: the prompt version is part of the memory's key, but tr-run skipped the whole file on mtime alone, before the memory was consulted, so a bump changed nothing. A prompt correction followed by a re-run reported three files skipped in three seconds and left the defective drafts in place. To force a redo, move the output aside or delete it. To force a redo ignoring the memory, change TR_PROMPT_VERSION, which is part of the cache key:</w:t>
       </w:r>
     </w:p>
     <w:p>
@@ -13276,6 +13276,255 @@
                 <w:sz w:val="18"/>
                 <w:szCs w:val="18"/>
               </w:rPr>
+              <w:t>TR_BATCH_ITEMS</w:t>
+            </w:r>
+          </w:p>
+        </w:tc>
+        <w:tc>
+          <w:tcPr>
+            <w:tcW w:type="dxa" w:w="2200"/>
+            <w:tcMar>
+              <w:top w:type="dxa" w:w="60"/>
+              <w:left w:type="dxa" w:w="100"/>
+              <w:bottom w:type="dxa" w:w="60"/>
+              <w:right w:type="dxa" w:w="100"/>
+            </w:tcMar>
+          </w:tcPr>
+          <w:p>
+            <w:pPr>
+              <w:spacing w:after="0" w:line="240"/>
+            </w:pPr>
+            <w:r>
+              <w:rPr>
+                <w:rFonts w:ascii="Calibri" w:cs="Calibri" w:eastAsia="Calibri" w:hAnsi="Calibri"/>
+                <w:b w:val="false"/>
+                <w:bCs w:val="false"/>
+                <w:color w:val="1A1A1A"/>
+                <w:sz w:val="18"/>
+                <w:szCs w:val="18"/>
+              </w:rPr>
+              <w:t>20</w:t>
+            </w:r>
+          </w:p>
+        </w:tc>
+        <w:tc>
+          <w:tcPr>
+            <w:tcW w:type="dxa" w:w="4560"/>
+            <w:tcMar>
+              <w:top w:type="dxa" w:w="60"/>
+              <w:left w:type="dxa" w:w="100"/>
+              <w:bottom w:type="dxa" w:w="60"/>
+              <w:right w:type="dxa" w:w="100"/>
+            </w:tcMar>
+          </w:tcPr>
+          <w:p>
+            <w:pPr>
+              <w:spacing w:after="0" w:line="240"/>
+            </w:pPr>
+            <w:r>
+              <w:rPr>
+                <w:rFonts w:ascii="Calibri" w:cs="Calibri" w:eastAsia="Calibri" w:hAnsi="Calibri"/>
+                <w:b w:val="false"/>
+                <w:bCs w:val="false"/>
+                <w:color w:val="1A1A1A"/>
+                <w:sz w:val="18"/>
+                <w:szCs w:val="18"/>
+              </w:rPr>
+              <w:t>Most short segments sent to the model in one request</w:t>
+            </w:r>
+          </w:p>
+        </w:tc>
+      </w:tr>
+      <w:tr>
+        <w:tc>
+          <w:tcPr>
+            <w:tcW w:type="dxa" w:w="2600"/>
+            <w:tcMar>
+              <w:top w:type="dxa" w:w="60"/>
+              <w:left w:type="dxa" w:w="100"/>
+              <w:bottom w:type="dxa" w:w="60"/>
+              <w:right w:type="dxa" w:w="100"/>
+            </w:tcMar>
+          </w:tcPr>
+          <w:p>
+            <w:pPr>
+              <w:spacing w:after="0" w:line="240"/>
+            </w:pPr>
+            <w:r>
+              <w:rPr>
+                <w:rFonts w:ascii="Calibri" w:cs="Calibri" w:eastAsia="Calibri" w:hAnsi="Calibri"/>
+                <w:b w:val="false"/>
+                <w:bCs w:val="false"/>
+                <w:color w:val="1A1A1A"/>
+                <w:sz w:val="18"/>
+                <w:szCs w:val="18"/>
+              </w:rPr>
+              <w:t>TR_BATCH_CHARS</w:t>
+            </w:r>
+          </w:p>
+        </w:tc>
+        <w:tc>
+          <w:tcPr>
+            <w:tcW w:type="dxa" w:w="2200"/>
+            <w:tcMar>
+              <w:top w:type="dxa" w:w="60"/>
+              <w:left w:type="dxa" w:w="100"/>
+              <w:bottom w:type="dxa" w:w="60"/>
+              <w:right w:type="dxa" w:w="100"/>
+            </w:tcMar>
+          </w:tcPr>
+          <w:p>
+            <w:pPr>
+              <w:spacing w:after="0" w:line="240"/>
+            </w:pPr>
+            <w:r>
+              <w:rPr>
+                <w:rFonts w:ascii="Calibri" w:cs="Calibri" w:eastAsia="Calibri" w:hAnsi="Calibri"/>
+                <w:b w:val="false"/>
+                <w:bCs w:val="false"/>
+                <w:color w:val="1A1A1A"/>
+                <w:sz w:val="18"/>
+                <w:szCs w:val="18"/>
+              </w:rPr>
+              <w:t>1500</w:t>
+            </w:r>
+          </w:p>
+        </w:tc>
+        <w:tc>
+          <w:tcPr>
+            <w:tcW w:type="dxa" w:w="4560"/>
+            <w:tcMar>
+              <w:top w:type="dxa" w:w="60"/>
+              <w:left w:type="dxa" w:w="100"/>
+              <w:bottom w:type="dxa" w:w="60"/>
+              <w:right w:type="dxa" w:w="100"/>
+            </w:tcMar>
+          </w:tcPr>
+          <w:p>
+            <w:pPr>
+              <w:spacing w:after="0" w:line="240"/>
+            </w:pPr>
+            <w:r>
+              <w:rPr>
+                <w:rFonts w:ascii="Calibri" w:cs="Calibri" w:eastAsia="Calibri" w:hAnsi="Calibri"/>
+                <w:b w:val="false"/>
+                <w:bCs w:val="false"/>
+                <w:color w:val="1A1A1A"/>
+                <w:sz w:val="18"/>
+                <w:szCs w:val="18"/>
+              </w:rPr>
+              <w:t>Most characters in one batched request</w:t>
+            </w:r>
+          </w:p>
+        </w:tc>
+      </w:tr>
+      <w:tr>
+        <w:tc>
+          <w:tcPr>
+            <w:tcW w:type="dxa" w:w="2600"/>
+            <w:tcMar>
+              <w:top w:type="dxa" w:w="60"/>
+              <w:left w:type="dxa" w:w="100"/>
+              <w:bottom w:type="dxa" w:w="60"/>
+              <w:right w:type="dxa" w:w="100"/>
+            </w:tcMar>
+          </w:tcPr>
+          <w:p>
+            <w:pPr>
+              <w:spacing w:after="0" w:line="240"/>
+            </w:pPr>
+            <w:r>
+              <w:rPr>
+                <w:rFonts w:ascii="Calibri" w:cs="Calibri" w:eastAsia="Calibri" w:hAnsi="Calibri"/>
+                <w:b w:val="false"/>
+                <w:bCs w:val="false"/>
+                <w:color w:val="1A1A1A"/>
+                <w:sz w:val="18"/>
+                <w:szCs w:val="18"/>
+              </w:rPr>
+              <w:t>TR_BATCH_ITEM_CHARS</w:t>
+            </w:r>
+          </w:p>
+        </w:tc>
+        <w:tc>
+          <w:tcPr>
+            <w:tcW w:type="dxa" w:w="2200"/>
+            <w:tcMar>
+              <w:top w:type="dxa" w:w="60"/>
+              <w:left w:type="dxa" w:w="100"/>
+              <w:bottom w:type="dxa" w:w="60"/>
+              <w:right w:type="dxa" w:w="100"/>
+            </w:tcMar>
+          </w:tcPr>
+          <w:p>
+            <w:pPr>
+              <w:spacing w:after="0" w:line="240"/>
+            </w:pPr>
+            <w:r>
+              <w:rPr>
+                <w:rFonts w:ascii="Calibri" w:cs="Calibri" w:eastAsia="Calibri" w:hAnsi="Calibri"/>
+                <w:b w:val="false"/>
+                <w:bCs w:val="false"/>
+                <w:color w:val="1A1A1A"/>
+                <w:sz w:val="18"/>
+                <w:szCs w:val="18"/>
+              </w:rPr>
+              <w:t>200</w:t>
+            </w:r>
+          </w:p>
+        </w:tc>
+        <w:tc>
+          <w:tcPr>
+            <w:tcW w:type="dxa" w:w="4560"/>
+            <w:tcMar>
+              <w:top w:type="dxa" w:w="60"/>
+              <w:left w:type="dxa" w:w="100"/>
+              <w:bottom w:type="dxa" w:w="60"/>
+              <w:right w:type="dxa" w:w="100"/>
+            </w:tcMar>
+          </w:tcPr>
+          <w:p>
+            <w:pPr>
+              <w:spacing w:after="0" w:line="240"/>
+            </w:pPr>
+            <w:r>
+              <w:rPr>
+                <w:rFonts w:ascii="Calibri" w:cs="Calibri" w:eastAsia="Calibri" w:hAnsi="Calibri"/>
+                <w:b w:val="false"/>
+                <w:bCs w:val="false"/>
+                <w:color w:val="1A1A1A"/>
+                <w:sz w:val="18"/>
+                <w:szCs w:val="18"/>
+              </w:rPr>
+              <w:t>Longest segment that is batched; a longer one goes on its own</w:t>
+            </w:r>
+          </w:p>
+        </w:tc>
+      </w:tr>
+      <w:tr>
+        <w:tc>
+          <w:tcPr>
+            <w:tcW w:type="dxa" w:w="2600"/>
+            <w:tcMar>
+              <w:top w:type="dxa" w:w="60"/>
+              <w:left w:type="dxa" w:w="100"/>
+              <w:bottom w:type="dxa" w:w="60"/>
+              <w:right w:type="dxa" w:w="100"/>
+            </w:tcMar>
+          </w:tcPr>
+          <w:p>
+            <w:pPr>
+              <w:spacing w:after="0" w:line="240"/>
+            </w:pPr>
+            <w:r>
+              <w:rPr>
+                <w:rFonts w:ascii="Calibri" w:cs="Calibri" w:eastAsia="Calibri" w:hAnsi="Calibri"/>
+                <w:b w:val="false"/>
+                <w:bCs w:val="false"/>
+                <w:color w:val="1A1A1A"/>
+                <w:sz w:val="18"/>
+                <w:szCs w:val="18"/>
+              </w:rPr>
               <w:t>TR_PROMPT_VERSION</w:t>
             </w:r>
           </w:p>
@@ -17296,7 +17545,7 @@
           <w:color w:val="1A1A1A"/>
           <w:sz w:val="21"/>
         </w:rPr>
-        <w:t>Exercise a full open/close cycle with a project in the container. The container exists - LUKS2, 40 GB sparse, header backed up to ~/.case/header.bak - has been opened and closed repeatedly with a real project in it, and both guards have been seen to refuse. The bare mountpoint is immutable so a stray write cannot land there. What remains is a full translate-and-deliver pass, which Phase 1 provides.</w:t>
+        <w:t>Calibrate the vision gate on more than two pages. The vision model has earned its place: over eight pages of real scans it agreed with Tesseract on every number except on the one page where fourteen disagreed, and that page was also the one Tesseract itself was least sure of (S5.3). --gate now defaults to 3%, drawn from a 5%-doubtful page that needed the check and 0-2% pages that did not. More pages would firm that line up.</w:t>
       </w:r>
     </w:p>
     <w:p>
@@ -17315,7 +17564,7 @@
           <w:sz w:val="21"/>
           <w:szCs w:val="21"/>
         </w:rPr>
-        <w:t>Copy ~/.case/header.bak somewhere off this machine. A corrupted LUKS header means the data is unrecoverable even with the correct passphrase, because the header holds the encrypted master key.</w:t>
+        <w:t>Establish how often the model completes a statutory provision from memory (S8.1). Two of ten well-known provisions, both ECHR article 6, is enough to know the risk is real and not enough to know its shape.</w:t>
       </w:r>
     </w:p>
     <w:p>
@@ -17329,11 +17578,12 @@
       </w:pPr>
       <w:r>
         <w:rPr>
-          <w:rFonts w:ascii="Calibri" w:hAnsi="Calibri"/>
+          <w:rFonts w:ascii="Calibri" w:cs="Calibri" w:eastAsia="Calibri" w:hAnsi="Calibri"/>
           <w:color w:val="1A1A1A"/>
           <w:sz w:val="21"/>
-        </w:rPr>
-        <w:t>Calibrate the vision gate on more than two pages. The vision model has earned its place: over eight pages of real scans it agreed with Tesseract on every number except on the one page where fourteen disagreed, and that page was also the one Tesseract itself was least sure of (S5.3). --gate now defaults to 3%, drawn from a 5%-doubtful page that needed the check and 0-2% pages that did not. More pages would firm that line up.</w:t>
+          <w:szCs w:val="21"/>
+        </w:rPr>
+        <w:t>Measure reference reuse on a real matter: how many source sentences are reused, and how often pairs.tsv needs correcting (S4.4).</w:t>
       </w:r>
     </w:p>
     <w:p>
@@ -17352,7 +17602,7 @@
           <w:sz w:val="21"/>
           <w:szCs w:val="21"/>
         </w:rPr>
-        <w:t>Establish how often the model completes a statutory provision from memory (S8.1). Two of ten well-known provisions, both ECHR article 6, is enough to know the risk is real and not enough to know its shape.</w:t>
+        <w:t>Have a translator review English→German drafts. EuroLLM is measured for speed and ran without a failed request, but no German output has been reviewed yet (S12).</w:t>
       </w:r>
     </w:p>
     <w:p>
@@ -17371,45 +17621,7 @@
           <w:sz w:val="21"/>
           <w:szCs w:val="21"/>
         </w:rPr>
-        <w:t>Measure reference reuse on a real matter: how many source sentences are reused, and how often pairs.tsv needs correcting (S4.4).</w:t>
-      </w:r>
-    </w:p>
-    <w:p>
-      <w:pPr>
-        <w:pStyle w:val="ListParagraph"/>
-        <w:numPr>
-          <w:ilvl w:val="0"/>
-          <w:numId w:val="2"/>
-        </w:numPr>
-        <w:spacing w:after="70" w:line="264"/>
-      </w:pPr>
-      <w:r>
-        <w:rPr>
-          <w:rFonts w:ascii="Calibri" w:cs="Calibri" w:eastAsia="Calibri" w:hAnsi="Calibri"/>
-          <w:color w:val="1A1A1A"/>
-          <w:sz w:val="21"/>
-          <w:szCs w:val="21"/>
-        </w:rPr>
-        <w:t>Have a translator review English→German drafts. EuroLLM is measured for speed and ran without a failed request, but no German output has been reviewed yet (S12).</w:t>
-      </w:r>
-    </w:p>
-    <w:p>
-      <w:pPr>
-        <w:pStyle w:val="ListParagraph"/>
-        <w:numPr>
-          <w:ilvl w:val="0"/>
-          <w:numId w:val="2"/>
-        </w:numPr>
-        <w:spacing w:after="70" w:line="264"/>
-      </w:pPr>
-      <w:r>
-        <w:rPr>
-          <w:rFonts w:ascii="Calibri" w:cs="Calibri" w:eastAsia="Calibri" w:hAnsi="Calibri"/>
-          <w:color w:val="1A1A1A"/>
-          <w:sz w:val="21"/>
-          <w:szCs w:val="21"/>
-        </w:rPr>
-        <w:t>Run Phase 1 on a small subset of the real assignment. The translator's preference: real material, so no work is wasted. This is now the gating item - the professional questions are answered and recorded in S13.</w:t>
+        <w:t>Quantify how much machine assistance helps. Phase 1 ran and the translator's verdict was that it does help, which settled whether to proceed — but the ratio itself, and the per-class edit counts that say what to fix next, were never recorded. The quote still rests on source-word volume rather than a measured editing speedup.</w:t>
       </w:r>
     </w:p>
     <w:p>

</xml_diff>

<commit_message>
Manual and runbook: TR_SUFFIX=auto and tr-refimport
Section 2 says TR_SUFFIX=auto labels each deliverable with the language it
is drafted into, spelled as tr-ref reads it, so that a translation filed
beside its source cannot overwrite it and is half of a reference pair, and
that a suffix naming another language is refused. Section 4.4 says how
tr-refimport copies a past project's originals and translations, from two
folders, side by side into reference/ with labels, and what it does not
copy. The environment table's TR_SUFFIX row and the runbook are
regenerated from the kit, and the PDF is exported again.
</commit_message>
<xml_diff>
--- a/01-operating-manual.docx
+++ b/01-operating-manual.docx
@@ -2399,6 +2399,20 @@
     </w:p>
     <w:p>
       <w:pPr>
+        <w:spacing w:after="120" w:line="264"/>
+      </w:pPr>
+      <w:r>
+        <w:rPr>
+          <w:rFonts w:ascii="Calibri" w:cs="Calibri" w:eastAsia="Calibri" w:hAnsi="Calibri"/>
+          <w:color w:val="1A1A1A"/>
+          <w:sz w:val="21"/>
+          <w:szCs w:val="21"/>
+        </w:rPr>
+        <w:t xml:space="preserve">TR_SUFFIX=auto labels each deliverable with the language it is drafted into, spelled as tr-ref reads it: lease.docx delivers as lease_German.docx, or lease_German-CH.docx in a Swiss project. A translation filed beside its source then cannot overwrite it, and is already half of a reference pair. A suffix that names another language than TR_TGT is refused.</w:t>
+      </w:r>
+    </w:p>
+    <w:p>
+      <w:pPr>
         <w:pStyle w:val="Heading2"/>
         <w:spacing w:after="130" w:before="250"/>
       </w:pPr>
@@ -6203,6 +6217,20 @@
           <w:szCs w:val="21"/>
         </w:rPr>
         <w:t>They go anywhere in the project’s reference/ folder, both files of a pair in the same folder and named alike apart from a language suffix: lease-2023_English.docx beside lease-2023_German.pdf. The suffix names a language, not a role, so the same pair would serve German→English work too, once a German source is supported. Each side may be Word, PDF with a text layer, scanned PDF or plain text, whatever the other side is; a file without a suffix is listed and skipped rather than guessed. tr-ref lines each pair up sentence by sentence without a model — by length, with the numbers both sides share as anchors — and keeps only one-to-one pairs whose numbers agree. Numbers also confirm the alignment: a pair is reused only when it carries numbers its neighbours do not, or sits between two pairs that do. A sentence nothing confirms is offered instead, as REF_OPTIONS [[…]] (unconfirmed), because where a translation omits, adds or swaps a sentence, the pairs around the change still look aligned. tr-run then gives an identical source sentence the translator’s rendering instead of a draft, and tr-terms --reference proposes the glossary from those renderings.</w:t>
+      </w:r>
+    </w:p>
+    <w:p>
+      <w:pPr>
+        <w:spacing w:after="120" w:line="264"/>
+      </w:pPr>
+      <w:r>
+        <w:rPr>
+          <w:rFonts w:ascii="Calibri" w:cs="Calibri" w:eastAsia="Calibri" w:hAnsi="Calibri"/>
+          <w:color w:val="1A1A1A"/>
+          <w:sz w:val="21"/>
+          <w:szCs w:val="21"/>
+        </w:rPr>
+        <w:t>A past project's originals and translations, kept in two folders — &lt;client&gt;/in/356 and &lt;client&gt;/out/356, say, each translation labelled before its extension — need not be copied by hand. tr-refimport &lt;originals&gt; &lt;translations&gt; --from en --to de reads both folders with their subfolders and lists what it would copy side by side into reference/, under the originals' folder name — the originals labelled _English before every extension, so lease.pdf.docx becomes lease_English.pdf.docx — and copies them when given --apply. A translation with no label, a label naming another language, a name two files would share and a file already there are listed and not copied, and the archive is left as it was. Copy only reviewed translations: tr-ref reuses their sentences word for word, and tr-lint never checks them.</w:t>
       </w:r>
     </w:p>
     <w:p>
@@ -13164,7 +13192,7 @@
                 <w:sz w:val="18"/>
                 <w:szCs w:val="18"/>
               </w:rPr>
-              <w:t>Per-project, in project.conf. Set if the client requires it</w:t>
+              <w:t>Per-project, in project.conf. Added to each deliverable's name before its extension. auto: the target language's label, such as _German or _German-CH, which tr-ref reads, so a translation is also half of a reference pair. A label naming another language than TR_TGT is refused</w:t>
             </w:r>
           </w:p>
         </w:tc>

</xml_diff>

<commit_message>
Runbook checklist; manual on switching projects, delivery and TR_SUFFIX=auto
The runbook is regenerated from the kit's new Part 1: a table of the steps,
then each step's commands, what to check, and notes on why, with resuming a
project, configuring it with TR_SUFFIX=auto, adding references as
sub-steps, and delivering into the archive's in/ and out/. The manual's
daily-operation commands add switching to another project and the two
delivery copies, and its English->German project.conf example adds
TR_SUFFIX=auto, to be decided before the first run. PDF exported again.
</commit_message>
<xml_diff>
--- a/01-operating-manual.docx
+++ b/01-operating-manual.docx
@@ -8538,7 +8538,7 @@
           <w:color w:val="A8432A"/>
           <w:sz w:val="17"/>
         </w:rPr>
-        <w:t>tr-inventory</w:t>
+        <w:t>tr-project</w:t>
       </w:r>
       <w:r>
         <w:rPr>
@@ -8546,15 +8546,32 @@
           <w:color w:val="35322E"/>
           <w:sz w:val="17"/>
         </w:rPr>
-        <w:t xml:space="preserve">               </w:t>
+        <w:t xml:space="preserve"> </w:t>
       </w:r>
       <w:r>
         <w:rPr>
           <w:rFonts w:ascii="Consolas" w:hAnsi="Consolas"/>
+          <w:color w:val="35322E"/>
+          <w:sz w:val="17"/>
+        </w:rPr>
+        <w:t>kranj-2024</w:t>
+      </w:r>
+      <w:r>
+        <w:rPr>
+          <w:rFonts w:ascii="Consolas" w:hAnsi="Consolas"/>
+          <w:color w:val="35322E"/>
+          <w:sz w:val="17"/>
+        </w:rPr>
+        <w:t xml:space="preserve">      </w:t>
+      </w:r>
+      <w:r>
+        <w:rPr>
+          <w:rFonts w:ascii="Consolas" w:hAnsi="Consolas"/>
+          <w:i/>
           <w:color w:val="8C8578"/>
           <w:sz w:val="17"/>
         </w:rPr>
-        <w:t># classify the drop; after new files arrive</w:t>
+        <w:t># switch to another project</w:t>
       </w:r>
     </w:p>
     <w:p>
@@ -8568,12 +8585,28 @@
       </w:pPr>
       <w:r>
         <w:rPr>
-          <w:rFonts w:ascii="Consolas" w:cs="Consolas" w:eastAsia="Consolas" w:hAnsi="Consolas"/>
-          <w:color w:val="35322E"/>
-          <w:sz w:val="17"/>
-          <w:szCs w:val="17"/>
-        </w:rPr>
-        <w:t xml:space="preserve"> </w:t>
+          <w:rFonts w:ascii="Consolas" w:hAnsi="Consolas"/>
+          <w:b/>
+          <w:color w:val="A8432A"/>
+          <w:sz w:val="17"/>
+        </w:rPr>
+        <w:t>tr-inventory</w:t>
+      </w:r>
+      <w:r>
+        <w:rPr>
+          <w:rFonts w:ascii="Consolas" w:hAnsi="Consolas"/>
+          <w:color w:val="35322E"/>
+          <w:sz w:val="17"/>
+        </w:rPr>
+        <w:t xml:space="preserve">               </w:t>
+      </w:r>
+      <w:r>
+        <w:rPr>
+          <w:rFonts w:ascii="Consolas" w:hAnsi="Consolas"/>
+          <w:color w:val="8C8578"/>
+          <w:sz w:val="17"/>
+        </w:rPr>
+        <w:t># classify the drop; after new files arrive</w:t>
       </w:r>
     </w:p>
     <w:p>
@@ -8588,33 +8621,11 @@
       <w:r>
         <w:rPr>
           <w:rFonts w:ascii="Consolas" w:cs="Consolas" w:eastAsia="Consolas" w:hAnsi="Consolas"/>
-          <w:b/>
-          <w:bCs/>
-          <w:color w:val="A8432A"/>
-          <w:sz w:val="17"/>
-          <w:szCs w:val="17"/>
-        </w:rPr>
-        <w:t xml:space="preserve">tr-status</w:t>
-      </w:r>
-      <w:r>
-        <w:rPr>
-          <w:rFonts w:ascii="Consolas" w:cs="Consolas" w:eastAsia="Consolas" w:hAnsi="Consolas"/>
-          <w:color w:val="35322E"/>
-          <w:sz w:val="17"/>
-          <w:szCs w:val="17"/>
-        </w:rPr>
-        <w:t xml:space="preserve">                  </w:t>
-      </w:r>
-      <w:r>
-        <w:rPr>
-          <w:rFonts w:ascii="Consolas" w:cs="Consolas" w:eastAsia="Consolas" w:hAnsi="Consolas"/>
-          <w:i/>
-          <w:iCs/>
-          <w:color w:val="8C8578"/>
-          <w:sz w:val="17"/>
-          <w:szCs w:val="17"/>
-        </w:rPr>
-        <w:t xml:space="preserve"># what remains</w:t>
+          <w:color w:val="35322E"/>
+          <w:sz w:val="17"/>
+          <w:szCs w:val="17"/>
+        </w:rPr>
+        <w:t xml:space="preserve"> </w:t>
       </w:r>
     </w:p>
     <w:p>
@@ -8644,25 +8655,7 @@
           <w:sz w:val="17"/>
           <w:szCs w:val="17"/>
         </w:rPr>
-        <w:t xml:space="preserve"> </w:t>
-      </w:r>
-      <w:r>
-        <w:rPr>
-          <w:rFonts w:ascii="Consolas" w:cs="Consolas" w:eastAsia="Consolas" w:hAnsi="Consolas"/>
-          <w:color w:val="1F6E8C"/>
-          <w:sz w:val="17"/>
-          <w:szCs w:val="17"/>
-        </w:rPr>
-        <w:t xml:space="preserve">--missing</w:t>
-      </w:r>
-      <w:r>
-        <w:rPr>
-          <w:rFonts w:ascii="Consolas" w:cs="Consolas" w:eastAsia="Consolas" w:hAnsi="Consolas"/>
-          <w:color w:val="35322E"/>
-          <w:sz w:val="17"/>
-          <w:szCs w:val="17"/>
-        </w:rPr>
-        <w:t xml:space="preserve">        </w:t>
+        <w:t xml:space="preserve">                  </w:t>
       </w:r>
       <w:r>
         <w:rPr>
@@ -8673,7 +8666,7 @@
           <w:sz w:val="17"/>
           <w:szCs w:val="17"/>
         </w:rPr>
-        <w:t xml:space="preserve"># bare paths, for piping</w:t>
+        <w:t xml:space="preserve"># what remains</w:t>
       </w:r>
     </w:p>
     <w:p>
@@ -8712,16 +8705,16 @@
           <w:sz w:val="17"/>
           <w:szCs w:val="17"/>
         </w:rPr>
-        <w:t xml:space="preserve">-v</w:t>
-      </w:r>
-      <w:r>
-        <w:rPr>
-          <w:rFonts w:ascii="Consolas" w:cs="Consolas" w:eastAsia="Consolas" w:hAnsi="Consolas"/>
-          <w:color w:val="35322E"/>
-          <w:sz w:val="17"/>
-          <w:szCs w:val="17"/>
-        </w:rPr>
-        <w:t xml:space="preserve">               </w:t>
+        <w:t xml:space="preserve">--missing</w:t>
+      </w:r>
+      <w:r>
+        <w:rPr>
+          <w:rFonts w:ascii="Consolas" w:cs="Consolas" w:eastAsia="Consolas" w:hAnsi="Consolas"/>
+          <w:color w:val="35322E"/>
+          <w:sz w:val="17"/>
+          <w:szCs w:val="17"/>
+        </w:rPr>
+        <w:t xml:space="preserve">        </w:t>
       </w:r>
       <w:r>
         <w:rPr>
@@ -8732,7 +8725,7 @@
           <w:sz w:val="17"/>
           <w:szCs w:val="17"/>
         </w:rPr>
-        <w:t xml:space="preserve"># include the completed list</w:t>
+        <w:t xml:space="preserve"># bare paths, for piping</w:t>
       </w:r>
     </w:p>
     <w:p>
@@ -8747,11 +8740,51 @@
       <w:r>
         <w:rPr>
           <w:rFonts w:ascii="Consolas" w:cs="Consolas" w:eastAsia="Consolas" w:hAnsi="Consolas"/>
-          <w:color w:val="35322E"/>
-          <w:sz w:val="17"/>
-          <w:szCs w:val="17"/>
-        </w:rPr>
-        <w:t xml:space="preserve"> </w:t>
+          <w:b/>
+          <w:bCs/>
+          <w:color w:val="A8432A"/>
+          <w:sz w:val="17"/>
+          <w:szCs w:val="17"/>
+        </w:rPr>
+        <w:t xml:space="preserve">tr-status</w:t>
+      </w:r>
+      <w:r>
+        <w:rPr>
+          <w:rFonts w:ascii="Consolas" w:cs="Consolas" w:eastAsia="Consolas" w:hAnsi="Consolas"/>
+          <w:color w:val="35322E"/>
+          <w:sz w:val="17"/>
+          <w:szCs w:val="17"/>
+        </w:rPr>
+        <w:t xml:space="preserve"> </w:t>
+      </w:r>
+      <w:r>
+        <w:rPr>
+          <w:rFonts w:ascii="Consolas" w:cs="Consolas" w:eastAsia="Consolas" w:hAnsi="Consolas"/>
+          <w:color w:val="1F6E8C"/>
+          <w:sz w:val="17"/>
+          <w:szCs w:val="17"/>
+        </w:rPr>
+        <w:t xml:space="preserve">-v</w:t>
+      </w:r>
+      <w:r>
+        <w:rPr>
+          <w:rFonts w:ascii="Consolas" w:cs="Consolas" w:eastAsia="Consolas" w:hAnsi="Consolas"/>
+          <w:color w:val="35322E"/>
+          <w:sz w:val="17"/>
+          <w:szCs w:val="17"/>
+        </w:rPr>
+        <w:t xml:space="preserve">               </w:t>
+      </w:r>
+      <w:r>
+        <w:rPr>
+          <w:rFonts w:ascii="Consolas" w:cs="Consolas" w:eastAsia="Consolas" w:hAnsi="Consolas"/>
+          <w:i/>
+          <w:iCs/>
+          <w:color w:val="8C8578"/>
+          <w:sz w:val="17"/>
+          <w:szCs w:val="17"/>
+        </w:rPr>
+        <w:t xml:space="preserve"># include the completed list</w:t>
       </w:r>
     </w:p>
     <w:p>
@@ -8766,51 +8799,11 @@
       <w:r>
         <w:rPr>
           <w:rFonts w:ascii="Consolas" w:cs="Consolas" w:eastAsia="Consolas" w:hAnsi="Consolas"/>
-          <w:b/>
-          <w:bCs/>
-          <w:color w:val="A8432A"/>
-          <w:sz w:val="17"/>
-          <w:szCs w:val="17"/>
-        </w:rPr>
-        <w:t xml:space="preserve">tr-run</w:t>
-      </w:r>
-      <w:r>
-        <w:rPr>
-          <w:rFonts w:ascii="Consolas" w:cs="Consolas" w:eastAsia="Consolas" w:hAnsi="Consolas"/>
-          <w:color w:val="35322E"/>
-          <w:sz w:val="17"/>
-          <w:szCs w:val="17"/>
-        </w:rPr>
-        <w:t xml:space="preserve"> </w:t>
-      </w:r>
-      <w:r>
-        <w:rPr>
-          <w:rFonts w:ascii="Consolas" w:cs="Consolas" w:eastAsia="Consolas" w:hAnsi="Consolas"/>
-          <w:color w:val="1F6E8C"/>
-          <w:sz w:val="17"/>
-          <w:szCs w:val="17"/>
-        </w:rPr>
-        <w:t xml:space="preserve">-n</w:t>
-      </w:r>
-      <w:r>
-        <w:rPr>
-          <w:rFonts w:ascii="Consolas" w:cs="Consolas" w:eastAsia="Consolas" w:hAnsi="Consolas"/>
-          <w:color w:val="35322E"/>
-          <w:sz w:val="17"/>
-          <w:szCs w:val="17"/>
-        </w:rPr>
-        <w:t xml:space="preserve">                  </w:t>
-      </w:r>
-      <w:r>
-        <w:rPr>
-          <w:rFonts w:ascii="Consolas" w:cs="Consolas" w:eastAsia="Consolas" w:hAnsi="Consolas"/>
-          <w:i/>
-          <w:iCs/>
-          <w:color w:val="8C8578"/>
-          <w:sz w:val="17"/>
-          <w:szCs w:val="17"/>
-        </w:rPr>
-        <w:t xml:space="preserve"># dry run: what would be processed</w:t>
+          <w:color w:val="35322E"/>
+          <w:sz w:val="17"/>
+          <w:szCs w:val="17"/>
+        </w:rPr>
+        <w:t xml:space="preserve"> </w:t>
       </w:r>
     </w:p>
     <w:p>
@@ -8840,7 +8833,25 @@
           <w:sz w:val="17"/>
           <w:szCs w:val="17"/>
         </w:rPr>
-        <w:t xml:space="preserve">                     </w:t>
+        <w:t xml:space="preserve"> </w:t>
+      </w:r>
+      <w:r>
+        <w:rPr>
+          <w:rFonts w:ascii="Consolas" w:cs="Consolas" w:eastAsia="Consolas" w:hAnsi="Consolas"/>
+          <w:color w:val="1F6E8C"/>
+          <w:sz w:val="17"/>
+          <w:szCs w:val="17"/>
+        </w:rPr>
+        <w:t xml:space="preserve">-n</w:t>
+      </w:r>
+      <w:r>
+        <w:rPr>
+          <w:rFonts w:ascii="Consolas" w:cs="Consolas" w:eastAsia="Consolas" w:hAnsi="Consolas"/>
+          <w:color w:val="35322E"/>
+          <w:sz w:val="17"/>
+          <w:szCs w:val="17"/>
+        </w:rPr>
+        <w:t xml:space="preserve">                  </w:t>
       </w:r>
       <w:r>
         <w:rPr>
@@ -8851,7 +8862,7 @@
           <w:sz w:val="17"/>
           <w:szCs w:val="17"/>
         </w:rPr>
-        <w:t xml:space="preserve"># everything missing</w:t>
+        <w:t xml:space="preserve"># dry run: what would be processed</w:t>
       </w:r>
     </w:p>
     <w:p>
@@ -8881,25 +8892,7 @@
           <w:sz w:val="17"/>
           <w:szCs w:val="17"/>
         </w:rPr>
-        <w:t xml:space="preserve"> </w:t>
-      </w:r>
-      <w:r>
-        <w:rPr>
-          <w:rFonts w:ascii="Consolas" w:cs="Consolas" w:eastAsia="Consolas" w:hAnsi="Consolas"/>
-          <w:color w:val="35322E"/>
-          <w:sz w:val="17"/>
-          <w:szCs w:val="17"/>
-        </w:rPr>
-        <w:t xml:space="preserve">source/one.docx</w:t>
-      </w:r>
-      <w:r>
-        <w:rPr>
-          <w:rFonts w:ascii="Consolas" w:cs="Consolas" w:eastAsia="Consolas" w:hAnsi="Consolas"/>
-          <w:color w:val="35322E"/>
-          <w:sz w:val="17"/>
-          <w:szCs w:val="17"/>
-        </w:rPr>
-        <w:t xml:space="preserve">     </w:t>
+        <w:t xml:space="preserve">                     </w:t>
       </w:r>
       <w:r>
         <w:rPr>
@@ -8910,7 +8903,7 @@
           <w:sz w:val="17"/>
           <w:szCs w:val="17"/>
         </w:rPr>
-        <w:t xml:space="preserve"># a single file</w:t>
+        <w:t xml:space="preserve"># everything missing</w:t>
       </w:r>
     </w:p>
     <w:p>
@@ -8925,11 +8918,51 @@
       <w:r>
         <w:rPr>
           <w:rFonts w:ascii="Consolas" w:cs="Consolas" w:eastAsia="Consolas" w:hAnsi="Consolas"/>
-          <w:color w:val="35322E"/>
-          <w:sz w:val="17"/>
-          <w:szCs w:val="17"/>
-        </w:rPr>
-        <w:t xml:space="preserve"> </w:t>
+          <w:b/>
+          <w:bCs/>
+          <w:color w:val="A8432A"/>
+          <w:sz w:val="17"/>
+          <w:szCs w:val="17"/>
+        </w:rPr>
+        <w:t xml:space="preserve">tr-run</w:t>
+      </w:r>
+      <w:r>
+        <w:rPr>
+          <w:rFonts w:ascii="Consolas" w:cs="Consolas" w:eastAsia="Consolas" w:hAnsi="Consolas"/>
+          <w:color w:val="35322E"/>
+          <w:sz w:val="17"/>
+          <w:szCs w:val="17"/>
+        </w:rPr>
+        <w:t xml:space="preserve"> </w:t>
+      </w:r>
+      <w:r>
+        <w:rPr>
+          <w:rFonts w:ascii="Consolas" w:cs="Consolas" w:eastAsia="Consolas" w:hAnsi="Consolas"/>
+          <w:color w:val="35322E"/>
+          <w:sz w:val="17"/>
+          <w:szCs w:val="17"/>
+        </w:rPr>
+        <w:t xml:space="preserve">source/one.docx</w:t>
+      </w:r>
+      <w:r>
+        <w:rPr>
+          <w:rFonts w:ascii="Consolas" w:cs="Consolas" w:eastAsia="Consolas" w:hAnsi="Consolas"/>
+          <w:color w:val="35322E"/>
+          <w:sz w:val="17"/>
+          <w:szCs w:val="17"/>
+        </w:rPr>
+        <w:t xml:space="preserve">     </w:t>
+      </w:r>
+      <w:r>
+        <w:rPr>
+          <w:rFonts w:ascii="Consolas" w:cs="Consolas" w:eastAsia="Consolas" w:hAnsi="Consolas"/>
+          <w:i/>
+          <w:iCs/>
+          <w:color w:val="8C8578"/>
+          <w:sz w:val="17"/>
+          <w:szCs w:val="17"/>
+        </w:rPr>
+        <w:t xml:space="preserve"># a single file</w:t>
       </w:r>
     </w:p>
     <w:p>
@@ -8944,6 +8977,25 @@
       <w:r>
         <w:rPr>
           <w:rFonts w:ascii="Consolas" w:cs="Consolas" w:eastAsia="Consolas" w:hAnsi="Consolas"/>
+          <w:color w:val="35322E"/>
+          <w:sz w:val="17"/>
+          <w:szCs w:val="17"/>
+        </w:rPr>
+        <w:t xml:space="preserve"> </w:t>
+      </w:r>
+    </w:p>
+    <w:p>
+      <w:pPr>
+        <w:pBdr>
+          <w:left w:val="single" w:color="C15E3C" w:sz="12" w:space="8"/>
+        </w:pBdr>
+        <w:shd w:fill="F7F2E9" w:val="clear"/>
+        <w:spacing w:after="0" w:before="0" w:line="240"/>
+        <w:ind w:left="259"/>
+      </w:pPr>
+      <w:r>
+        <w:rPr>
+          <w:rFonts w:ascii="Consolas" w:cs="Consolas" w:eastAsia="Consolas" w:hAnsi="Consolas"/>
           <w:b/>
           <w:bCs/>
           <w:color w:val="A8432A"/>
@@ -8971,6 +9023,241 @@
           <w:szCs w:val="17"/>
         </w:rPr>
         <w:t xml:space="preserve"># after any run</w:t>
+      </w:r>
+    </w:p>
+    <w:p>
+      <w:pPr>
+        <w:pBdr>
+          <w:left w:val="single" w:color="C15E3C" w:sz="12" w:space="8"/>
+        </w:pBdr>
+        <w:shd w:fill="F7F2E9" w:val="clear"/>
+        <w:spacing w:after="0" w:before="0" w:line="240"/>
+        <w:ind w:left="259"/>
+      </w:pPr>
+      <w:r>
+        <w:rPr>
+          <w:rFonts w:ascii="Consolas" w:cs="Consolas" w:eastAsia="Consolas" w:hAnsi="Consolas"/>
+          <w:color w:val="35322E"/>
+          <w:sz w:val="17"/>
+          <w:szCs w:val="17"/>
+        </w:rPr>
+        <w:t xml:space="preserve"> </w:t>
+      </w:r>
+    </w:p>
+    <w:p>
+      <w:pPr>
+        <w:pBdr>
+          <w:left w:val="single" w:color="C15E3C" w:sz="12" w:space="8"/>
+        </w:pBdr>
+        <w:shd w:fill="F7F2E9" w:val="clear"/>
+        <w:spacing w:after="0" w:before="0" w:line="240"/>
+        <w:ind w:left="259"/>
+      </w:pPr>
+      <w:r>
+        <w:rPr>
+          <w:rFonts w:ascii="Consolas" w:hAnsi="Consolas"/>
+          <w:b/>
+          <w:color w:val="A8432A"/>
+          <w:sz w:val="17"/>
+        </w:rPr>
+        <w:t>cp</w:t>
+      </w:r>
+      <w:r>
+        <w:rPr>
+          <w:rFonts w:ascii="Consolas" w:hAnsi="Consolas"/>
+          <w:color w:val="35322E"/>
+          <w:sz w:val="17"/>
+        </w:rPr>
+        <w:t xml:space="preserve"> </w:t>
+      </w:r>
+      <w:r>
+        <w:rPr>
+          <w:rFonts w:ascii="Consolas" w:hAnsi="Consolas"/>
+          <w:color w:val="1F6E8C"/>
+          <w:sz w:val="17"/>
+        </w:rPr>
+        <w:t>-av</w:t>
+      </w:r>
+      <w:r>
+        <w:rPr>
+          <w:rFonts w:ascii="Consolas" w:hAnsi="Consolas"/>
+          <w:color w:val="35322E"/>
+          <w:sz w:val="17"/>
+        </w:rPr>
+        <w:t xml:space="preserve"> </w:t>
+      </w:r>
+      <w:r>
+        <w:rPr>
+          <w:rFonts w:ascii="Consolas" w:hAnsi="Consolas"/>
+          <w:color w:val="1F6E8C"/>
+          <w:sz w:val="17"/>
+        </w:rPr>
+        <w:t>--update</w:t>
+      </w:r>
+      <w:r>
+        <w:rPr>
+          <w:rFonts w:ascii="Consolas" w:hAnsi="Consolas"/>
+          <w:color w:val="35322E"/>
+          <w:sz w:val="17"/>
+        </w:rPr>
+        <w:t>=none</w:t>
+      </w:r>
+      <w:r>
+        <w:rPr>
+          <w:rFonts w:ascii="Consolas" w:hAnsi="Consolas"/>
+          <w:color w:val="35322E"/>
+          <w:sz w:val="17"/>
+        </w:rPr>
+        <w:t xml:space="preserve"> </w:t>
+      </w:r>
+      <w:r>
+        <w:rPr>
+          <w:rFonts w:ascii="Consolas" w:hAnsi="Consolas"/>
+          <w:color w:val="35322E"/>
+          <w:sz w:val="17"/>
+        </w:rPr>
+        <w:t>source/.</w:t>
+      </w:r>
+      <w:r>
+        <w:rPr>
+          <w:rFonts w:ascii="Consolas" w:hAnsi="Consolas"/>
+          <w:color w:val="35322E"/>
+          <w:sz w:val="17"/>
+        </w:rPr>
+        <w:t xml:space="preserve"> </w:t>
+      </w:r>
+      <w:r>
+        <w:rPr>
+          <w:rFonts w:ascii="Consolas" w:hAnsi="Consolas"/>
+          <w:color w:val="35322E"/>
+          <w:sz w:val="17"/>
+        </w:rPr>
+        <w:t>&lt;client&gt;/in/356/</w:t>
+      </w:r>
+      <w:r>
+        <w:rPr>
+          <w:rFonts w:ascii="Consolas" w:hAnsi="Consolas"/>
+          <w:color w:val="35322E"/>
+          <w:sz w:val="17"/>
+        </w:rPr>
+        <w:t xml:space="preserve">        </w:t>
+      </w:r>
+      <w:r>
+        <w:rPr>
+          <w:rFonts w:ascii="Consolas" w:hAnsi="Consolas"/>
+          <w:i/>
+          <w:color w:val="8C8578"/>
+          <w:sz w:val="17"/>
+        </w:rPr>
+        <w:t># deliver the originals to the archive</w:t>
+      </w:r>
+    </w:p>
+    <w:p>
+      <w:pPr>
+        <w:pBdr>
+          <w:left w:val="single" w:color="C15E3C" w:sz="12" w:space="8"/>
+        </w:pBdr>
+        <w:shd w:fill="F7F2E9" w:val="clear"/>
+        <w:spacing w:after="0" w:before="0" w:line="240"/>
+        <w:ind w:left="259"/>
+      </w:pPr>
+      <w:r>
+        <w:rPr>
+          <w:rFonts w:ascii="Consolas" w:hAnsi="Consolas"/>
+          <w:b/>
+          <w:color w:val="A8432A"/>
+          <w:sz w:val="17"/>
+        </w:rPr>
+        <w:t>cp</w:t>
+      </w:r>
+      <w:r>
+        <w:rPr>
+          <w:rFonts w:ascii="Consolas" w:hAnsi="Consolas"/>
+          <w:color w:val="35322E"/>
+          <w:sz w:val="17"/>
+        </w:rPr>
+        <w:t xml:space="preserve"> </w:t>
+      </w:r>
+      <w:r>
+        <w:rPr>
+          <w:rFonts w:ascii="Consolas" w:hAnsi="Consolas"/>
+          <w:color w:val="1F6E8C"/>
+          <w:sz w:val="17"/>
+        </w:rPr>
+        <w:t>-av</w:t>
+      </w:r>
+      <w:r>
+        <w:rPr>
+          <w:rFonts w:ascii="Consolas" w:hAnsi="Consolas"/>
+          <w:color w:val="35322E"/>
+          <w:sz w:val="17"/>
+        </w:rPr>
+        <w:t xml:space="preserve"> </w:t>
+      </w:r>
+      <w:r>
+        <w:rPr>
+          <w:rFonts w:ascii="Consolas" w:hAnsi="Consolas"/>
+          <w:color w:val="1F6E8C"/>
+          <w:sz w:val="17"/>
+        </w:rPr>
+        <w:t>--update</w:t>
+      </w:r>
+      <w:r>
+        <w:rPr>
+          <w:rFonts w:ascii="Consolas" w:hAnsi="Consolas"/>
+          <w:color w:val="35322E"/>
+          <w:sz w:val="17"/>
+        </w:rPr>
+        <w:t>=none</w:t>
+      </w:r>
+      <w:r>
+        <w:rPr>
+          <w:rFonts w:ascii="Consolas" w:hAnsi="Consolas"/>
+          <w:color w:val="35322E"/>
+          <w:sz w:val="17"/>
+        </w:rPr>
+        <w:t xml:space="preserve"> </w:t>
+      </w:r>
+      <w:r>
+        <w:rPr>
+          <w:rFonts w:ascii="Consolas" w:hAnsi="Consolas"/>
+          <w:color w:val="35322E"/>
+          <w:sz w:val="17"/>
+        </w:rPr>
+        <w:t>translated/.</w:t>
+      </w:r>
+      <w:r>
+        <w:rPr>
+          <w:rFonts w:ascii="Consolas" w:hAnsi="Consolas"/>
+          <w:color w:val="35322E"/>
+          <w:sz w:val="17"/>
+        </w:rPr>
+        <w:t xml:space="preserve"> </w:t>
+      </w:r>
+      <w:r>
+        <w:rPr>
+          <w:rFonts w:ascii="Consolas" w:hAnsi="Consolas"/>
+          <w:color w:val="35322E"/>
+          <w:sz w:val="17"/>
+        </w:rPr>
+        <w:t>&lt;client&gt;/out/356/</w:t>
+      </w:r>
+      <w:r>
+        <w:rPr>
+          <w:rFonts w:ascii="Consolas" w:hAnsi="Consolas"/>
+          <w:color w:val="35322E"/>
+          <w:sz w:val="17"/>
+        </w:rPr>
+        <w:t xml:space="preserve">   </w:t>
+      </w:r>
+      <w:r>
+        <w:rPr>
+          <w:rFonts w:ascii="Consolas" w:hAnsi="Consolas"/>
+          <w:i/>
+          <w:color w:val="8C8578"/>
+          <w:sz w:val="17"/>
+        </w:rPr>
+        <w:t># and the translations, overwriting nothing</w:t>
       </w:r>
     </w:p>
     <w:p>
@@ -14982,6 +15269,43 @@
     <w:p>
       <w:pPr>
         <w:pBdr>
+          <w:left w:val="single" w:color="C15E3C" w:sz="12" w:space="8"/>
+        </w:pBdr>
+        <w:shd w:fill="F7F2E9" w:val="clear"/>
+        <w:spacing w:after="0" w:before="0" w:line="240"/>
+        <w:ind w:left="259"/>
+      </w:pPr>
+      <w:r>
+        <w:rPr>
+          <w:rFonts w:ascii="Consolas" w:cs="Consolas" w:eastAsia="Consolas" w:hAnsi="Consolas"/>
+          <w:color w:val="35322E"/>
+          <w:sz w:val="17"/>
+          <w:szCs w:val="17"/>
+        </w:rPr>
+        <w:t xml:space="preserve">  </w:t>
+      </w:r>
+      <w:r>
+        <w:rPr>
+          <w:rFonts w:ascii="Consolas" w:cs="Consolas" w:eastAsia="Consolas" w:hAnsi="Consolas"/>
+          <w:color w:val="8A4B9E"/>
+          <w:sz w:val="17"/>
+          <w:szCs w:val="17"/>
+        </w:rPr>
+        <w:t xml:space="preserve">TR_OCR_LANGS=</w:t>
+      </w:r>
+      <w:r>
+        <w:rPr>
+          <w:rFonts w:ascii="Consolas" w:cs="Consolas" w:eastAsia="Consolas" w:hAnsi="Consolas"/>
+          <w:color w:val="35322E"/>
+          <w:sz w:val="17"/>
+          <w:szCs w:val="17"/>
+        </w:rPr>
+        <w:t>eng</w:t>
+      </w:r>
+    </w:p>
+    <w:p>
+      <w:pPr>
+        <w:pBdr>
           <w:bottom w:val="single" w:color="E2D8C8" w:sz="2" w:space="3"/>
           <w:left w:val="single" w:color="C15E3C" w:sz="12" w:space="8"/>
         </w:pBdr>
@@ -14991,30 +15315,27 @@
       </w:pPr>
       <w:r>
         <w:rPr>
-          <w:rFonts w:ascii="Consolas" w:cs="Consolas" w:eastAsia="Consolas" w:hAnsi="Consolas"/>
-          <w:color w:val="35322E"/>
-          <w:sz w:val="17"/>
-          <w:szCs w:val="17"/>
+          <w:rFonts w:ascii="Consolas" w:hAnsi="Consolas"/>
+          <w:color w:val="35322E"/>
+          <w:sz w:val="17"/>
         </w:rPr>
         <w:t xml:space="preserve">  </w:t>
       </w:r>
       <w:r>
         <w:rPr>
-          <w:rFonts w:ascii="Consolas" w:cs="Consolas" w:eastAsia="Consolas" w:hAnsi="Consolas"/>
+          <w:rFonts w:ascii="Consolas" w:hAnsi="Consolas"/>
           <w:color w:val="8A4B9E"/>
           <w:sz w:val="17"/>
-          <w:szCs w:val="17"/>
-        </w:rPr>
-        <w:t xml:space="preserve">TR_OCR_LANGS=</w:t>
-      </w:r>
-      <w:r>
-        <w:rPr>
-          <w:rFonts w:ascii="Consolas" w:cs="Consolas" w:eastAsia="Consolas" w:hAnsi="Consolas"/>
-          <w:color w:val="35322E"/>
-          <w:sz w:val="17"/>
-          <w:szCs w:val="17"/>
-        </w:rPr>
-        <w:t>eng</w:t>
+        </w:rPr>
+        <w:t>TR_SUFFIX=</w:t>
+      </w:r>
+      <w:r>
+        <w:rPr>
+          <w:rFonts w:ascii="Consolas" w:hAnsi="Consolas"/>
+          <w:color w:val="35322E"/>
+          <w:sz w:val="17"/>
+        </w:rPr>
+        <w:t>auto</w:t>
       </w:r>
     </w:p>
     <w:p>
@@ -15028,7 +15349,7 @@
           <w:sz w:val="21"/>
           <w:szCs w:val="21"/>
         </w:rPr>
-        <w:t>Nothing else is set: the model follows the pair. GaMS3 translates Slovene↔English; EuroLLM-9B-Instruct-2512 (Q8_0) translates English↔German, because German is absent from every stage of GaMS3's training. tr-run names the model in its banner and refuses to start when it is not installed. Slovene↔German has no model chosen and refuses to translate.</w:t>
+        <w:t>TR_SUFFIX=auto is optional: each translation takes its language's label, lease_German.docx. Decide it before the first tr-run, because changing it later renames every deliverable and leaves the old files in translated/, listed as orphaned. Nothing else needs setting: the model follows the pair. GaMS3 translates Slovene↔English; EuroLLM-9B-Instruct-2512 (Q8_0) translates English↔German, because German is absent from every stage of GaMS3's training. tr-run names the model in its banner and refuses to start when it is not installed. Slovene↔German has no model chosen and refuses to translate.</w:t>
       </w:r>
     </w:p>
     <w:p>

</xml_diff>

<commit_message>
Runbook: the OCR language combinations, and the environment table's note
Regenerated from the kit. Step 2 gains the TR_OCR_LANGS table for Slovene,
English and German with the rules behind it, and section 12's environment
table says what the order of the languages means and why the sampling pass
is wider. The .docx table is regenerated with it.
</commit_message>
<xml_diff>
--- a/01-operating-manual.docx
+++ b/01-operating-manual.docx
@@ -13977,7 +13977,7 @@
                 <w:sz w:val="18"/>
                 <w:szCs w:val="18"/>
               </w:rPr>
-              <w:t>Tesseract languages of the source documents: eng for an English drop, deu for German</w:t>
+              <w:t>Tesseract languages of the pages, the bulk of the text first: eng+slv for an English drop in a Slovene matter, deu for the German in one. Step 2 of the runbook gives the combinations</w:t>
             </w:r>
           </w:p>
         </w:tc>
@@ -14226,7 +14226,7 @@
                 <w:sz w:val="18"/>
                 <w:szCs w:val="18"/>
               </w:rPr>
-              <w:t>Tesseract languages for the detection sampling pass on scanned PDFs</w:t>
+              <w:t>Tesseract languages for the detection sampling pass on scanned PDFs; wider than TR_OCR_LANGS on purpose, since it is deciding which language a file is in</w:t>
             </w:r>
           </w:p>
         </w:tc>

</xml_diff>